<commit_message>
Simplify overview section of executive summary
Co-Authored-By: Claude Sonnet 5.5 <noreply@anthropic.com>
Claude-Session: https://claude.ai/code/session_01LugvseKmF2BjFkEv28Djej
</commit_message>
<xml_diff>
--- a/Anjali_Labtech_Executive_Summary.docx
+++ b/Anjali_Labtech_Executive_Summary.docx
@@ -620,147 +620,7 @@
           <w:sz w:val="21"/>
           <w:szCs w:val="21"/>
         </w:rPr>
-        <w:t xml:space="preserve">The certificate records five control gaps that underlie the findings:</w:t>
-      </w:r>
-    </w:p>
-    <w:p>
-      <w:pPr>
-        <w:pStyle w:val="ListParagraph"/>
-        <w:numPr>
-          <w:ilvl w:val="0"/>
-          <w:numId w:val="2"/>
-        </w:numPr>
-        <w:spacing w:after="70" w:line="270"/>
-      </w:pPr>
-      <w:r>
-        <w:rPr>
-          <w:rFonts w:ascii="Arial" w:cs="Arial" w:eastAsia="Arial" w:hAnsi="Arial"/>
-          <w:b/>
-          <w:bCs/>
-          <w:sz w:val="21"/>
-          <w:szCs w:val="21"/>
-        </w:rPr>
-        <w:t xml:space="preserve">Endpoint protection:</w:t>
-      </w:r>
-      <w:r>
-        <w:rPr>
-          <w:rFonts w:ascii="Arial" w:cs="Arial" w:eastAsia="Arial" w:hAnsi="Arial"/>
-          <w:sz w:val="21"/>
-          <w:szCs w:val="21"/>
-        </w:rPr>
-        <w:t xml:space="preserve"> no EDR or XDR solution is deployed on endpoints or servers.</w:t>
-      </w:r>
-    </w:p>
-    <w:p>
-      <w:pPr>
-        <w:pStyle w:val="ListParagraph"/>
-        <w:numPr>
-          <w:ilvl w:val="0"/>
-          <w:numId w:val="2"/>
-        </w:numPr>
-        <w:spacing w:after="70" w:line="270"/>
-      </w:pPr>
-      <w:r>
-        <w:rPr>
-          <w:rFonts w:ascii="Arial" w:cs="Arial" w:eastAsia="Arial" w:hAnsi="Arial"/>
-          <w:b/>
-          <w:bCs/>
-          <w:sz w:val="21"/>
-          <w:szCs w:val="21"/>
-        </w:rPr>
-        <w:t xml:space="preserve">Internet access control:</w:t>
-      </w:r>
-      <w:r>
-        <w:rPr>
-          <w:rFonts w:ascii="Arial" w:cs="Arial" w:eastAsia="Arial" w:hAnsi="Arial"/>
-          <w:sz w:val="21"/>
-          <w:szCs w:val="21"/>
-        </w:rPr>
-        <w:t xml:space="preserve"> internet access is unrestricted where it must be blocked.</w:t>
-      </w:r>
-    </w:p>
-    <w:p>
-      <w:pPr>
-        <w:pStyle w:val="ListParagraph"/>
-        <w:numPr>
-          <w:ilvl w:val="0"/>
-          <w:numId w:val="2"/>
-        </w:numPr>
-        <w:spacing w:after="70" w:line="270"/>
-      </w:pPr>
-      <w:r>
-        <w:rPr>
-          <w:rFonts w:ascii="Arial" w:cs="Arial" w:eastAsia="Arial" w:hAnsi="Arial"/>
-          <w:b/>
-          <w:bCs/>
-          <w:sz w:val="21"/>
-          <w:szCs w:val="21"/>
-        </w:rPr>
-        <w:t xml:space="preserve">IP address management:</w:t>
-      </w:r>
-      <w:r>
-        <w:rPr>
-          <w:rFonts w:ascii="Arial" w:cs="Arial" w:eastAsia="Arial" w:hAnsi="Arial"/>
-          <w:sz w:val="21"/>
-          <w:szCs w:val="21"/>
-        </w:rPr>
-        <w:t xml:space="preserve"> any user can change a locally set IP address to bypass restrictions.</w:t>
-      </w:r>
-    </w:p>
-    <w:p>
-      <w:pPr>
-        <w:pStyle w:val="ListParagraph"/>
-        <w:numPr>
-          <w:ilvl w:val="0"/>
-          <w:numId w:val="2"/>
-        </w:numPr>
-        <w:spacing w:after="70" w:line="270"/>
-      </w:pPr>
-      <w:r>
-        <w:rPr>
-          <w:rFonts w:ascii="Arial" w:cs="Arial" w:eastAsia="Arial" w:hAnsi="Arial"/>
-          <w:b/>
-          <w:bCs/>
-          <w:sz w:val="21"/>
-          <w:szCs w:val="21"/>
-        </w:rPr>
-        <w:t xml:space="preserve">Asset identification:</w:t>
-      </w:r>
-      <w:r>
-        <w:rPr>
-          <w:rFonts w:ascii="Arial" w:cs="Arial" w:eastAsia="Arial" w:hAnsi="Arial"/>
-          <w:sz w:val="21"/>
-          <w:szCs w:val="21"/>
-        </w:rPr>
-        <w:t xml:space="preserve"> hostnames are not standardised and devices are not labelled.</w:t>
-      </w:r>
-    </w:p>
-    <w:p>
-      <w:pPr>
-        <w:pStyle w:val="ListParagraph"/>
-        <w:numPr>
-          <w:ilvl w:val="0"/>
-          <w:numId w:val="2"/>
-        </w:numPr>
-        <w:spacing w:after="70" w:line="270"/>
-      </w:pPr>
-      <w:r>
-        <w:rPr>
-          <w:rFonts w:ascii="Arial" w:cs="Arial" w:eastAsia="Arial" w:hAnsi="Arial"/>
-          <w:b/>
-          <w:bCs/>
-          <w:sz w:val="21"/>
-          <w:szCs w:val="21"/>
-        </w:rPr>
-        <w:t xml:space="preserve">Vulnerability management:</w:t>
-      </w:r>
-      <w:r>
-        <w:rPr>
-          <w:rFonts w:ascii="Arial" w:cs="Arial" w:eastAsia="Arial" w:hAnsi="Arial"/>
-          <w:sz w:val="21"/>
-          <w:szCs w:val="21"/>
-        </w:rPr>
-        <w:t xml:space="preserve"> production systems are not periodically scanned or checked.</w:t>
+        <w:t xml:space="preserve">The most significant risks are network services open to remote attack and weak authentication and encryption. They are compounded by the absence of endpoint detection and an unsegmented network. If exploited they could lead to ransomware or data theft or loss of CCTV evidence. Critical and High findings must be remediated immediately and Medium and Low findings within a defined timeline. Sections 4 to 6 set out each issue with its impact and mitigation.</w:t>
       </w:r>
     </w:p>
     <w:p>
@@ -7578,12 +7438,6 @@
       <w:startOverride w:val="1"/>
     </w:lvlOverride>
   </w:num>
-  <w:num w:numId="2">
-    <w:abstractNumId w:val="2"/>
-    <w:lvlOverride w:ilvl="0">
-      <w:startOverride w:val="1"/>
-    </w:lvlOverride>
-  </w:num>
 </w:numbering>
 </file>
 

</xml_diff>

<commit_message>
Include all certificate content and prioritise EDR/XDR and firewall
Co-Authored-By: Claude Sonnet 5.5 <noreply@anthropic.com>
Claude-Session: https://claude.ai/code/session_01LugvseKmF2BjFkEv28Djej
</commit_message>
<xml_diff>
--- a/Anjali_Labtech_Executive_Summary.docx
+++ b/Anjali_Labtech_Executive_Summary.docx
@@ -101,7 +101,7 @@
                 <w:sz w:val="19"/>
                 <w:szCs w:val="19"/>
               </w:rPr>
-              <w:t xml:space="preserve">Client</w:t>
+              <w:t xml:space="preserve">Auditee</w:t>
             </w:r>
           </w:p>
         </w:tc>
@@ -132,7 +132,7 @@
                 <w:sz w:val="19"/>
                 <w:szCs w:val="19"/>
               </w:rPr>
-              <w:t xml:space="preserve">Anjali Labtech Limited, Surat, Gujarat</w:t>
+              <w:t xml:space="preserve">Anjali Labtech Limited. Anjali House, 2nd and 3rd Floor, Plot No. 210-211, Opp. Gitanjali Petrol Pump, Surat, Gujarat 395006. CIN: U32112GJ2021PLC122609</w:t>
             </w:r>
           </w:p>
         </w:tc>
@@ -171,7 +171,7 @@
                 <w:sz w:val="19"/>
                 <w:szCs w:val="19"/>
               </w:rPr>
-              <w:t xml:space="preserve">Assessment period</w:t>
+              <w:t xml:space="preserve">Audit details</w:t>
             </w:r>
           </w:p>
         </w:tc>
@@ -202,7 +202,7 @@
                 <w:sz w:val="19"/>
                 <w:szCs w:val="19"/>
               </w:rPr>
-              <w:t xml:space="preserve">28 September 2026 to 3 October 2026</w:t>
+              <w:t xml:space="preserve">Internal Network VAPT (Report Version 1.0) and CCTV / IoT VAPT (Report Version 1.0)</w:t>
             </w:r>
           </w:p>
         </w:tc>
@@ -241,7 +241,7 @@
                 <w:sz w:val="19"/>
                 <w:szCs w:val="19"/>
               </w:rPr>
-              <w:t xml:space="preserve">Report date</w:t>
+              <w:t xml:space="preserve">Audit scope</w:t>
             </w:r>
           </w:p>
         </w:tc>
@@ -272,7 +272,7 @@
                 <w:sz w:val="19"/>
                 <w:szCs w:val="19"/>
               </w:rPr>
-              <w:t xml:space="preserve">5 October 2026</w:t>
+              <w:t xml:space="preserve">Internal network: 414 endpoints and 6 servers and 2 routers. CCTV: 446 devices</w:t>
             </w:r>
           </w:p>
         </w:tc>
@@ -311,7 +311,7 @@
                 <w:sz w:val="19"/>
                 <w:szCs w:val="19"/>
               </w:rPr>
-              <w:t xml:space="preserve">Scope</w:t>
+              <w:t xml:space="preserve">Audit methodology</w:t>
             </w:r>
           </w:p>
         </w:tc>
@@ -342,7 +342,7 @@
                 <w:sz w:val="19"/>
                 <w:szCs w:val="19"/>
               </w:rPr>
-              <w:t xml:space="preserve">Internal network: 414 endpoints and 6 servers and 2 routers. CCTV: 446 devices</w:t>
+              <w:t xml:space="preserve">Grey box testing in the production environment (internal network)</w:t>
             </w:r>
           </w:p>
         </w:tc>
@@ -381,7 +381,7 @@
                 <w:sz w:val="19"/>
                 <w:szCs w:val="19"/>
               </w:rPr>
-              <w:t xml:space="preserve">Certificate no.</w:t>
+              <w:t xml:space="preserve">Assessment period</w:t>
             </w:r>
           </w:p>
         </w:tc>
@@ -412,7 +412,7 @@
                 <w:sz w:val="19"/>
                 <w:szCs w:val="19"/>
               </w:rPr>
-              <w:t xml:space="preserve">SCS/VAPTCERT/ALL/NET/051026ALL00 (draft)</w:t>
+              <w:t xml:space="preserve">28 September 2026 to 3 October 2026</w:t>
             </w:r>
           </w:p>
         </w:tc>
@@ -451,7 +451,7 @@
                 <w:sz w:val="19"/>
                 <w:szCs w:val="19"/>
               </w:rPr>
-              <w:t xml:space="preserve">Status</w:t>
+              <w:t xml:space="preserve">Assessment status</w:t>
             </w:r>
           </w:p>
         </w:tc>
@@ -494,6 +494,216 @@
                 <w:szCs w:val="19"/>
               </w:rPr>
               <w:t xml:space="preserve">: remediation and revalidation pending</w:t>
+            </w:r>
+          </w:p>
+        </w:tc>
+      </w:tr>
+      <w:tr>
+        <w:trPr>
+          <w:cantSplit/>
+        </w:trPr>
+        <w:tc>
+          <w:tcPr>
+            <w:tcW w:type="dxa" w:w="2500"/>
+            <w:tcBorders>
+              <w:top w:val="single" w:color="BFC7D5" w:sz="4"/>
+              <w:left w:val="single" w:color="BFC7D5" w:sz="4"/>
+              <w:bottom w:val="single" w:color="BFC7D5" w:sz="4"/>
+              <w:right w:val="single" w:color="BFC7D5" w:sz="4"/>
+            </w:tcBorders>
+            <w:shd w:fill="F2F4F8" w:color="auto" w:val="clear"/>
+            <w:tcMar>
+              <w:top w:type="dxa" w:w="70"/>
+              <w:left w:type="dxa" w:w="110"/>
+              <w:bottom w:type="dxa" w:w="70"/>
+              <w:right w:type="dxa" w:w="110"/>
+            </w:tcMar>
+            <w:vAlign w:val="top"/>
+          </w:tcPr>
+          <w:p>
+            <w:pPr>
+              <w:spacing w:after="50" w:line="260"/>
+            </w:pPr>
+            <w:r>
+              <w:rPr>
+                <w:rFonts w:ascii="Arial" w:cs="Arial" w:eastAsia="Arial" w:hAnsi="Arial"/>
+                <w:b/>
+                <w:bCs/>
+                <w:sz w:val="19"/>
+                <w:szCs w:val="19"/>
+              </w:rPr>
+              <w:t xml:space="preserve">Audit team</w:t>
+            </w:r>
+          </w:p>
+        </w:tc>
+        <w:tc>
+          <w:tcPr>
+            <w:tcW w:type="dxa" w:w="7406"/>
+            <w:tcBorders>
+              <w:top w:val="single" w:color="BFC7D5" w:sz="4"/>
+              <w:left w:val="single" w:color="BFC7D5" w:sz="4"/>
+              <w:bottom w:val="single" w:color="BFC7D5" w:sz="4"/>
+              <w:right w:val="single" w:color="BFC7D5" w:sz="4"/>
+            </w:tcBorders>
+            <w:tcMar>
+              <w:top w:type="dxa" w:w="70"/>
+              <w:left w:type="dxa" w:w="110"/>
+              <w:bottom w:type="dxa" w:w="70"/>
+              <w:right w:type="dxa" w:w="110"/>
+            </w:tcMar>
+            <w:vAlign w:val="top"/>
+          </w:tcPr>
+          <w:p>
+            <w:pPr>
+              <w:spacing w:after="50" w:line="260"/>
+            </w:pPr>
+            <w:r>
+              <w:rPr>
+                <w:rFonts w:ascii="Arial" w:cs="Arial" w:eastAsia="Arial" w:hAnsi="Arial"/>
+                <w:sz w:val="19"/>
+                <w:szCs w:val="19"/>
+              </w:rPr>
+              <w:t xml:space="preserve">Vivek Thakkar (Sr. Security Analyst). Reviewed by Nruzal Darji (Project Manager)</w:t>
+            </w:r>
+          </w:p>
+        </w:tc>
+      </w:tr>
+      <w:tr>
+        <w:trPr>
+          <w:cantSplit/>
+        </w:trPr>
+        <w:tc>
+          <w:tcPr>
+            <w:tcW w:type="dxa" w:w="2500"/>
+            <w:tcBorders>
+              <w:top w:val="single" w:color="BFC7D5" w:sz="4"/>
+              <w:left w:val="single" w:color="BFC7D5" w:sz="4"/>
+              <w:bottom w:val="single" w:color="BFC7D5" w:sz="4"/>
+              <w:right w:val="single" w:color="BFC7D5" w:sz="4"/>
+            </w:tcBorders>
+            <w:shd w:fill="F2F4F8" w:color="auto" w:val="clear"/>
+            <w:tcMar>
+              <w:top w:type="dxa" w:w="70"/>
+              <w:left w:type="dxa" w:w="110"/>
+              <w:bottom w:type="dxa" w:w="70"/>
+              <w:right w:type="dxa" w:w="110"/>
+            </w:tcMar>
+            <w:vAlign w:val="top"/>
+          </w:tcPr>
+          <w:p>
+            <w:pPr>
+              <w:spacing w:after="50" w:line="260"/>
+            </w:pPr>
+            <w:r>
+              <w:rPr>
+                <w:rFonts w:ascii="Arial" w:cs="Arial" w:eastAsia="Arial" w:hAnsi="Arial"/>
+                <w:b/>
+                <w:bCs/>
+                <w:sz w:val="19"/>
+                <w:szCs w:val="19"/>
+              </w:rPr>
+              <w:t xml:space="preserve">Certificate no.</w:t>
+            </w:r>
+          </w:p>
+        </w:tc>
+        <w:tc>
+          <w:tcPr>
+            <w:tcW w:type="dxa" w:w="7406"/>
+            <w:tcBorders>
+              <w:top w:val="single" w:color="BFC7D5" w:sz="4"/>
+              <w:left w:val="single" w:color="BFC7D5" w:sz="4"/>
+              <w:bottom w:val="single" w:color="BFC7D5" w:sz="4"/>
+              <w:right w:val="single" w:color="BFC7D5" w:sz="4"/>
+            </w:tcBorders>
+            <w:tcMar>
+              <w:top w:type="dxa" w:w="70"/>
+              <w:left w:type="dxa" w:w="110"/>
+              <w:bottom w:type="dxa" w:w="70"/>
+              <w:right w:type="dxa" w:w="110"/>
+            </w:tcMar>
+            <w:vAlign w:val="top"/>
+          </w:tcPr>
+          <w:p>
+            <w:pPr>
+              <w:spacing w:after="50" w:line="260"/>
+            </w:pPr>
+            <w:r>
+              <w:rPr>
+                <w:rFonts w:ascii="Arial" w:cs="Arial" w:eastAsia="Arial" w:hAnsi="Arial"/>
+                <w:sz w:val="19"/>
+                <w:szCs w:val="19"/>
+              </w:rPr>
+              <w:t xml:space="preserve">SCS/VAPTCERT/ALL/NET/051026ALL00 (draft)</w:t>
+            </w:r>
+          </w:p>
+        </w:tc>
+      </w:tr>
+      <w:tr>
+        <w:trPr>
+          <w:cantSplit/>
+        </w:trPr>
+        <w:tc>
+          <w:tcPr>
+            <w:tcW w:type="dxa" w:w="2500"/>
+            <w:tcBorders>
+              <w:top w:val="single" w:color="BFC7D5" w:sz="4"/>
+              <w:left w:val="single" w:color="BFC7D5" w:sz="4"/>
+              <w:bottom w:val="single" w:color="BFC7D5" w:sz="4"/>
+              <w:right w:val="single" w:color="BFC7D5" w:sz="4"/>
+            </w:tcBorders>
+            <w:shd w:fill="F2F4F8" w:color="auto" w:val="clear"/>
+            <w:tcMar>
+              <w:top w:type="dxa" w:w="70"/>
+              <w:left w:type="dxa" w:w="110"/>
+              <w:bottom w:type="dxa" w:w="70"/>
+              <w:right w:type="dxa" w:w="110"/>
+            </w:tcMar>
+            <w:vAlign w:val="top"/>
+          </w:tcPr>
+          <w:p>
+            <w:pPr>
+              <w:spacing w:after="50" w:line="260"/>
+            </w:pPr>
+            <w:r>
+              <w:rPr>
+                <w:rFonts w:ascii="Arial" w:cs="Arial" w:eastAsia="Arial" w:hAnsi="Arial"/>
+                <w:b/>
+                <w:bCs/>
+                <w:sz w:val="19"/>
+                <w:szCs w:val="19"/>
+              </w:rPr>
+              <w:t xml:space="preserve">Issue date</w:t>
+            </w:r>
+          </w:p>
+        </w:tc>
+        <w:tc>
+          <w:tcPr>
+            <w:tcW w:type="dxa" w:w="7406"/>
+            <w:tcBorders>
+              <w:top w:val="single" w:color="BFC7D5" w:sz="4"/>
+              <w:left w:val="single" w:color="BFC7D5" w:sz="4"/>
+              <w:bottom w:val="single" w:color="BFC7D5" w:sz="4"/>
+              <w:right w:val="single" w:color="BFC7D5" w:sz="4"/>
+            </w:tcBorders>
+            <w:tcMar>
+              <w:top w:type="dxa" w:w="70"/>
+              <w:left w:type="dxa" w:w="110"/>
+              <w:bottom w:type="dxa" w:w="70"/>
+              <w:right w:type="dxa" w:w="110"/>
+            </w:tcMar>
+            <w:vAlign w:val="top"/>
+          </w:tcPr>
+          <w:p>
+            <w:pPr>
+              <w:spacing w:after="50" w:line="260"/>
+            </w:pPr>
+            <w:r>
+              <w:rPr>
+                <w:rFonts w:ascii="Arial" w:cs="Arial" w:eastAsia="Arial" w:hAnsi="Arial"/>
+                <w:sz w:val="19"/>
+                <w:szCs w:val="19"/>
+              </w:rPr>
+              <w:t xml:space="preserve">5 October 2026. Issued by Dhruvesh Panchal, Director and CEO</w:t>
             </w:r>
           </w:p>
         </w:tc>
@@ -620,7 +830,7 @@
           <w:sz w:val="21"/>
           <w:szCs w:val="21"/>
         </w:rPr>
-        <w:t xml:space="preserve">The most significant risks are network services open to remote attack and weak authentication and encryption. They are compounded by the absence of endpoint detection and an unsegmented network. If exploited they could lead to ransomware or data theft or loss of CCTV evidence. Critical and High findings must be remediated immediately and Medium and Low findings within a defined timeline. Sections 4 to 6 set out each issue with its impact and mitigation.</w:t>
+        <w:t xml:space="preserve">The most significant risks are network services open to remote attack and weak authentication and encryption. They are compounded by the absence of endpoint detection and an unsegmented network. If exploited they could lead to ransomware or data theft or loss of CCTV evidence. Critical and High findings must be remediated immediately and Medium and Low findings within a defined timeline. Deployment of EDR or XDR and a next-generation firewall with internal segmentation is the first implementation priority. Sections 5 to 7 set out each issue with its impact and mitigation.</w:t>
       </w:r>
     </w:p>
     <w:p>
@@ -1665,7 +1875,168 @@
           <w:sz w:val="30"/>
           <w:szCs w:val="30"/>
         </w:rPr>
-        <w:t xml:space="preserve">3. Business impact</w:t>
+        <w:t xml:space="preserve">3. Key observations</w:t>
+      </w:r>
+    </w:p>
+    <w:p>
+      <w:pPr>
+        <w:pStyle w:val="ListParagraph"/>
+        <w:numPr>
+          <w:ilvl w:val="0"/>
+          <w:numId w:val="2"/>
+        </w:numPr>
+        <w:spacing w:after="70" w:line="270"/>
+      </w:pPr>
+      <w:r>
+        <w:rPr>
+          <w:rFonts w:ascii="Arial" w:cs="Arial" w:eastAsia="Arial" w:hAnsi="Arial"/>
+          <w:b/>
+          <w:bCs/>
+          <w:sz w:val="21"/>
+          <w:szCs w:val="21"/>
+        </w:rPr>
+        <w:t xml:space="preserve">Endpoint protection:</w:t>
+      </w:r>
+      <w:r>
+        <w:rPr>
+          <w:rFonts w:ascii="Arial" w:cs="Arial" w:eastAsia="Arial" w:hAnsi="Arial"/>
+          <w:sz w:val="21"/>
+          <w:szCs w:val="21"/>
+        </w:rPr>
+        <w:t xml:space="preserve"> no Endpoint Detection and Response (EDR) or Extended Detection and Response (XDR) solution is deployed on endpoints and servers.</w:t>
+      </w:r>
+    </w:p>
+    <w:p>
+      <w:pPr>
+        <w:pStyle w:val="ListParagraph"/>
+        <w:numPr>
+          <w:ilvl w:val="0"/>
+          <w:numId w:val="2"/>
+        </w:numPr>
+        <w:spacing w:after="70" w:line="270"/>
+      </w:pPr>
+      <w:r>
+        <w:rPr>
+          <w:rFonts w:ascii="Arial" w:cs="Arial" w:eastAsia="Arial" w:hAnsi="Arial"/>
+          <w:b/>
+          <w:bCs/>
+          <w:sz w:val="21"/>
+          <w:szCs w:val="21"/>
+        </w:rPr>
+        <w:t xml:space="preserve">Internet access control:</w:t>
+      </w:r>
+      <w:r>
+        <w:rPr>
+          <w:rFonts w:ascii="Arial" w:cs="Arial" w:eastAsia="Arial" w:hAnsi="Arial"/>
+          <w:sz w:val="21"/>
+          <w:szCs w:val="21"/>
+        </w:rPr>
+        <w:t xml:space="preserve"> internet access is unrestricted where it must be blocked.</w:t>
+      </w:r>
+    </w:p>
+    <w:p>
+      <w:pPr>
+        <w:pStyle w:val="ListParagraph"/>
+        <w:numPr>
+          <w:ilvl w:val="0"/>
+          <w:numId w:val="2"/>
+        </w:numPr>
+        <w:spacing w:after="70" w:line="270"/>
+      </w:pPr>
+      <w:r>
+        <w:rPr>
+          <w:rFonts w:ascii="Arial" w:cs="Arial" w:eastAsia="Arial" w:hAnsi="Arial"/>
+          <w:b/>
+          <w:bCs/>
+          <w:sz w:val="21"/>
+          <w:szCs w:val="21"/>
+        </w:rPr>
+        <w:t xml:space="preserve">IP address management:</w:t>
+      </w:r>
+      <w:r>
+        <w:rPr>
+          <w:rFonts w:ascii="Arial" w:cs="Arial" w:eastAsia="Arial" w:hAnsi="Arial"/>
+          <w:sz w:val="21"/>
+          <w:szCs w:val="21"/>
+        </w:rPr>
+        <w:t xml:space="preserve"> any user can change locally set IP addresses to bypass restrictions.</w:t>
+      </w:r>
+    </w:p>
+    <w:p>
+      <w:pPr>
+        <w:pStyle w:val="ListParagraph"/>
+        <w:numPr>
+          <w:ilvl w:val="0"/>
+          <w:numId w:val="2"/>
+        </w:numPr>
+        <w:spacing w:after="70" w:line="270"/>
+      </w:pPr>
+      <w:r>
+        <w:rPr>
+          <w:rFonts w:ascii="Arial" w:cs="Arial" w:eastAsia="Arial" w:hAnsi="Arial"/>
+          <w:b/>
+          <w:bCs/>
+          <w:sz w:val="21"/>
+          <w:szCs w:val="21"/>
+        </w:rPr>
+        <w:t xml:space="preserve">Asset identification:</w:t>
+      </w:r>
+      <w:r>
+        <w:rPr>
+          <w:rFonts w:ascii="Arial" w:cs="Arial" w:eastAsia="Arial" w:hAnsi="Arial"/>
+          <w:sz w:val="21"/>
+          <w:szCs w:val="21"/>
+        </w:rPr>
+        <w:t xml:space="preserve"> hostnames are not standardised and devices are not labelled.</w:t>
+      </w:r>
+    </w:p>
+    <w:p>
+      <w:pPr>
+        <w:pStyle w:val="ListParagraph"/>
+        <w:numPr>
+          <w:ilvl w:val="0"/>
+          <w:numId w:val="2"/>
+        </w:numPr>
+        <w:spacing w:after="70" w:line="270"/>
+      </w:pPr>
+      <w:r>
+        <w:rPr>
+          <w:rFonts w:ascii="Arial" w:cs="Arial" w:eastAsia="Arial" w:hAnsi="Arial"/>
+          <w:b/>
+          <w:bCs/>
+          <w:sz w:val="21"/>
+          <w:szCs w:val="21"/>
+        </w:rPr>
+        <w:t xml:space="preserve">Vulnerability management:</w:t>
+      </w:r>
+      <w:r>
+        <w:rPr>
+          <w:rFonts w:ascii="Arial" w:cs="Arial" w:eastAsia="Arial" w:hAnsi="Arial"/>
+          <w:sz w:val="21"/>
+          <w:szCs w:val="21"/>
+        </w:rPr>
+        <w:t xml:space="preserve"> production systems are not periodically scanned or checked.</w:t>
+      </w:r>
+    </w:p>
+    <w:p>
+      <w:pPr>
+        <w:pStyle w:val="Heading1"/>
+        <w:keepNext/>
+        <w:pBdr>
+          <w:bottom w:val="single" w:color="1F3A6E" w:sz="8" w:space="4"/>
+        </w:pBdr>
+        <w:spacing w:after="140" w:before="360"/>
+      </w:pPr>
+      <w:r>
+        <w:rPr>
+          <w:rFonts w:ascii="Arial" w:cs="Arial" w:eastAsia="Arial" w:hAnsi="Arial"/>
+          <w:b/>
+          <w:bCs/>
+          <w:color w:val="1F3A6E"/>
+          <w:sz w:val="30"/>
+          <w:szCs w:val="30"/>
+        </w:rPr>
+        <w:t xml:space="preserve">4. Business impact</w:t>
       </w:r>
     </w:p>
     <w:tbl>
@@ -2421,7 +2792,7 @@
           <w:sz w:val="30"/>
           <w:szCs w:val="30"/>
         </w:rPr>
-        <w:t xml:space="preserve">4. Network vulnerabilities</w:t>
+        <w:t xml:space="preserve">5. Network vulnerabilities</w:t>
       </w:r>
     </w:p>
     <w:tbl>
@@ -2475,7 +2846,7 @@
                 <w:sz w:val="21"/>
                 <w:szCs w:val="21"/>
               </w:rPr>
-              <w:t xml:space="preserve">4.1 Remotely exploitable network services   |   CRITICAL / HIGH</w:t>
+              <w:t xml:space="preserve">5.1 Remotely exploitable network services   |   CRITICAL / HIGH</w:t>
             </w:r>
           </w:p>
         </w:tc>
@@ -2747,7 +3118,7 @@
                 <w:sz w:val="21"/>
                 <w:szCs w:val="21"/>
               </w:rPr>
-              <w:t xml:space="preserve">4.2 SMB signing not required   |   HIGH</w:t>
+              <w:t xml:space="preserve">5.2 SMB signing not required   |   HIGH</w:t>
             </w:r>
           </w:p>
         </w:tc>
@@ -3019,7 +3390,7 @@
                 <w:sz w:val="21"/>
                 <w:szCs w:val="21"/>
               </w:rPr>
-              <w:t xml:space="preserve">4.3 Remote desktop weaknesses   |   HIGH / MEDIUM</w:t>
+              <w:t xml:space="preserve">5.3 Remote desktop weaknesses   |   HIGH / MEDIUM</w:t>
             </w:r>
           </w:p>
         </w:tc>
@@ -3291,7 +3662,7 @@
                 <w:sz w:val="21"/>
                 <w:szCs w:val="21"/>
               </w:rPr>
-              <w:t xml:space="preserve">4.4 Clear-text and legacy authentication   |   MEDIUM</w:t>
+              <w:t xml:space="preserve">5.4 Clear-text and legacy authentication   |   MEDIUM</w:t>
             </w:r>
           </w:p>
         </w:tc>
@@ -3563,7 +3934,7 @@
                 <w:sz w:val="21"/>
                 <w:szCs w:val="21"/>
               </w:rPr>
-              <w:t xml:space="preserve">4.5 Weak encryption on network services   |   HIGH / MEDIUM</w:t>
+              <w:t xml:space="preserve">5.5 Weak encryption on network services   |   HIGH / MEDIUM</w:t>
             </w:r>
           </w:p>
         </w:tc>
@@ -3835,7 +4206,7 @@
                 <w:sz w:val="21"/>
                 <w:szCs w:val="21"/>
               </w:rPr>
-              <w:t xml:space="preserve">4.6 Unrestricted and unsegmented network   |   HIGH</w:t>
+              <w:t xml:space="preserve">5.6 Unrestricted and unsegmented network   |   HIGH</w:t>
             </w:r>
           </w:p>
         </w:tc>
@@ -4074,7 +4445,7 @@
           <w:sz w:val="30"/>
           <w:szCs w:val="30"/>
         </w:rPr>
-        <w:t xml:space="preserve">5. CCTV vulnerabilities</w:t>
+        <w:t xml:space="preserve">6. CCTV vulnerabilities</w:t>
       </w:r>
     </w:p>
     <w:tbl>
@@ -5710,7 +6081,7 @@
           <w:sz w:val="30"/>
           <w:szCs w:val="30"/>
         </w:rPr>
-        <w:t xml:space="preserve">6. Recommendations</w:t>
+        <w:t xml:space="preserve">7. Recommendations and implementation priority</w:t>
       </w:r>
     </w:p>
     <w:p>
@@ -5724,7 +6095,7 @@
           <w:sz w:val="21"/>
           <w:szCs w:val="21"/>
         </w:rPr>
-        <w:t xml:space="preserve">The certificate sets out six mandatory recommendations:</w:t>
+        <w:t xml:space="preserve">The certificate sets out six mandatory recommendations. They are listed in order of implementation priority. EDR or XDR deployment and next-generation firewall installation come first.</w:t>
       </w:r>
     </w:p>
     <w:tbl>
@@ -5740,10 +6111,10 @@
         </w:tblBorders>
       </w:tblPr>
       <w:tblGrid>
-        <w:gridCol w:w="700"/>
-        <w:gridCol w:w="2150"/>
-        <w:gridCol w:w="3750"/>
-        <w:gridCol w:w="3306"/>
+        <w:gridCol w:w="900"/>
+        <w:gridCol w:w="2100"/>
+        <w:gridCol w:w="4100"/>
+        <w:gridCol w:w="2806"/>
       </w:tblGrid>
       <w:tr>
         <w:trPr>
@@ -5752,7 +6123,7 @@
         </w:trPr>
         <w:tc>
           <w:tcPr>
-            <w:tcW w:type="dxa" w:w="700"/>
+            <w:tcW w:type="dxa" w:w="900"/>
             <w:tcBorders>
               <w:top w:val="single" w:color="BFC7D5" w:sz="4"/>
               <w:left w:val="single" w:color="BFC7D5" w:sz="4"/>
@@ -5781,13 +6152,13 @@
                 <w:sz w:val="19"/>
                 <w:szCs w:val="19"/>
               </w:rPr>
-              <w:t xml:space="preserve">No.</w:t>
-            </w:r>
-          </w:p>
-        </w:tc>
-        <w:tc>
-          <w:tcPr>
-            <w:tcW w:type="dxa" w:w="2150"/>
+              <w:t xml:space="preserve">Priority</w:t>
+            </w:r>
+          </w:p>
+        </w:tc>
+        <w:tc>
+          <w:tcPr>
+            <w:tcW w:type="dxa" w:w="2100"/>
             <w:tcBorders>
               <w:top w:val="single" w:color="BFC7D5" w:sz="4"/>
               <w:left w:val="single" w:color="BFC7D5" w:sz="4"/>
@@ -5822,7 +6193,7 @@
         </w:tc>
         <w:tc>
           <w:tcPr>
-            <w:tcW w:type="dxa" w:w="3750"/>
+            <w:tcW w:type="dxa" w:w="4100"/>
             <w:tcBorders>
               <w:top w:val="single" w:color="BFC7D5" w:sz="4"/>
               <w:left w:val="single" w:color="BFC7D5" w:sz="4"/>
@@ -5851,13 +6222,13 @@
                 <w:sz w:val="19"/>
                 <w:szCs w:val="19"/>
               </w:rPr>
-              <w:t xml:space="preserve">Action</w:t>
-            </w:r>
-          </w:p>
-        </w:tc>
-        <w:tc>
-          <w:tcPr>
-            <w:tcW w:type="dxa" w:w="3306"/>
+              <w:t xml:space="preserve">Requirement</w:t>
+            </w:r>
+          </w:p>
+        </w:tc>
+        <w:tc>
+          <w:tcPr>
+            <w:tcW w:type="dxa" w:w="2806"/>
             <w:tcBorders>
               <w:top w:val="single" w:color="BFC7D5" w:sz="4"/>
               <w:left w:val="single" w:color="BFC7D5" w:sz="4"/>
@@ -5897,28 +6268,31 @@
         </w:trPr>
         <w:tc>
           <w:tcPr>
-            <w:tcW w:type="dxa" w:w="700"/>
-            <w:tcBorders>
-              <w:top w:val="single" w:color="BFC7D5" w:sz="4"/>
-              <w:left w:val="single" w:color="BFC7D5" w:sz="4"/>
-              <w:bottom w:val="single" w:color="BFC7D5" w:sz="4"/>
-              <w:right w:val="single" w:color="BFC7D5" w:sz="4"/>
-            </w:tcBorders>
-            <w:tcMar>
-              <w:top w:type="dxa" w:w="70"/>
-              <w:left w:type="dxa" w:w="110"/>
-              <w:bottom w:type="dxa" w:w="70"/>
-              <w:right w:type="dxa" w:w="110"/>
-            </w:tcMar>
-            <w:vAlign w:val="top"/>
-          </w:tcPr>
-          <w:p>
-            <w:pPr>
-              <w:spacing w:after="50" w:line="260"/>
-            </w:pPr>
-            <w:r>
-              <w:rPr>
-                <w:rFonts w:ascii="Arial" w:cs="Arial" w:eastAsia="Arial" w:hAnsi="Arial"/>
+            <w:tcW w:type="dxa" w:w="900"/>
+            <w:tcBorders>
+              <w:top w:val="single" w:color="BFC7D5" w:sz="4"/>
+              <w:left w:val="single" w:color="BFC7D5" w:sz="4"/>
+              <w:bottom w:val="single" w:color="BFC7D5" w:sz="4"/>
+              <w:right w:val="single" w:color="BFC7D5" w:sz="4"/>
+            </w:tcBorders>
+            <w:shd w:fill="FBE5E5" w:color="auto" w:val="clear"/>
+            <w:tcMar>
+              <w:top w:type="dxa" w:w="70"/>
+              <w:left w:type="dxa" w:w="110"/>
+              <w:bottom w:type="dxa" w:w="70"/>
+              <w:right w:type="dxa" w:w="110"/>
+            </w:tcMar>
+            <w:vAlign w:val="top"/>
+          </w:tcPr>
+          <w:p>
+            <w:pPr>
+              <w:spacing w:after="50" w:line="260"/>
+            </w:pPr>
+            <w:r>
+              <w:rPr>
+                <w:rFonts w:ascii="Arial" w:cs="Arial" w:eastAsia="Arial" w:hAnsi="Arial"/>
+                <w:b/>
+                <w:bCs/>
                 <w:sz w:val="19"/>
                 <w:szCs w:val="19"/>
               </w:rPr>
@@ -5928,96 +6302,96 @@
         </w:tc>
         <w:tc>
           <w:tcPr>
-            <w:tcW w:type="dxa" w:w="2150"/>
-            <w:tcBorders>
-              <w:top w:val="single" w:color="BFC7D5" w:sz="4"/>
-              <w:left w:val="single" w:color="BFC7D5" w:sz="4"/>
-              <w:bottom w:val="single" w:color="BFC7D5" w:sz="4"/>
-              <w:right w:val="single" w:color="BFC7D5" w:sz="4"/>
-            </w:tcBorders>
-            <w:tcMar>
-              <w:top w:type="dxa" w:w="70"/>
-              <w:left w:type="dxa" w:w="110"/>
-              <w:bottom w:type="dxa" w:w="70"/>
-              <w:right w:type="dxa" w:w="110"/>
-            </w:tcMar>
-            <w:vAlign w:val="top"/>
-          </w:tcPr>
-          <w:p>
-            <w:pPr>
-              <w:spacing w:after="50" w:line="260"/>
-            </w:pPr>
-            <w:r>
-              <w:rPr>
-                <w:rFonts w:ascii="Arial" w:cs="Arial" w:eastAsia="Arial" w:hAnsi="Arial"/>
-                <w:b/>
-                <w:bCs/>
-                <w:sz w:val="19"/>
-                <w:szCs w:val="19"/>
-              </w:rPr>
-              <w:t xml:space="preserve">Vulnerability remediation</w:t>
-            </w:r>
-          </w:p>
-        </w:tc>
-        <w:tc>
-          <w:tcPr>
-            <w:tcW w:type="dxa" w:w="3750"/>
-            <w:tcBorders>
-              <w:top w:val="single" w:color="BFC7D5" w:sz="4"/>
-              <w:left w:val="single" w:color="BFC7D5" w:sz="4"/>
-              <w:bottom w:val="single" w:color="BFC7D5" w:sz="4"/>
-              <w:right w:val="single" w:color="BFC7D5" w:sz="4"/>
-            </w:tcBorders>
-            <w:tcMar>
-              <w:top w:type="dxa" w:w="70"/>
-              <w:left w:type="dxa" w:w="110"/>
-              <w:bottom w:type="dxa" w:w="70"/>
-              <w:right w:type="dxa" w:w="110"/>
-            </w:tcMar>
-            <w:vAlign w:val="top"/>
-          </w:tcPr>
-          <w:p>
-            <w:pPr>
-              <w:spacing w:after="50" w:line="260"/>
-            </w:pPr>
-            <w:r>
-              <w:rPr>
-                <w:rFonts w:ascii="Arial" w:cs="Arial" w:eastAsia="Arial" w:hAnsi="Arial"/>
-                <w:sz w:val="19"/>
-                <w:szCs w:val="19"/>
-              </w:rPr>
-              <w:t xml:space="preserve">Remediate Critical and High findings immediately. Close Medium and Low findings within a defined timeline.</w:t>
-            </w:r>
-          </w:p>
-        </w:tc>
-        <w:tc>
-          <w:tcPr>
-            <w:tcW w:type="dxa" w:w="3306"/>
-            <w:tcBorders>
-              <w:top w:val="single" w:color="BFC7D5" w:sz="4"/>
-              <w:left w:val="single" w:color="BFC7D5" w:sz="4"/>
-              <w:bottom w:val="single" w:color="BFC7D5" w:sz="4"/>
-              <w:right w:val="single" w:color="BFC7D5" w:sz="4"/>
-            </w:tcBorders>
-            <w:tcMar>
-              <w:top w:type="dxa" w:w="70"/>
-              <w:left w:type="dxa" w:w="110"/>
-              <w:bottom w:type="dxa" w:w="70"/>
-              <w:right w:type="dxa" w:w="110"/>
-            </w:tcMar>
-            <w:vAlign w:val="top"/>
-          </w:tcPr>
-          <w:p>
-            <w:pPr>
-              <w:spacing w:after="50" w:line="260"/>
-            </w:pPr>
-            <w:r>
-              <w:rPr>
-                <w:rFonts w:ascii="Arial" w:cs="Arial" w:eastAsia="Arial" w:hAnsi="Arial"/>
-                <w:sz w:val="19"/>
-                <w:szCs w:val="19"/>
-              </w:rPr>
-              <w:t xml:space="preserve">The 600 Critical and High findings.</w:t>
+            <w:tcW w:type="dxa" w:w="2100"/>
+            <w:tcBorders>
+              <w:top w:val="single" w:color="BFC7D5" w:sz="4"/>
+              <w:left w:val="single" w:color="BFC7D5" w:sz="4"/>
+              <w:bottom w:val="single" w:color="BFC7D5" w:sz="4"/>
+              <w:right w:val="single" w:color="BFC7D5" w:sz="4"/>
+            </w:tcBorders>
+            <w:tcMar>
+              <w:top w:type="dxa" w:w="70"/>
+              <w:left w:type="dxa" w:w="110"/>
+              <w:bottom w:type="dxa" w:w="70"/>
+              <w:right w:type="dxa" w:w="110"/>
+            </w:tcMar>
+            <w:vAlign w:val="top"/>
+          </w:tcPr>
+          <w:p>
+            <w:pPr>
+              <w:spacing w:after="50" w:line="260"/>
+            </w:pPr>
+            <w:r>
+              <w:rPr>
+                <w:rFonts w:ascii="Arial" w:cs="Arial" w:eastAsia="Arial" w:hAnsi="Arial"/>
+                <w:b/>
+                <w:bCs/>
+                <w:sz w:val="19"/>
+                <w:szCs w:val="19"/>
+              </w:rPr>
+              <w:t xml:space="preserve">Endpoint protection</w:t>
+            </w:r>
+          </w:p>
+        </w:tc>
+        <w:tc>
+          <w:tcPr>
+            <w:tcW w:type="dxa" w:w="4100"/>
+            <w:tcBorders>
+              <w:top w:val="single" w:color="BFC7D5" w:sz="4"/>
+              <w:left w:val="single" w:color="BFC7D5" w:sz="4"/>
+              <w:bottom w:val="single" w:color="BFC7D5" w:sz="4"/>
+              <w:right w:val="single" w:color="BFC7D5" w:sz="4"/>
+            </w:tcBorders>
+            <w:tcMar>
+              <w:top w:type="dxa" w:w="70"/>
+              <w:left w:type="dxa" w:w="110"/>
+              <w:bottom w:type="dxa" w:w="70"/>
+              <w:right w:type="dxa" w:w="110"/>
+            </w:tcMar>
+            <w:vAlign w:val="top"/>
+          </w:tcPr>
+          <w:p>
+            <w:pPr>
+              <w:spacing w:after="50" w:line="260"/>
+            </w:pPr>
+            <w:r>
+              <w:rPr>
+                <w:rFonts w:ascii="Arial" w:cs="Arial" w:eastAsia="Arial" w:hAnsi="Arial"/>
+                <w:sz w:val="19"/>
+                <w:szCs w:val="19"/>
+              </w:rPr>
+              <w:t xml:space="preserve">An EDR or XDR solution must be deployed on all endpoints and servers with centralised monitoring and automated containment.</w:t>
+            </w:r>
+          </w:p>
+        </w:tc>
+        <w:tc>
+          <w:tcPr>
+            <w:tcW w:type="dxa" w:w="2806"/>
+            <w:tcBorders>
+              <w:top w:val="single" w:color="BFC7D5" w:sz="4"/>
+              <w:left w:val="single" w:color="BFC7D5" w:sz="4"/>
+              <w:bottom w:val="single" w:color="BFC7D5" w:sz="4"/>
+              <w:right w:val="single" w:color="BFC7D5" w:sz="4"/>
+            </w:tcBorders>
+            <w:tcMar>
+              <w:top w:type="dxa" w:w="70"/>
+              <w:left w:type="dxa" w:w="110"/>
+              <w:bottom w:type="dxa" w:w="70"/>
+              <w:right w:type="dxa" w:w="110"/>
+            </w:tcMar>
+            <w:vAlign w:val="top"/>
+          </w:tcPr>
+          <w:p>
+            <w:pPr>
+              <w:spacing w:after="50" w:line="260"/>
+            </w:pPr>
+            <w:r>
+              <w:rPr>
+                <w:rFonts w:ascii="Arial" w:cs="Arial" w:eastAsia="Arial" w:hAnsi="Arial"/>
+                <w:sz w:val="19"/>
+                <w:szCs w:val="19"/>
+              </w:rPr>
+              <w:t xml:space="preserve">Undetected malware and intrusion.</w:t>
             </w:r>
           </w:p>
         </w:tc>
@@ -6028,28 +6402,31 @@
         </w:trPr>
         <w:tc>
           <w:tcPr>
-            <w:tcW w:type="dxa" w:w="700"/>
-            <w:tcBorders>
-              <w:top w:val="single" w:color="BFC7D5" w:sz="4"/>
-              <w:left w:val="single" w:color="BFC7D5" w:sz="4"/>
-              <w:bottom w:val="single" w:color="BFC7D5" w:sz="4"/>
-              <w:right w:val="single" w:color="BFC7D5" w:sz="4"/>
-            </w:tcBorders>
-            <w:tcMar>
-              <w:top w:type="dxa" w:w="70"/>
-              <w:left w:type="dxa" w:w="110"/>
-              <w:bottom w:type="dxa" w:w="70"/>
-              <w:right w:type="dxa" w:w="110"/>
-            </w:tcMar>
-            <w:vAlign w:val="top"/>
-          </w:tcPr>
-          <w:p>
-            <w:pPr>
-              <w:spacing w:after="50" w:line="260"/>
-            </w:pPr>
-            <w:r>
-              <w:rPr>
-                <w:rFonts w:ascii="Arial" w:cs="Arial" w:eastAsia="Arial" w:hAnsi="Arial"/>
+            <w:tcW w:type="dxa" w:w="900"/>
+            <w:tcBorders>
+              <w:top w:val="single" w:color="BFC7D5" w:sz="4"/>
+              <w:left w:val="single" w:color="BFC7D5" w:sz="4"/>
+              <w:bottom w:val="single" w:color="BFC7D5" w:sz="4"/>
+              <w:right w:val="single" w:color="BFC7D5" w:sz="4"/>
+            </w:tcBorders>
+            <w:shd w:fill="FBE5E5" w:color="auto" w:val="clear"/>
+            <w:tcMar>
+              <w:top w:type="dxa" w:w="70"/>
+              <w:left w:type="dxa" w:w="110"/>
+              <w:bottom w:type="dxa" w:w="70"/>
+              <w:right w:type="dxa" w:w="110"/>
+            </w:tcMar>
+            <w:vAlign w:val="top"/>
+          </w:tcPr>
+          <w:p>
+            <w:pPr>
+              <w:spacing w:after="50" w:line="260"/>
+            </w:pPr>
+            <w:r>
+              <w:rPr>
+                <w:rFonts w:ascii="Arial" w:cs="Arial" w:eastAsia="Arial" w:hAnsi="Arial"/>
+                <w:b/>
+                <w:bCs/>
                 <w:sz w:val="19"/>
                 <w:szCs w:val="19"/>
               </w:rPr>
@@ -6059,96 +6436,96 @@
         </w:tc>
         <w:tc>
           <w:tcPr>
-            <w:tcW w:type="dxa" w:w="2150"/>
-            <w:tcBorders>
-              <w:top w:val="single" w:color="BFC7D5" w:sz="4"/>
-              <w:left w:val="single" w:color="BFC7D5" w:sz="4"/>
-              <w:bottom w:val="single" w:color="BFC7D5" w:sz="4"/>
-              <w:right w:val="single" w:color="BFC7D5" w:sz="4"/>
-            </w:tcBorders>
-            <w:tcMar>
-              <w:top w:type="dxa" w:w="70"/>
-              <w:left w:type="dxa" w:w="110"/>
-              <w:bottom w:type="dxa" w:w="70"/>
-              <w:right w:type="dxa" w:w="110"/>
-            </w:tcMar>
-            <w:vAlign w:val="top"/>
-          </w:tcPr>
-          <w:p>
-            <w:pPr>
-              <w:spacing w:after="50" w:line="260"/>
-            </w:pPr>
-            <w:r>
-              <w:rPr>
-                <w:rFonts w:ascii="Arial" w:cs="Arial" w:eastAsia="Arial" w:hAnsi="Arial"/>
-                <w:b/>
-                <w:bCs/>
-                <w:sz w:val="19"/>
-                <w:szCs w:val="19"/>
-              </w:rPr>
-              <w:t xml:space="preserve">Endpoint protection</w:t>
-            </w:r>
-          </w:p>
-        </w:tc>
-        <w:tc>
-          <w:tcPr>
-            <w:tcW w:type="dxa" w:w="3750"/>
-            <w:tcBorders>
-              <w:top w:val="single" w:color="BFC7D5" w:sz="4"/>
-              <w:left w:val="single" w:color="BFC7D5" w:sz="4"/>
-              <w:bottom w:val="single" w:color="BFC7D5" w:sz="4"/>
-              <w:right w:val="single" w:color="BFC7D5" w:sz="4"/>
-            </w:tcBorders>
-            <w:tcMar>
-              <w:top w:type="dxa" w:w="70"/>
-              <w:left w:type="dxa" w:w="110"/>
-              <w:bottom w:type="dxa" w:w="70"/>
-              <w:right w:type="dxa" w:w="110"/>
-            </w:tcMar>
-            <w:vAlign w:val="top"/>
-          </w:tcPr>
-          <w:p>
-            <w:pPr>
-              <w:spacing w:after="50" w:line="260"/>
-            </w:pPr>
-            <w:r>
-              <w:rPr>
-                <w:rFonts w:ascii="Arial" w:cs="Arial" w:eastAsia="Arial" w:hAnsi="Arial"/>
-                <w:sz w:val="19"/>
-                <w:szCs w:val="19"/>
-              </w:rPr>
-              <w:t xml:space="preserve">Deploy EDR or XDR on all endpoints and servers with centralised monitoring and automated containment.</w:t>
-            </w:r>
-          </w:p>
-        </w:tc>
-        <w:tc>
-          <w:tcPr>
-            <w:tcW w:type="dxa" w:w="3306"/>
-            <w:tcBorders>
-              <w:top w:val="single" w:color="BFC7D5" w:sz="4"/>
-              <w:left w:val="single" w:color="BFC7D5" w:sz="4"/>
-              <w:bottom w:val="single" w:color="BFC7D5" w:sz="4"/>
-              <w:right w:val="single" w:color="BFC7D5" w:sz="4"/>
-            </w:tcBorders>
-            <w:tcMar>
-              <w:top w:type="dxa" w:w="70"/>
-              <w:left w:type="dxa" w:w="110"/>
-              <w:bottom w:type="dxa" w:w="70"/>
-              <w:right w:type="dxa" w:w="110"/>
-            </w:tcMar>
-            <w:vAlign w:val="top"/>
-          </w:tcPr>
-          <w:p>
-            <w:pPr>
-              <w:spacing w:after="50" w:line="260"/>
-            </w:pPr>
-            <w:r>
-              <w:rPr>
-                <w:rFonts w:ascii="Arial" w:cs="Arial" w:eastAsia="Arial" w:hAnsi="Arial"/>
-                <w:sz w:val="19"/>
-                <w:szCs w:val="19"/>
-              </w:rPr>
-              <w:t xml:space="preserve">Undetected malware and intrusion.</w:t>
+            <w:tcW w:type="dxa" w:w="2100"/>
+            <w:tcBorders>
+              <w:top w:val="single" w:color="BFC7D5" w:sz="4"/>
+              <w:left w:val="single" w:color="BFC7D5" w:sz="4"/>
+              <w:bottom w:val="single" w:color="BFC7D5" w:sz="4"/>
+              <w:right w:val="single" w:color="BFC7D5" w:sz="4"/>
+            </w:tcBorders>
+            <w:tcMar>
+              <w:top w:type="dxa" w:w="70"/>
+              <w:left w:type="dxa" w:w="110"/>
+              <w:bottom w:type="dxa" w:w="70"/>
+              <w:right w:type="dxa" w:w="110"/>
+            </w:tcMar>
+            <w:vAlign w:val="top"/>
+          </w:tcPr>
+          <w:p>
+            <w:pPr>
+              <w:spacing w:after="50" w:line="260"/>
+            </w:pPr>
+            <w:r>
+              <w:rPr>
+                <w:rFonts w:ascii="Arial" w:cs="Arial" w:eastAsia="Arial" w:hAnsi="Arial"/>
+                <w:b/>
+                <w:bCs/>
+                <w:sz w:val="19"/>
+                <w:szCs w:val="19"/>
+              </w:rPr>
+              <w:t xml:space="preserve">Network security</w:t>
+            </w:r>
+          </w:p>
+        </w:tc>
+        <w:tc>
+          <w:tcPr>
+            <w:tcW w:type="dxa" w:w="4100"/>
+            <w:tcBorders>
+              <w:top w:val="single" w:color="BFC7D5" w:sz="4"/>
+              <w:left w:val="single" w:color="BFC7D5" w:sz="4"/>
+              <w:bottom w:val="single" w:color="BFC7D5" w:sz="4"/>
+              <w:right w:val="single" w:color="BFC7D5" w:sz="4"/>
+            </w:tcBorders>
+            <w:tcMar>
+              <w:top w:type="dxa" w:w="70"/>
+              <w:left w:type="dxa" w:w="110"/>
+              <w:bottom w:type="dxa" w:w="70"/>
+              <w:right w:type="dxa" w:w="110"/>
+            </w:tcMar>
+            <w:vAlign w:val="top"/>
+          </w:tcPr>
+          <w:p>
+            <w:pPr>
+              <w:spacing w:after="50" w:line="260"/>
+            </w:pPr>
+            <w:r>
+              <w:rPr>
+                <w:rFonts w:ascii="Arial" w:cs="Arial" w:eastAsia="Arial" w:hAnsi="Arial"/>
+                <w:sz w:val="19"/>
+                <w:szCs w:val="19"/>
+              </w:rPr>
+              <w:t xml:space="preserve">A next-generation firewall (NGFW) with internal segmentation must be implemented. The CCTV network must be isolated. Only approved ports and services allowed and unnecessary internet access blocked.</w:t>
+            </w:r>
+          </w:p>
+        </w:tc>
+        <w:tc>
+          <w:tcPr>
+            <w:tcW w:type="dxa" w:w="2806"/>
+            <w:tcBorders>
+              <w:top w:val="single" w:color="BFC7D5" w:sz="4"/>
+              <w:left w:val="single" w:color="BFC7D5" w:sz="4"/>
+              <w:bottom w:val="single" w:color="BFC7D5" w:sz="4"/>
+              <w:right w:val="single" w:color="BFC7D5" w:sz="4"/>
+            </w:tcBorders>
+            <w:tcMar>
+              <w:top w:type="dxa" w:w="70"/>
+              <w:left w:type="dxa" w:w="110"/>
+              <w:bottom w:type="dxa" w:w="70"/>
+              <w:right w:type="dxa" w:w="110"/>
+            </w:tcMar>
+            <w:vAlign w:val="top"/>
+          </w:tcPr>
+          <w:p>
+            <w:pPr>
+              <w:spacing w:after="50" w:line="260"/>
+            </w:pPr>
+            <w:r>
+              <w:rPr>
+                <w:rFonts w:ascii="Arial" w:cs="Arial" w:eastAsia="Arial" w:hAnsi="Arial"/>
+                <w:sz w:val="19"/>
+                <w:szCs w:val="19"/>
+              </w:rPr>
+              <w:t xml:space="preserve">Lateral movement and data exfiltration.</w:t>
             </w:r>
           </w:p>
         </w:tc>
@@ -6159,28 +6536,31 @@
         </w:trPr>
         <w:tc>
           <w:tcPr>
-            <w:tcW w:type="dxa" w:w="700"/>
-            <w:tcBorders>
-              <w:top w:val="single" w:color="BFC7D5" w:sz="4"/>
-              <w:left w:val="single" w:color="BFC7D5" w:sz="4"/>
-              <w:bottom w:val="single" w:color="BFC7D5" w:sz="4"/>
-              <w:right w:val="single" w:color="BFC7D5" w:sz="4"/>
-            </w:tcBorders>
-            <w:tcMar>
-              <w:top w:type="dxa" w:w="70"/>
-              <w:left w:type="dxa" w:w="110"/>
-              <w:bottom w:type="dxa" w:w="70"/>
-              <w:right w:type="dxa" w:w="110"/>
-            </w:tcMar>
-            <w:vAlign w:val="top"/>
-          </w:tcPr>
-          <w:p>
-            <w:pPr>
-              <w:spacing w:after="50" w:line="260"/>
-            </w:pPr>
-            <w:r>
-              <w:rPr>
-                <w:rFonts w:ascii="Arial" w:cs="Arial" w:eastAsia="Arial" w:hAnsi="Arial"/>
+            <w:tcW w:type="dxa" w:w="900"/>
+            <w:tcBorders>
+              <w:top w:val="single" w:color="BFC7D5" w:sz="4"/>
+              <w:left w:val="single" w:color="BFC7D5" w:sz="4"/>
+              <w:bottom w:val="single" w:color="BFC7D5" w:sz="4"/>
+              <w:right w:val="single" w:color="BFC7D5" w:sz="4"/>
+            </w:tcBorders>
+            <w:shd w:fill="FDEBDD" w:color="auto" w:val="clear"/>
+            <w:tcMar>
+              <w:top w:type="dxa" w:w="70"/>
+              <w:left w:type="dxa" w:w="110"/>
+              <w:bottom w:type="dxa" w:w="70"/>
+              <w:right w:type="dxa" w:w="110"/>
+            </w:tcMar>
+            <w:vAlign w:val="top"/>
+          </w:tcPr>
+          <w:p>
+            <w:pPr>
+              <w:spacing w:after="50" w:line="260"/>
+            </w:pPr>
+            <w:r>
+              <w:rPr>
+                <w:rFonts w:ascii="Arial" w:cs="Arial" w:eastAsia="Arial" w:hAnsi="Arial"/>
+                <w:b/>
+                <w:bCs/>
                 <w:sz w:val="19"/>
                 <w:szCs w:val="19"/>
               </w:rPr>
@@ -6190,96 +6570,96 @@
         </w:tc>
         <w:tc>
           <w:tcPr>
-            <w:tcW w:type="dxa" w:w="2150"/>
-            <w:tcBorders>
-              <w:top w:val="single" w:color="BFC7D5" w:sz="4"/>
-              <w:left w:val="single" w:color="BFC7D5" w:sz="4"/>
-              <w:bottom w:val="single" w:color="BFC7D5" w:sz="4"/>
-              <w:right w:val="single" w:color="BFC7D5" w:sz="4"/>
-            </w:tcBorders>
-            <w:tcMar>
-              <w:top w:type="dxa" w:w="70"/>
-              <w:left w:type="dxa" w:w="110"/>
-              <w:bottom w:type="dxa" w:w="70"/>
-              <w:right w:type="dxa" w:w="110"/>
-            </w:tcMar>
-            <w:vAlign w:val="top"/>
-          </w:tcPr>
-          <w:p>
-            <w:pPr>
-              <w:spacing w:after="50" w:line="260"/>
-            </w:pPr>
-            <w:r>
-              <w:rPr>
-                <w:rFonts w:ascii="Arial" w:cs="Arial" w:eastAsia="Arial" w:hAnsi="Arial"/>
-                <w:b/>
-                <w:bCs/>
-                <w:sz w:val="19"/>
-                <w:szCs w:val="19"/>
-              </w:rPr>
-              <w:t xml:space="preserve">Network security</w:t>
-            </w:r>
-          </w:p>
-        </w:tc>
-        <w:tc>
-          <w:tcPr>
-            <w:tcW w:type="dxa" w:w="3750"/>
-            <w:tcBorders>
-              <w:top w:val="single" w:color="BFC7D5" w:sz="4"/>
-              <w:left w:val="single" w:color="BFC7D5" w:sz="4"/>
-              <w:bottom w:val="single" w:color="BFC7D5" w:sz="4"/>
-              <w:right w:val="single" w:color="BFC7D5" w:sz="4"/>
-            </w:tcBorders>
-            <w:tcMar>
-              <w:top w:type="dxa" w:w="70"/>
-              <w:left w:type="dxa" w:w="110"/>
-              <w:bottom w:type="dxa" w:w="70"/>
-              <w:right w:type="dxa" w:w="110"/>
-            </w:tcMar>
-            <w:vAlign w:val="top"/>
-          </w:tcPr>
-          <w:p>
-            <w:pPr>
-              <w:spacing w:after="50" w:line="260"/>
-            </w:pPr>
-            <w:r>
-              <w:rPr>
-                <w:rFonts w:ascii="Arial" w:cs="Arial" w:eastAsia="Arial" w:hAnsi="Arial"/>
-                <w:sz w:val="19"/>
-                <w:szCs w:val="19"/>
-              </w:rPr>
-              <w:t xml:space="preserve">Implement a next-generation firewall with internal segmentation. Isolate the CCTV network and allow only approved ports and services. Block unnecessary internet access.</w:t>
-            </w:r>
-          </w:p>
-        </w:tc>
-        <w:tc>
-          <w:tcPr>
-            <w:tcW w:type="dxa" w:w="3306"/>
-            <w:tcBorders>
-              <w:top w:val="single" w:color="BFC7D5" w:sz="4"/>
-              <w:left w:val="single" w:color="BFC7D5" w:sz="4"/>
-              <w:bottom w:val="single" w:color="BFC7D5" w:sz="4"/>
-              <w:right w:val="single" w:color="BFC7D5" w:sz="4"/>
-            </w:tcBorders>
-            <w:tcMar>
-              <w:top w:type="dxa" w:w="70"/>
-              <w:left w:type="dxa" w:w="110"/>
-              <w:bottom w:type="dxa" w:w="70"/>
-              <w:right w:type="dxa" w:w="110"/>
-            </w:tcMar>
-            <w:vAlign w:val="top"/>
-          </w:tcPr>
-          <w:p>
-            <w:pPr>
-              <w:spacing w:after="50" w:line="260"/>
-            </w:pPr>
-            <w:r>
-              <w:rPr>
-                <w:rFonts w:ascii="Arial" w:cs="Arial" w:eastAsia="Arial" w:hAnsi="Arial"/>
-                <w:sz w:val="19"/>
-                <w:szCs w:val="19"/>
-              </w:rPr>
-              <w:t xml:space="preserve">Lateral movement and data exfiltration.</w:t>
+            <w:tcW w:type="dxa" w:w="2100"/>
+            <w:tcBorders>
+              <w:top w:val="single" w:color="BFC7D5" w:sz="4"/>
+              <w:left w:val="single" w:color="BFC7D5" w:sz="4"/>
+              <w:bottom w:val="single" w:color="BFC7D5" w:sz="4"/>
+              <w:right w:val="single" w:color="BFC7D5" w:sz="4"/>
+            </w:tcBorders>
+            <w:tcMar>
+              <w:top w:type="dxa" w:w="70"/>
+              <w:left w:type="dxa" w:w="110"/>
+              <w:bottom w:type="dxa" w:w="70"/>
+              <w:right w:type="dxa" w:w="110"/>
+            </w:tcMar>
+            <w:vAlign w:val="top"/>
+          </w:tcPr>
+          <w:p>
+            <w:pPr>
+              <w:spacing w:after="50" w:line="260"/>
+            </w:pPr>
+            <w:r>
+              <w:rPr>
+                <w:rFonts w:ascii="Arial" w:cs="Arial" w:eastAsia="Arial" w:hAnsi="Arial"/>
+                <w:b/>
+                <w:bCs/>
+                <w:sz w:val="19"/>
+                <w:szCs w:val="19"/>
+              </w:rPr>
+              <w:t xml:space="preserve">Vulnerability remediation</w:t>
+            </w:r>
+          </w:p>
+        </w:tc>
+        <w:tc>
+          <w:tcPr>
+            <w:tcW w:type="dxa" w:w="4100"/>
+            <w:tcBorders>
+              <w:top w:val="single" w:color="BFC7D5" w:sz="4"/>
+              <w:left w:val="single" w:color="BFC7D5" w:sz="4"/>
+              <w:bottom w:val="single" w:color="BFC7D5" w:sz="4"/>
+              <w:right w:val="single" w:color="BFC7D5" w:sz="4"/>
+            </w:tcBorders>
+            <w:tcMar>
+              <w:top w:type="dxa" w:w="70"/>
+              <w:left w:type="dxa" w:w="110"/>
+              <w:bottom w:type="dxa" w:w="70"/>
+              <w:right w:type="dxa" w:w="110"/>
+            </w:tcMar>
+            <w:vAlign w:val="top"/>
+          </w:tcPr>
+          <w:p>
+            <w:pPr>
+              <w:spacing w:after="50" w:line="260"/>
+            </w:pPr>
+            <w:r>
+              <w:rPr>
+                <w:rFonts w:ascii="Arial" w:cs="Arial" w:eastAsia="Arial" w:hAnsi="Arial"/>
+                <w:sz w:val="19"/>
+                <w:szCs w:val="19"/>
+              </w:rPr>
+              <w:t xml:space="preserve">Critical and High risk vulnerabilities must be remediated immediately. Medium and Low risk vulnerabilities must be closed within a defined timeline.</w:t>
+            </w:r>
+          </w:p>
+        </w:tc>
+        <w:tc>
+          <w:tcPr>
+            <w:tcW w:type="dxa" w:w="2806"/>
+            <w:tcBorders>
+              <w:top w:val="single" w:color="BFC7D5" w:sz="4"/>
+              <w:left w:val="single" w:color="BFC7D5" w:sz="4"/>
+              <w:bottom w:val="single" w:color="BFC7D5" w:sz="4"/>
+              <w:right w:val="single" w:color="BFC7D5" w:sz="4"/>
+            </w:tcBorders>
+            <w:tcMar>
+              <w:top w:type="dxa" w:w="70"/>
+              <w:left w:type="dxa" w:w="110"/>
+              <w:bottom w:type="dxa" w:w="70"/>
+              <w:right w:type="dxa" w:w="110"/>
+            </w:tcMar>
+            <w:vAlign w:val="top"/>
+          </w:tcPr>
+          <w:p>
+            <w:pPr>
+              <w:spacing w:after="50" w:line="260"/>
+            </w:pPr>
+            <w:r>
+              <w:rPr>
+                <w:rFonts w:ascii="Arial" w:cs="Arial" w:eastAsia="Arial" w:hAnsi="Arial"/>
+                <w:sz w:val="19"/>
+                <w:szCs w:val="19"/>
+              </w:rPr>
+              <w:t xml:space="preserve">The 600 Critical and High findings.</w:t>
             </w:r>
           </w:p>
         </w:tc>
@@ -6290,28 +6670,31 @@
         </w:trPr>
         <w:tc>
           <w:tcPr>
-            <w:tcW w:type="dxa" w:w="700"/>
-            <w:tcBorders>
-              <w:top w:val="single" w:color="BFC7D5" w:sz="4"/>
-              <w:left w:val="single" w:color="BFC7D5" w:sz="4"/>
-              <w:bottom w:val="single" w:color="BFC7D5" w:sz="4"/>
-              <w:right w:val="single" w:color="BFC7D5" w:sz="4"/>
-            </w:tcBorders>
-            <w:tcMar>
-              <w:top w:type="dxa" w:w="70"/>
-              <w:left w:type="dxa" w:w="110"/>
-              <w:bottom w:type="dxa" w:w="70"/>
-              <w:right w:type="dxa" w:w="110"/>
-            </w:tcMar>
-            <w:vAlign w:val="top"/>
-          </w:tcPr>
-          <w:p>
-            <w:pPr>
-              <w:spacing w:after="50" w:line="260"/>
-            </w:pPr>
-            <w:r>
-              <w:rPr>
-                <w:rFonts w:ascii="Arial" w:cs="Arial" w:eastAsia="Arial" w:hAnsi="Arial"/>
+            <w:tcW w:type="dxa" w:w="900"/>
+            <w:tcBorders>
+              <w:top w:val="single" w:color="BFC7D5" w:sz="4"/>
+              <w:left w:val="single" w:color="BFC7D5" w:sz="4"/>
+              <w:bottom w:val="single" w:color="BFC7D5" w:sz="4"/>
+              <w:right w:val="single" w:color="BFC7D5" w:sz="4"/>
+            </w:tcBorders>
+            <w:shd w:fill="FDEBDD" w:color="auto" w:val="clear"/>
+            <w:tcMar>
+              <w:top w:type="dxa" w:w="70"/>
+              <w:left w:type="dxa" w:w="110"/>
+              <w:bottom w:type="dxa" w:w="70"/>
+              <w:right w:type="dxa" w:w="110"/>
+            </w:tcMar>
+            <w:vAlign w:val="top"/>
+          </w:tcPr>
+          <w:p>
+            <w:pPr>
+              <w:spacing w:after="50" w:line="260"/>
+            </w:pPr>
+            <w:r>
+              <w:rPr>
+                <w:rFonts w:ascii="Arial" w:cs="Arial" w:eastAsia="Arial" w:hAnsi="Arial"/>
+                <w:b/>
+                <w:bCs/>
                 <w:sz w:val="19"/>
                 <w:szCs w:val="19"/>
               </w:rPr>
@@ -6321,7 +6704,7 @@
         </w:tc>
         <w:tc>
           <w:tcPr>
-            <w:tcW w:type="dxa" w:w="2150"/>
+            <w:tcW w:type="dxa" w:w="2100"/>
             <w:tcBorders>
               <w:top w:val="single" w:color="BFC7D5" w:sz="4"/>
               <w:left w:val="single" w:color="BFC7D5" w:sz="4"/>
@@ -6354,38 +6737,38 @@
         </w:tc>
         <w:tc>
           <w:tcPr>
-            <w:tcW w:type="dxa" w:w="3750"/>
-            <w:tcBorders>
-              <w:top w:val="single" w:color="BFC7D5" w:sz="4"/>
-              <w:left w:val="single" w:color="BFC7D5" w:sz="4"/>
-              <w:bottom w:val="single" w:color="BFC7D5" w:sz="4"/>
-              <w:right w:val="single" w:color="BFC7D5" w:sz="4"/>
-            </w:tcBorders>
-            <w:tcMar>
-              <w:top w:type="dxa" w:w="70"/>
-              <w:left w:type="dxa" w:w="110"/>
-              <w:bottom w:type="dxa" w:w="70"/>
-              <w:right w:type="dxa" w:w="110"/>
-            </w:tcMar>
-            <w:vAlign w:val="top"/>
-          </w:tcPr>
-          <w:p>
-            <w:pPr>
-              <w:spacing w:after="50" w:line="260"/>
-            </w:pPr>
-            <w:r>
-              <w:rPr>
-                <w:rFonts w:ascii="Arial" w:cs="Arial" w:eastAsia="Arial" w:hAnsi="Arial"/>
-                <w:sz w:val="19"/>
-                <w:szCs w:val="19"/>
-              </w:rPr>
-              <w:t xml:space="preserve">Assign IP addresses centrally by DHCP reservation with IP and MAC binding. Standardise hostnames and labels and the asset inventory.</w:t>
-            </w:r>
-          </w:p>
-        </w:tc>
-        <w:tc>
-          <w:tcPr>
-            <w:tcW w:type="dxa" w:w="3306"/>
+            <w:tcW w:type="dxa" w:w="4100"/>
+            <w:tcBorders>
+              <w:top w:val="single" w:color="BFC7D5" w:sz="4"/>
+              <w:left w:val="single" w:color="BFC7D5" w:sz="4"/>
+              <w:bottom w:val="single" w:color="BFC7D5" w:sz="4"/>
+              <w:right w:val="single" w:color="BFC7D5" w:sz="4"/>
+            </w:tcBorders>
+            <w:tcMar>
+              <w:top w:type="dxa" w:w="70"/>
+              <w:left w:type="dxa" w:w="110"/>
+              <w:bottom w:type="dxa" w:w="70"/>
+              <w:right w:type="dxa" w:w="110"/>
+            </w:tcMar>
+            <w:vAlign w:val="top"/>
+          </w:tcPr>
+          <w:p>
+            <w:pPr>
+              <w:spacing w:after="50" w:line="260"/>
+            </w:pPr>
+            <w:r>
+              <w:rPr>
+                <w:rFonts w:ascii="Arial" w:cs="Arial" w:eastAsia="Arial" w:hAnsi="Arial"/>
+                <w:sz w:val="19"/>
+                <w:szCs w:val="19"/>
+              </w:rPr>
+              <w:t xml:space="preserve">IP addresses must be assigned centrally via DHCP reservation with IP-MAC binding. Hostnames and labels and the asset inventory must be standardised.</w:t>
+            </w:r>
+          </w:p>
+        </w:tc>
+        <w:tc>
+          <w:tcPr>
+            <w:tcW w:type="dxa" w:w="2806"/>
             <w:tcBorders>
               <w:top w:val="single" w:color="BFC7D5" w:sz="4"/>
               <w:left w:val="single" w:color="BFC7D5" w:sz="4"/>
@@ -6421,28 +6804,31 @@
         </w:trPr>
         <w:tc>
           <w:tcPr>
-            <w:tcW w:type="dxa" w:w="700"/>
-            <w:tcBorders>
-              <w:top w:val="single" w:color="BFC7D5" w:sz="4"/>
-              <w:left w:val="single" w:color="BFC7D5" w:sz="4"/>
-              <w:bottom w:val="single" w:color="BFC7D5" w:sz="4"/>
-              <w:right w:val="single" w:color="BFC7D5" w:sz="4"/>
-            </w:tcBorders>
-            <w:tcMar>
-              <w:top w:type="dxa" w:w="70"/>
-              <w:left w:type="dxa" w:w="110"/>
-              <w:bottom w:type="dxa" w:w="70"/>
-              <w:right w:type="dxa" w:w="110"/>
-            </w:tcMar>
-            <w:vAlign w:val="top"/>
-          </w:tcPr>
-          <w:p>
-            <w:pPr>
-              <w:spacing w:after="50" w:line="260"/>
-            </w:pPr>
-            <w:r>
-              <w:rPr>
-                <w:rFonts w:ascii="Arial" w:cs="Arial" w:eastAsia="Arial" w:hAnsi="Arial"/>
+            <w:tcW w:type="dxa" w:w="900"/>
+            <w:tcBorders>
+              <w:top w:val="single" w:color="BFC7D5" w:sz="4"/>
+              <w:left w:val="single" w:color="BFC7D5" w:sz="4"/>
+              <w:bottom w:val="single" w:color="BFC7D5" w:sz="4"/>
+              <w:right w:val="single" w:color="BFC7D5" w:sz="4"/>
+            </w:tcBorders>
+            <w:shd w:fill="FFF4CC" w:color="auto" w:val="clear"/>
+            <w:tcMar>
+              <w:top w:type="dxa" w:w="70"/>
+              <w:left w:type="dxa" w:w="110"/>
+              <w:bottom w:type="dxa" w:w="70"/>
+              <w:right w:type="dxa" w:w="110"/>
+            </w:tcMar>
+            <w:vAlign w:val="top"/>
+          </w:tcPr>
+          <w:p>
+            <w:pPr>
+              <w:spacing w:after="50" w:line="260"/>
+            </w:pPr>
+            <w:r>
+              <w:rPr>
+                <w:rFonts w:ascii="Arial" w:cs="Arial" w:eastAsia="Arial" w:hAnsi="Arial"/>
+                <w:b/>
+                <w:bCs/>
                 <w:sz w:val="19"/>
                 <w:szCs w:val="19"/>
               </w:rPr>
@@ -6452,7 +6838,7 @@
         </w:tc>
         <w:tc>
           <w:tcPr>
-            <w:tcW w:type="dxa" w:w="2150"/>
+            <w:tcW w:type="dxa" w:w="2100"/>
             <w:tcBorders>
               <w:top w:val="single" w:color="BFC7D5" w:sz="4"/>
               <w:left w:val="single" w:color="BFC7D5" w:sz="4"/>
@@ -6485,38 +6871,38 @@
         </w:tc>
         <w:tc>
           <w:tcPr>
-            <w:tcW w:type="dxa" w:w="3750"/>
-            <w:tcBorders>
-              <w:top w:val="single" w:color="BFC7D5" w:sz="4"/>
-              <w:left w:val="single" w:color="BFC7D5" w:sz="4"/>
-              <w:bottom w:val="single" w:color="BFC7D5" w:sz="4"/>
-              <w:right w:val="single" w:color="BFC7D5" w:sz="4"/>
-            </w:tcBorders>
-            <w:tcMar>
-              <w:top w:type="dxa" w:w="70"/>
-              <w:left w:type="dxa" w:w="110"/>
-              <w:bottom w:type="dxa" w:w="70"/>
-              <w:right w:type="dxa" w:w="110"/>
-            </w:tcMar>
-            <w:vAlign w:val="top"/>
-          </w:tcPr>
-          <w:p>
-            <w:pPr>
-              <w:spacing w:after="50" w:line="260"/>
-            </w:pPr>
-            <w:r>
-              <w:rPr>
-                <w:rFonts w:ascii="Arial" w:cs="Arial" w:eastAsia="Arial" w:hAnsi="Arial"/>
-                <w:sz w:val="19"/>
-                <w:szCs w:val="19"/>
-              </w:rPr>
-              <w:t xml:space="preserve">Enforce Active Directory with Group Policy to prevent users changing network settings.</w:t>
-            </w:r>
-          </w:p>
-        </w:tc>
-        <w:tc>
-          <w:tcPr>
-            <w:tcW w:type="dxa" w:w="3306"/>
+            <w:tcW w:type="dxa" w:w="4100"/>
+            <w:tcBorders>
+              <w:top w:val="single" w:color="BFC7D5" w:sz="4"/>
+              <w:left w:val="single" w:color="BFC7D5" w:sz="4"/>
+              <w:bottom w:val="single" w:color="BFC7D5" w:sz="4"/>
+              <w:right w:val="single" w:color="BFC7D5" w:sz="4"/>
+            </w:tcBorders>
+            <w:tcMar>
+              <w:top w:type="dxa" w:w="70"/>
+              <w:left w:type="dxa" w:w="110"/>
+              <w:bottom w:type="dxa" w:w="70"/>
+              <w:right w:type="dxa" w:w="110"/>
+            </w:tcMar>
+            <w:vAlign w:val="top"/>
+          </w:tcPr>
+          <w:p>
+            <w:pPr>
+              <w:spacing w:after="50" w:line="260"/>
+            </w:pPr>
+            <w:r>
+              <w:rPr>
+                <w:rFonts w:ascii="Arial" w:cs="Arial" w:eastAsia="Arial" w:hAnsi="Arial"/>
+                <w:sz w:val="19"/>
+                <w:szCs w:val="19"/>
+              </w:rPr>
+              <w:t xml:space="preserve">Active Directory with Group Policy must be enforced to prevent users from changing network settings.</w:t>
+            </w:r>
+          </w:p>
+        </w:tc>
+        <w:tc>
+          <w:tcPr>
+            <w:tcW w:type="dxa" w:w="2806"/>
             <w:tcBorders>
               <w:top w:val="single" w:color="BFC7D5" w:sz="4"/>
               <w:left w:val="single" w:color="BFC7D5" w:sz="4"/>
@@ -6552,28 +6938,31 @@
         </w:trPr>
         <w:tc>
           <w:tcPr>
-            <w:tcW w:type="dxa" w:w="700"/>
-            <w:tcBorders>
-              <w:top w:val="single" w:color="BFC7D5" w:sz="4"/>
-              <w:left w:val="single" w:color="BFC7D5" w:sz="4"/>
-              <w:bottom w:val="single" w:color="BFC7D5" w:sz="4"/>
-              <w:right w:val="single" w:color="BFC7D5" w:sz="4"/>
-            </w:tcBorders>
-            <w:tcMar>
-              <w:top w:type="dxa" w:w="70"/>
-              <w:left w:type="dxa" w:w="110"/>
-              <w:bottom w:type="dxa" w:w="70"/>
-              <w:right w:type="dxa" w:w="110"/>
-            </w:tcMar>
-            <w:vAlign w:val="top"/>
-          </w:tcPr>
-          <w:p>
-            <w:pPr>
-              <w:spacing w:after="50" w:line="260"/>
-            </w:pPr>
-            <w:r>
-              <w:rPr>
-                <w:rFonts w:ascii="Arial" w:cs="Arial" w:eastAsia="Arial" w:hAnsi="Arial"/>
+            <w:tcW w:type="dxa" w:w="900"/>
+            <w:tcBorders>
+              <w:top w:val="single" w:color="BFC7D5" w:sz="4"/>
+              <w:left w:val="single" w:color="BFC7D5" w:sz="4"/>
+              <w:bottom w:val="single" w:color="BFC7D5" w:sz="4"/>
+              <w:right w:val="single" w:color="BFC7D5" w:sz="4"/>
+            </w:tcBorders>
+            <w:shd w:fill="E5F3E6" w:color="auto" w:val="clear"/>
+            <w:tcMar>
+              <w:top w:type="dxa" w:w="70"/>
+              <w:left w:type="dxa" w:w="110"/>
+              <w:bottom w:type="dxa" w:w="70"/>
+              <w:right w:type="dxa" w:w="110"/>
+            </w:tcMar>
+            <w:vAlign w:val="top"/>
+          </w:tcPr>
+          <w:p>
+            <w:pPr>
+              <w:spacing w:after="50" w:line="260"/>
+            </w:pPr>
+            <w:r>
+              <w:rPr>
+                <w:rFonts w:ascii="Arial" w:cs="Arial" w:eastAsia="Arial" w:hAnsi="Arial"/>
+                <w:b/>
+                <w:bCs/>
                 <w:sz w:val="19"/>
                 <w:szCs w:val="19"/>
               </w:rPr>
@@ -6583,7 +6972,7 @@
         </w:tc>
         <w:tc>
           <w:tcPr>
-            <w:tcW w:type="dxa" w:w="2150"/>
+            <w:tcW w:type="dxa" w:w="2100"/>
             <w:tcBorders>
               <w:top w:val="single" w:color="BFC7D5" w:sz="4"/>
               <w:left w:val="single" w:color="BFC7D5" w:sz="4"/>
@@ -6616,38 +7005,38 @@
         </w:tc>
         <w:tc>
           <w:tcPr>
-            <w:tcW w:type="dxa" w:w="3750"/>
-            <w:tcBorders>
-              <w:top w:val="single" w:color="BFC7D5" w:sz="4"/>
-              <w:left w:val="single" w:color="BFC7D5" w:sz="4"/>
-              <w:bottom w:val="single" w:color="BFC7D5" w:sz="4"/>
-              <w:right w:val="single" w:color="BFC7D5" w:sz="4"/>
-            </w:tcBorders>
-            <w:tcMar>
-              <w:top w:type="dxa" w:w="70"/>
-              <w:left w:type="dxa" w:w="110"/>
-              <w:bottom w:type="dxa" w:w="70"/>
-              <w:right w:type="dxa" w:w="110"/>
-            </w:tcMar>
-            <w:vAlign w:val="top"/>
-          </w:tcPr>
-          <w:p>
-            <w:pPr>
-              <w:spacing w:after="50" w:line="260"/>
-            </w:pPr>
-            <w:r>
-              <w:rPr>
-                <w:rFonts w:ascii="Arial" w:cs="Arial" w:eastAsia="Arial" w:hAnsi="Arial"/>
-                <w:sz w:val="19"/>
-                <w:szCs w:val="19"/>
-              </w:rPr>
-              <w:t xml:space="preserve">Conduct periodic vulnerability scanning. Revalidate after remediation. Reassess after any significant change.</w:t>
-            </w:r>
-          </w:p>
-        </w:tc>
-        <w:tc>
-          <w:tcPr>
-            <w:tcW w:type="dxa" w:w="3306"/>
+            <w:tcW w:type="dxa" w:w="4100"/>
+            <w:tcBorders>
+              <w:top w:val="single" w:color="BFC7D5" w:sz="4"/>
+              <w:left w:val="single" w:color="BFC7D5" w:sz="4"/>
+              <w:bottom w:val="single" w:color="BFC7D5" w:sz="4"/>
+              <w:right w:val="single" w:color="BFC7D5" w:sz="4"/>
+            </w:tcBorders>
+            <w:tcMar>
+              <w:top w:type="dxa" w:w="70"/>
+              <w:left w:type="dxa" w:w="110"/>
+              <w:bottom w:type="dxa" w:w="70"/>
+              <w:right w:type="dxa" w:w="110"/>
+            </w:tcMar>
+            <w:vAlign w:val="top"/>
+          </w:tcPr>
+          <w:p>
+            <w:pPr>
+              <w:spacing w:after="50" w:line="260"/>
+            </w:pPr>
+            <w:r>
+              <w:rPr>
+                <w:rFonts w:ascii="Arial" w:cs="Arial" w:eastAsia="Arial" w:hAnsi="Arial"/>
+                <w:sz w:val="19"/>
+                <w:szCs w:val="19"/>
+              </w:rPr>
+              <w:t xml:space="preserve">Periodic vulnerability scanning must be conducted with revalidation after remediation and a fresh assessment after any significant change.</w:t>
+            </w:r>
+          </w:p>
+        </w:tc>
+        <w:tc>
+          <w:tcPr>
+            <w:tcW w:type="dxa" w:w="2806"/>
             <w:tcBorders>
               <w:top w:val="single" w:color="BFC7D5" w:sz="4"/>
               <w:left w:val="single" w:color="BFC7D5" w:sz="4"/>
@@ -6872,7 +7261,7 @@
                 <w:sz w:val="19"/>
                 <w:szCs w:val="19"/>
               </w:rPr>
-              <w:t xml:space="preserve">Contain and build controls</w:t>
+              <w:t xml:space="preserve">Priority actions</w:t>
             </w:r>
           </w:p>
         </w:tc>
@@ -6903,7 +7292,7 @@
                 <w:sz w:val="19"/>
                 <w:szCs w:val="19"/>
               </w:rPr>
-              <w:t xml:space="preserve">Investigate the 2 hosts flagged as possibly compromised. Patch or isolate hosts exposed to EternalBlue and BlueKeep. Disable SMBv1 and Telnet. Remediate the 4 Critical CCTV findings. Deploy EDR or XDR. Install a next-generation firewall with internal segmentation. Move CCTV to its own network. Implement central IP addressing with IP and MAC binding. Enforce Active Directory with Group Policy.</w:t>
+              <w:t xml:space="preserve">First: deploy EDR or XDR on all endpoints and servers. Install the next-generation firewall with internal segmentation. Then: isolate the CCTV network. Block unnecessary internet access. Implement central IP addressing with IP-MAC binding. Enforce Active Directory with Group Policy. Investigate the 2 hosts flagged as possibly compromised. Patch or isolate hosts exposed to EternalBlue and BlueKeep. Disable SMBv1 and Telnet. Remediate the 4 Critical CCTV findings.</w:t>
             </w:r>
           </w:p>
         </w:tc>
@@ -6934,7 +7323,7 @@
                 <w:sz w:val="19"/>
                 <w:szCs w:val="19"/>
               </w:rPr>
-              <w:t xml:space="preserve">Highest-risk exposures closed. Attacks detected and contained.</w:t>
+              <w:t xml:space="preserve">Attacks detected and contained. Network segmented. Highest-risk exposures closed.</w:t>
             </w:r>
           </w:p>
         </w:tc>
@@ -7131,7 +7520,7 @@
                 <w:sz w:val="19"/>
                 <w:szCs w:val="19"/>
               </w:rPr>
-              <w:t xml:space="preserve">Reissue weak certificates. Standardise hostnames and labels and the asset inventory. Begin scheduled scanning. Close Medium and Low findings. Revalidation.</w:t>
+              <w:t xml:space="preserve">Reissue weak certificates. Standardise hostnames and labels and the asset inventory. Begin periodic scanning. Close Medium and Low findings. Revalidation.</w:t>
             </w:r>
           </w:p>
         </w:tc>
@@ -7186,7 +7575,7 @@
           <w:sz w:val="30"/>
           <w:szCs w:val="30"/>
         </w:rPr>
-        <w:t xml:space="preserve">7. Conclusion</w:t>
+        <w:t xml:space="preserve">8. Conclusion</w:t>
       </w:r>
     </w:p>
     <w:p>
@@ -7199,7 +7588,20 @@
           <w:sz w:val="21"/>
           <w:szCs w:val="21"/>
         </w:rPr>
-        <w:t xml:space="preserve">Serious security gaps exist across the internal network and CCTV infrastructure. Critical and High vulnerabilities expose the organisation to compromise and must be addressed immediately. The certificate remains valid until revalidation or any change to the in-scope infrastructure whichever is earlier. Successful remediation should be confirmed through revalidation.</w:t>
+        <w:t xml:space="preserve">Serious security gaps were identified across the internal network and CCTV infrastructure. Remediation is pending as on the date of issue. Critical and High risk vulnerabilities expose the organisation to compromise and must be addressed immediately.</w:t>
+      </w:r>
+    </w:p>
+    <w:p>
+      <w:pPr>
+        <w:spacing w:after="120" w:line="276"/>
+      </w:pPr>
+      <w:r>
+        <w:rPr>
+          <w:rFonts w:ascii="Arial" w:cs="Arial" w:eastAsia="Arial" w:hAnsi="Arial"/>
+          <w:sz w:val="21"/>
+          <w:szCs w:val="21"/>
+        </w:rPr>
+        <w:t xml:space="preserve">The certificate is valid until revalidation or any change to the in-scope infrastructure whichever is earlier. Scope and methodology and results and limitations are detailed in the respective assessment reports.</w:t>
       </w:r>
     </w:p>
     <w:sectPr>
@@ -7438,6 +7840,12 @@
       <w:startOverride w:val="1"/>
     </w:lvlOverride>
   </w:num>
+  <w:num w:numId="2">
+    <w:abstractNumId w:val="2"/>
+    <w:lvlOverride w:ilvl="0">
+      <w:startOverride w:val="1"/>
+    </w:lvlOverride>
+  </w:num>
 </w:numbering>
 </file>
 

</xml_diff>

<commit_message>
Rewrite summary in plain language with stronger impact and risk
Co-Authored-By: Claude Sonnet 5.5 <noreply@anthropic.com>
Claude-Session: https://claude.ai/code/session_01LugvseKmF2BjFkEv28Djej
</commit_message>
<xml_diff>
--- a/Anjali_Labtech_Executive_Summary.docx
+++ b/Anjali_Labtech_Executive_Summary.docx
@@ -745,7 +745,7 @@
           <w:sz w:val="21"/>
           <w:szCs w:val="21"/>
         </w:rPr>
-        <w:t xml:space="preserve">Selkey Cyber Security Pvt. Ltd. assessed the internal network and CCTV infrastructure of Anjali Labtech Limited. The assessment identified </w:t>
+        <w:t xml:space="preserve">Selkey Cyber Security Pvt. Ltd. carried out a security check of the office network and CCTV system of Anjali Labtech Limited. We acted like a determined intruder to find the weak spots before a real criminal does. We found </w:t>
       </w:r>
       <w:r>
         <w:rPr>
@@ -755,7 +755,7 @@
           <w:sz w:val="21"/>
           <w:szCs w:val="21"/>
         </w:rPr>
-        <w:t xml:space="preserve">752 vulnerabilities</w:t>
+        <w:t xml:space="preserve">752 weaknesses</w:t>
       </w:r>
       <w:r>
         <w:rPr>
@@ -763,7 +763,7 @@
           <w:sz w:val="21"/>
           <w:szCs w:val="21"/>
         </w:rPr>
-        <w:t xml:space="preserve"> of which </w:t>
+        <w:t xml:space="preserve">. </w:t>
       </w:r>
       <w:r>
         <w:rPr>
@@ -773,7 +773,7 @@
           <w:sz w:val="21"/>
           <w:szCs w:val="21"/>
         </w:rPr>
-        <w:t xml:space="preserve">116 are Critical and 484 are High</w:t>
+        <w:t xml:space="preserve">600 of them are rated Critical or High</w:t>
       </w:r>
       <w:r>
         <w:rPr>
@@ -781,7 +781,54 @@
           <w:sz w:val="21"/>
           <w:szCs w:val="21"/>
         </w:rPr>
-        <w:t xml:space="preserve">. The internal network is rated </w:t>
+        <w:t xml:space="preserve"> which means a real attacker could use them to break in. </w:t>
+      </w:r>
+      <w:r>
+        <w:rPr>
+          <w:rFonts w:ascii="Arial" w:cs="Arial" w:eastAsia="Arial" w:hAnsi="Arial"/>
+          <w:b/>
+          <w:bCs/>
+          <w:sz w:val="21"/>
+          <w:szCs w:val="21"/>
+        </w:rPr>
+        <w:t xml:space="preserve">None has been fixed yet.</w:t>
+      </w:r>
+    </w:p>
+    <w:p>
+      <w:pPr>
+        <w:shd w:fill="FBE5E5" w:color="auto" w:val="clear"/>
+        <w:spacing w:after="120" w:line="276"/>
+      </w:pPr>
+      <w:r>
+        <w:rPr>
+          <w:rFonts w:ascii="Arial" w:cs="Arial" w:eastAsia="Arial" w:hAnsi="Arial"/>
+          <w:b/>
+          <w:bCs/>
+          <w:sz w:val="21"/>
+          <w:szCs w:val="21"/>
+        </w:rPr>
+        <w:t xml:space="preserve">In plain terms:</w:t>
+      </w:r>
+      <w:r>
+        <w:rPr>
+          <w:rFonts w:ascii="Arial" w:cs="Arial" w:eastAsia="Arial" w:hAnsi="Arial"/>
+          <w:sz w:val="21"/>
+          <w:szCs w:val="21"/>
+        </w:rPr>
+        <w:t xml:space="preserve"> the company’s computers have no modern security software watching them and the network has no internal barriers. If one computer or camera is compromised an attacker could move freely to the servers and files and CCTV system and nobody would be alerted. The result could be locked files and stopped work and stolen data and lost footage.</w:t>
+      </w:r>
+    </w:p>
+    <w:p>
+      <w:pPr>
+        <w:spacing w:after="120" w:line="276"/>
+      </w:pPr>
+      <w:r>
+        <w:rPr>
+          <w:rFonts w:ascii="Arial" w:cs="Arial" w:eastAsia="Arial" w:hAnsi="Arial"/>
+          <w:sz w:val="21"/>
+          <w:szCs w:val="21"/>
+        </w:rPr>
+        <w:t xml:space="preserve">The office network is rated </w:t>
       </w:r>
       <w:r>
         <w:rPr>
@@ -799,7 +846,7 @@
           <w:sz w:val="21"/>
           <w:szCs w:val="21"/>
         </w:rPr>
-        <w:t xml:space="preserve"> risk and the CCTV infrastructure </w:t>
+        <w:t xml:space="preserve"> risk and the CCTV system </w:t>
       </w:r>
       <w:r>
         <w:rPr>
@@ -817,20 +864,7 @@
           <w:sz w:val="21"/>
           <w:szCs w:val="21"/>
         </w:rPr>
-        <w:t xml:space="preserve"> risk. No finding has been remediated as of the report date.</w:t>
-      </w:r>
-    </w:p>
-    <w:p>
-      <w:pPr>
-        <w:spacing w:after="120" w:line="276"/>
-      </w:pPr>
-      <w:r>
-        <w:rPr>
-          <w:rFonts w:ascii="Arial" w:cs="Arial" w:eastAsia="Arial" w:hAnsi="Arial"/>
-          <w:sz w:val="21"/>
-          <w:szCs w:val="21"/>
-        </w:rPr>
-        <w:t xml:space="preserve">The most significant risks are network services open to remote attack and weak authentication and encryption. They are compounded by the absence of endpoint detection and an unsegmented network. If exploited they could lead to ransomware or data theft or loss of CCTV evidence. Critical and High findings must be remediated immediately and Medium and Low findings within a defined timeline. Deployment of EDR or XDR and a next-generation firewall with internal segmentation is the first implementation priority. Sections 5 to 7 set out each issue with its impact and mitigation.</w:t>
+        <w:t xml:space="preserve"> risk. The first priority is to install security monitoring software (EDR or XDR) on every computer and server and to install a modern firewall that separates the network into zones. These two steps detect attacks and stop them spreading. Sections 5 to 7 explain each weakness in plain words with what it could mean for the business and how to fix it.</w:t>
       </w:r>
     </w:p>
     <w:p>
@@ -1851,10 +1885,20 @@
       <w:r>
         <w:rPr>
           <w:rFonts w:ascii="Arial" w:cs="Arial" w:eastAsia="Arial" w:hAnsi="Arial"/>
+          <w:b/>
+          <w:bCs/>
           <w:sz w:val="19"/>
           <w:szCs w:val="19"/>
         </w:rPr>
-        <w:t xml:space="preserve">Critical: complete compromise of a system or remote code execution is possible. High: unauthorised access or disclosure of sensitive information. Medium: exploitation needs additional conditions. Low: limited impact on its own.</w:t>
+        <w:t xml:space="preserve">What the ratings mean.</w:t>
+      </w:r>
+      <w:r>
+        <w:rPr>
+          <w:rFonts w:ascii="Arial" w:cs="Arial" w:eastAsia="Arial" w:hAnsi="Arial"/>
+          <w:sz w:val="19"/>
+          <w:szCs w:val="19"/>
+        </w:rPr>
+        <w:t xml:space="preserve"> Critical: an attacker could take over a system completely. High: an attacker could get in or see private information. Medium: a real weakness that is harder to use. Low: a small weakness with limited impact on its own.</w:t>
       </w:r>
     </w:p>
     <w:p>
@@ -1895,7 +1939,7 @@
           <w:sz w:val="21"/>
           <w:szCs w:val="21"/>
         </w:rPr>
-        <w:t xml:space="preserve">Endpoint protection:</w:t>
+        <w:t xml:space="preserve">No security monitoring on computers:</w:t>
       </w:r>
       <w:r>
         <w:rPr>
@@ -1903,7 +1947,7 @@
           <w:sz w:val="21"/>
           <w:szCs w:val="21"/>
         </w:rPr>
-        <w:t xml:space="preserve"> no Endpoint Detection and Response (EDR) or Extended Detection and Response (XDR) solution is deployed on endpoints and servers.</w:t>
+        <w:t xml:space="preserve"> no EDR or XDR solution is deployed on endpoints and servers. An attack on a computer would not be detected or stopped.</w:t>
       </w:r>
     </w:p>
     <w:p>
@@ -1923,7 +1967,7 @@
           <w:sz w:val="21"/>
           <w:szCs w:val="21"/>
         </w:rPr>
-        <w:t xml:space="preserve">Internet access control:</w:t>
+        <w:t xml:space="preserve">Internet access is not controlled:</w:t>
       </w:r>
       <w:r>
         <w:rPr>
@@ -1951,7 +1995,7 @@
           <w:sz w:val="21"/>
           <w:szCs w:val="21"/>
         </w:rPr>
-        <w:t xml:space="preserve">IP address management:</w:t>
+        <w:t xml:space="preserve">Users can change network addresses:</w:t>
       </w:r>
       <w:r>
         <w:rPr>
@@ -1959,7 +2003,7 @@
           <w:sz w:val="21"/>
           <w:szCs w:val="21"/>
         </w:rPr>
-        <w:t xml:space="preserve"> any user can change locally set IP addresses to bypass restrictions.</w:t>
+        <w:t xml:space="preserve"> any user can change a locally set IP address and bypass restrictions.</w:t>
       </w:r>
     </w:p>
     <w:p>
@@ -1979,7 +2023,7 @@
           <w:sz w:val="21"/>
           <w:szCs w:val="21"/>
         </w:rPr>
-        <w:t xml:space="preserve">Asset identification:</w:t>
+        <w:t xml:space="preserve">Devices are not identified:</w:t>
       </w:r>
       <w:r>
         <w:rPr>
@@ -1987,7 +2031,7 @@
           <w:sz w:val="21"/>
           <w:szCs w:val="21"/>
         </w:rPr>
-        <w:t xml:space="preserve"> hostnames are not standardised and devices are not labelled.</w:t>
+        <w:t xml:space="preserve"> hostnames are not standardised and devices are not labelled so unknown devices are hard to spot.</w:t>
       </w:r>
     </w:p>
     <w:p>
@@ -2007,7 +2051,7 @@
           <w:sz w:val="21"/>
           <w:szCs w:val="21"/>
         </w:rPr>
-        <w:t xml:space="preserve">Vulnerability management:</w:t>
+        <w:t xml:space="preserve">No regular checking:</w:t>
       </w:r>
       <w:r>
         <w:rPr>
@@ -2036,7 +2080,20 @@
           <w:sz w:val="30"/>
           <w:szCs w:val="30"/>
         </w:rPr>
-        <w:t xml:space="preserve">4. Business impact</w:t>
+        <w:t xml:space="preserve">4. Risk and business impact</w:t>
+      </w:r>
+    </w:p>
+    <w:p>
+      <w:pPr>
+        <w:spacing w:after="120" w:line="276"/>
+      </w:pPr>
+      <w:r>
+        <w:rPr>
+          <w:rFonts w:ascii="Arial" w:cs="Arial" w:eastAsia="Arial" w:hAnsi="Arial"/>
+          <w:sz w:val="21"/>
+          <w:szCs w:val="21"/>
+        </w:rPr>
+        <w:t xml:space="preserve">A weakness only matters because of what an attacker could do with it. If nothing is changed these are the realistic outcomes:</w:t>
       </w:r>
     </w:p>
     <w:tbl>
@@ -2052,9 +2109,9 @@
         </w:tblBorders>
       </w:tblPr>
       <w:tblGrid>
-        <w:gridCol w:w="2500"/>
-        <w:gridCol w:w="3700"/>
-        <w:gridCol w:w="3706"/>
+        <w:gridCol w:w="2300"/>
+        <w:gridCol w:w="3800"/>
+        <w:gridCol w:w="3806"/>
       </w:tblGrid>
       <w:tr>
         <w:trPr>
@@ -2063,7 +2120,7 @@
         </w:trPr>
         <w:tc>
           <w:tcPr>
-            <w:tcW w:type="dxa" w:w="2500"/>
+            <w:tcW w:type="dxa" w:w="2300"/>
             <w:tcBorders>
               <w:top w:val="single" w:color="BFC7D5" w:sz="4"/>
               <w:left w:val="single" w:color="BFC7D5" w:sz="4"/>
@@ -2092,13 +2149,13 @@
                 <w:sz w:val="19"/>
                 <w:szCs w:val="19"/>
               </w:rPr>
-              <w:t xml:space="preserve">Area</w:t>
-            </w:r>
-          </w:p>
-        </w:tc>
-        <w:tc>
-          <w:tcPr>
-            <w:tcW w:type="dxa" w:w="3700"/>
+              <w:t xml:space="preserve">What is at risk</w:t>
+            </w:r>
+          </w:p>
+        </w:tc>
+        <w:tc>
+          <w:tcPr>
+            <w:tcW w:type="dxa" w:w="3800"/>
             <w:tcBorders>
               <w:top w:val="single" w:color="BFC7D5" w:sz="4"/>
               <w:left w:val="single" w:color="BFC7D5" w:sz="4"/>
@@ -2127,13 +2184,13 @@
                 <w:sz w:val="19"/>
                 <w:szCs w:val="19"/>
               </w:rPr>
-              <w:t xml:space="preserve">Potential impact</w:t>
-            </w:r>
-          </w:p>
-        </w:tc>
-        <w:tc>
-          <w:tcPr>
-            <w:tcW w:type="dxa" w:w="3706"/>
+              <w:t xml:space="preserve">What could happen</w:t>
+            </w:r>
+          </w:p>
+        </w:tc>
+        <w:tc>
+          <w:tcPr>
+            <w:tcW w:type="dxa" w:w="3806"/>
             <w:tcBorders>
               <w:top w:val="single" w:color="BFC7D5" w:sz="4"/>
               <w:left w:val="single" w:color="BFC7D5" w:sz="4"/>
@@ -2162,7 +2219,7 @@
                 <w:sz w:val="19"/>
                 <w:szCs w:val="19"/>
               </w:rPr>
-              <w:t xml:space="preserve">Business consequence</w:t>
+              <w:t xml:space="preserve">What it would mean for the business</w:t>
             </w:r>
           </w:p>
         </w:tc>
@@ -2173,7 +2230,7 @@
         </w:trPr>
         <w:tc>
           <w:tcPr>
-            <w:tcW w:type="dxa" w:w="2500"/>
+            <w:tcW w:type="dxa" w:w="2300"/>
             <w:tcBorders>
               <w:top w:val="single" w:color="BFC7D5" w:sz="4"/>
               <w:left w:val="single" w:color="BFC7D5" w:sz="4"/>
@@ -2201,69 +2258,69 @@
                 <w:sz w:val="19"/>
                 <w:szCs w:val="19"/>
               </w:rPr>
-              <w:t xml:space="preserve">Operations</w:t>
-            </w:r>
-          </w:p>
-        </w:tc>
-        <w:tc>
-          <w:tcPr>
-            <w:tcW w:type="dxa" w:w="3700"/>
-            <w:tcBorders>
-              <w:top w:val="single" w:color="BFC7D5" w:sz="4"/>
-              <w:left w:val="single" w:color="BFC7D5" w:sz="4"/>
-              <w:bottom w:val="single" w:color="BFC7D5" w:sz="4"/>
-              <w:right w:val="single" w:color="BFC7D5" w:sz="4"/>
-            </w:tcBorders>
-            <w:tcMar>
-              <w:top w:type="dxa" w:w="70"/>
-              <w:left w:type="dxa" w:w="110"/>
-              <w:bottom w:type="dxa" w:w="70"/>
-              <w:right w:type="dxa" w:w="110"/>
-            </w:tcMar>
-            <w:vAlign w:val="top"/>
-          </w:tcPr>
-          <w:p>
-            <w:pPr>
-              <w:spacing w:after="50" w:line="260"/>
-            </w:pPr>
-            <w:r>
-              <w:rPr>
-                <w:rFonts w:ascii="Arial" w:cs="Arial" w:eastAsia="Arial" w:hAnsi="Arial"/>
-                <w:sz w:val="19"/>
-                <w:szCs w:val="19"/>
-              </w:rPr>
-              <w:t xml:space="preserve">Ransomware or a network outbreak locks or disables computers and servers.</w:t>
-            </w:r>
-          </w:p>
-        </w:tc>
-        <w:tc>
-          <w:tcPr>
-            <w:tcW w:type="dxa" w:w="3706"/>
-            <w:tcBorders>
-              <w:top w:val="single" w:color="BFC7D5" w:sz="4"/>
-              <w:left w:val="single" w:color="BFC7D5" w:sz="4"/>
-              <w:bottom w:val="single" w:color="BFC7D5" w:sz="4"/>
-              <w:right w:val="single" w:color="BFC7D5" w:sz="4"/>
-            </w:tcBorders>
-            <w:tcMar>
-              <w:top w:type="dxa" w:w="70"/>
-              <w:left w:type="dxa" w:w="110"/>
-              <w:bottom w:type="dxa" w:w="70"/>
-              <w:right w:type="dxa" w:w="110"/>
-            </w:tcMar>
-            <w:vAlign w:val="top"/>
-          </w:tcPr>
-          <w:p>
-            <w:pPr>
-              <w:spacing w:after="50" w:line="260"/>
-            </w:pPr>
-            <w:r>
-              <w:rPr>
-                <w:rFonts w:ascii="Arial" w:cs="Arial" w:eastAsia="Arial" w:hAnsi="Arial"/>
-                <w:sz w:val="19"/>
-                <w:szCs w:val="19"/>
-              </w:rPr>
-              <w:t xml:space="preserve">Work stops until systems are rebuilt. Recovery costs and possible ransom demand.</w:t>
+              <w:t xml:space="preserve">Day-to-day work</w:t>
+            </w:r>
+          </w:p>
+        </w:tc>
+        <w:tc>
+          <w:tcPr>
+            <w:tcW w:type="dxa" w:w="3800"/>
+            <w:tcBorders>
+              <w:top w:val="single" w:color="BFC7D5" w:sz="4"/>
+              <w:left w:val="single" w:color="BFC7D5" w:sz="4"/>
+              <w:bottom w:val="single" w:color="BFC7D5" w:sz="4"/>
+              <w:right w:val="single" w:color="BFC7D5" w:sz="4"/>
+            </w:tcBorders>
+            <w:tcMar>
+              <w:top w:type="dxa" w:w="70"/>
+              <w:left w:type="dxa" w:w="110"/>
+              <w:bottom w:type="dxa" w:w="70"/>
+              <w:right w:type="dxa" w:w="110"/>
+            </w:tcMar>
+            <w:vAlign w:val="top"/>
+          </w:tcPr>
+          <w:p>
+            <w:pPr>
+              <w:spacing w:after="50" w:line="260"/>
+            </w:pPr>
+            <w:r>
+              <w:rPr>
+                <w:rFonts w:ascii="Arial" w:cs="Arial" w:eastAsia="Arial" w:hAnsi="Arial"/>
+                <w:sz w:val="19"/>
+                <w:szCs w:val="19"/>
+              </w:rPr>
+              <w:t xml:space="preserve">Ransomware could lock computers and servers across the company at the same time.</w:t>
+            </w:r>
+          </w:p>
+        </w:tc>
+        <w:tc>
+          <w:tcPr>
+            <w:tcW w:type="dxa" w:w="3806"/>
+            <w:tcBorders>
+              <w:top w:val="single" w:color="BFC7D5" w:sz="4"/>
+              <w:left w:val="single" w:color="BFC7D5" w:sz="4"/>
+              <w:bottom w:val="single" w:color="BFC7D5" w:sz="4"/>
+              <w:right w:val="single" w:color="BFC7D5" w:sz="4"/>
+            </w:tcBorders>
+            <w:tcMar>
+              <w:top w:type="dxa" w:w="70"/>
+              <w:left w:type="dxa" w:w="110"/>
+              <w:bottom w:type="dxa" w:w="70"/>
+              <w:right w:type="dxa" w:w="110"/>
+            </w:tcMar>
+            <w:vAlign w:val="top"/>
+          </w:tcPr>
+          <w:p>
+            <w:pPr>
+              <w:spacing w:after="50" w:line="260"/>
+            </w:pPr>
+            <w:r>
+              <w:rPr>
+                <w:rFonts w:ascii="Arial" w:cs="Arial" w:eastAsia="Arial" w:hAnsi="Arial"/>
+                <w:sz w:val="19"/>
+                <w:szCs w:val="19"/>
+              </w:rPr>
+              <w:t xml:space="preserve">Work stops. Recovery can take days or weeks and a ransom may be demanded.</w:t>
             </w:r>
           </w:p>
         </w:tc>
@@ -2274,7 +2331,7 @@
         </w:trPr>
         <w:tc>
           <w:tcPr>
-            <w:tcW w:type="dxa" w:w="2500"/>
+            <w:tcW w:type="dxa" w:w="2300"/>
             <w:tcBorders>
               <w:top w:val="single" w:color="BFC7D5" w:sz="4"/>
               <w:left w:val="single" w:color="BFC7D5" w:sz="4"/>
@@ -2302,69 +2359,69 @@
                 <w:sz w:val="19"/>
                 <w:szCs w:val="19"/>
               </w:rPr>
-              <w:t xml:space="preserve">Data confidentiality</w:t>
-            </w:r>
-          </w:p>
-        </w:tc>
-        <w:tc>
-          <w:tcPr>
-            <w:tcW w:type="dxa" w:w="3700"/>
-            <w:tcBorders>
-              <w:top w:val="single" w:color="BFC7D5" w:sz="4"/>
-              <w:left w:val="single" w:color="BFC7D5" w:sz="4"/>
-              <w:bottom w:val="single" w:color="BFC7D5" w:sz="4"/>
-              <w:right w:val="single" w:color="BFC7D5" w:sz="4"/>
-            </w:tcBorders>
-            <w:tcMar>
-              <w:top w:type="dxa" w:w="70"/>
-              <w:left w:type="dxa" w:w="110"/>
-              <w:bottom w:type="dxa" w:w="70"/>
-              <w:right w:type="dxa" w:w="110"/>
-            </w:tcMar>
-            <w:vAlign w:val="top"/>
-          </w:tcPr>
-          <w:p>
-            <w:pPr>
-              <w:spacing w:after="50" w:line="260"/>
-            </w:pPr>
-            <w:r>
-              <w:rPr>
-                <w:rFonts w:ascii="Arial" w:cs="Arial" w:eastAsia="Arial" w:hAnsi="Arial"/>
-                <w:sz w:val="19"/>
-                <w:szCs w:val="19"/>
-              </w:rPr>
-              <w:t xml:space="preserve">Credentials and files are intercepted or relayed across the network. Databases are reached from a compromised host.</w:t>
-            </w:r>
-          </w:p>
-        </w:tc>
-        <w:tc>
-          <w:tcPr>
-            <w:tcW w:type="dxa" w:w="3706"/>
-            <w:tcBorders>
-              <w:top w:val="single" w:color="BFC7D5" w:sz="4"/>
-              <w:left w:val="single" w:color="BFC7D5" w:sz="4"/>
-              <w:bottom w:val="single" w:color="BFC7D5" w:sz="4"/>
-              <w:right w:val="single" w:color="BFC7D5" w:sz="4"/>
-            </w:tcBorders>
-            <w:tcMar>
-              <w:top w:type="dxa" w:w="70"/>
-              <w:left w:type="dxa" w:w="110"/>
-              <w:bottom w:type="dxa" w:w="70"/>
-              <w:right w:type="dxa" w:w="110"/>
-            </w:tcMar>
-            <w:vAlign w:val="top"/>
-          </w:tcPr>
-          <w:p>
-            <w:pPr>
-              <w:spacing w:after="50" w:line="260"/>
-            </w:pPr>
-            <w:r>
-              <w:rPr>
-                <w:rFonts w:ascii="Arial" w:cs="Arial" w:eastAsia="Arial" w:hAnsi="Arial"/>
-                <w:sz w:val="19"/>
-                <w:szCs w:val="19"/>
-              </w:rPr>
-              <w:t xml:space="preserve">Loss of company and customer information. Legal and contractual exposure.</w:t>
+              <w:t xml:space="preserve">Company and customer data</w:t>
+            </w:r>
+          </w:p>
+        </w:tc>
+        <w:tc>
+          <w:tcPr>
+            <w:tcW w:type="dxa" w:w="3800"/>
+            <w:tcBorders>
+              <w:top w:val="single" w:color="BFC7D5" w:sz="4"/>
+              <w:left w:val="single" w:color="BFC7D5" w:sz="4"/>
+              <w:bottom w:val="single" w:color="BFC7D5" w:sz="4"/>
+              <w:right w:val="single" w:color="BFC7D5" w:sz="4"/>
+            </w:tcBorders>
+            <w:tcMar>
+              <w:top w:type="dxa" w:w="70"/>
+              <w:left w:type="dxa" w:w="110"/>
+              <w:bottom w:type="dxa" w:w="70"/>
+              <w:right w:type="dxa" w:w="110"/>
+            </w:tcMar>
+            <w:vAlign w:val="top"/>
+          </w:tcPr>
+          <w:p>
+            <w:pPr>
+              <w:spacing w:after="50" w:line="260"/>
+            </w:pPr>
+            <w:r>
+              <w:rPr>
+                <w:rFonts w:ascii="Arial" w:cs="Arial" w:eastAsia="Arial" w:hAnsi="Arial"/>
+                <w:sz w:val="19"/>
+                <w:szCs w:val="19"/>
+              </w:rPr>
+              <w:t xml:space="preserve">Attackers could copy files and databases and read passwords as they travel across the network.</w:t>
+            </w:r>
+          </w:p>
+        </w:tc>
+        <w:tc>
+          <w:tcPr>
+            <w:tcW w:type="dxa" w:w="3806"/>
+            <w:tcBorders>
+              <w:top w:val="single" w:color="BFC7D5" w:sz="4"/>
+              <w:left w:val="single" w:color="BFC7D5" w:sz="4"/>
+              <w:bottom w:val="single" w:color="BFC7D5" w:sz="4"/>
+              <w:right w:val="single" w:color="BFC7D5" w:sz="4"/>
+            </w:tcBorders>
+            <w:tcMar>
+              <w:top w:type="dxa" w:w="70"/>
+              <w:left w:type="dxa" w:w="110"/>
+              <w:bottom w:type="dxa" w:w="70"/>
+              <w:right w:type="dxa" w:w="110"/>
+            </w:tcMar>
+            <w:vAlign w:val="top"/>
+          </w:tcPr>
+          <w:p>
+            <w:pPr>
+              <w:spacing w:after="50" w:line="260"/>
+            </w:pPr>
+            <w:r>
+              <w:rPr>
+                <w:rFonts w:ascii="Arial" w:cs="Arial" w:eastAsia="Arial" w:hAnsi="Arial"/>
+                <w:sz w:val="19"/>
+                <w:szCs w:val="19"/>
+              </w:rPr>
+              <w:t xml:space="preserve">Confidential information is lost or exposed. Legal and contract problems follow. Customers may lose trust.</w:t>
             </w:r>
           </w:p>
         </w:tc>
@@ -2375,7 +2432,7 @@
         </w:trPr>
         <w:tc>
           <w:tcPr>
-            <w:tcW w:type="dxa" w:w="2500"/>
+            <w:tcW w:type="dxa" w:w="2300"/>
             <w:tcBorders>
               <w:top w:val="single" w:color="BFC7D5" w:sz="4"/>
               <w:left w:val="single" w:color="BFC7D5" w:sz="4"/>
@@ -2403,69 +2460,69 @@
                 <w:sz w:val="19"/>
                 <w:szCs w:val="19"/>
               </w:rPr>
-              <w:t xml:space="preserve">Physical security</w:t>
-            </w:r>
-          </w:p>
-        </w:tc>
-        <w:tc>
-          <w:tcPr>
-            <w:tcW w:type="dxa" w:w="3700"/>
-            <w:tcBorders>
-              <w:top w:val="single" w:color="BFC7D5" w:sz="4"/>
-              <w:left w:val="single" w:color="BFC7D5" w:sz="4"/>
-              <w:bottom w:val="single" w:color="BFC7D5" w:sz="4"/>
-              <w:right w:val="single" w:color="BFC7D5" w:sz="4"/>
-            </w:tcBorders>
-            <w:tcMar>
-              <w:top w:type="dxa" w:w="70"/>
-              <w:left w:type="dxa" w:w="110"/>
-              <w:bottom w:type="dxa" w:w="70"/>
-              <w:right w:type="dxa" w:w="110"/>
-            </w:tcMar>
-            <w:vAlign w:val="top"/>
-          </w:tcPr>
-          <w:p>
-            <w:pPr>
-              <w:spacing w:after="50" w:line="260"/>
-            </w:pPr>
-            <w:r>
-              <w:rPr>
-                <w:rFonts w:ascii="Arial" w:cs="Arial" w:eastAsia="Arial" w:hAnsi="Arial"/>
-                <w:sz w:val="19"/>
-                <w:szCs w:val="19"/>
-              </w:rPr>
-              <w:t xml:space="preserve">CCTV devices are accessed without authentication. Recordings are viewed or deleted.</w:t>
-            </w:r>
-          </w:p>
-        </w:tc>
-        <w:tc>
-          <w:tcPr>
-            <w:tcW w:type="dxa" w:w="3706"/>
-            <w:tcBorders>
-              <w:top w:val="single" w:color="BFC7D5" w:sz="4"/>
-              <w:left w:val="single" w:color="BFC7D5" w:sz="4"/>
-              <w:bottom w:val="single" w:color="BFC7D5" w:sz="4"/>
-              <w:right w:val="single" w:color="BFC7D5" w:sz="4"/>
-            </w:tcBorders>
-            <w:tcMar>
-              <w:top w:type="dxa" w:w="70"/>
-              <w:left w:type="dxa" w:w="110"/>
-              <w:bottom w:type="dxa" w:w="70"/>
-              <w:right w:type="dxa" w:w="110"/>
-            </w:tcMar>
-            <w:vAlign w:val="top"/>
-          </w:tcPr>
-          <w:p>
-            <w:pPr>
-              <w:spacing w:after="50" w:line="260"/>
-            </w:pPr>
-            <w:r>
-              <w:rPr>
-                <w:rFonts w:ascii="Arial" w:cs="Arial" w:eastAsia="Arial" w:hAnsi="Arial"/>
-                <w:sz w:val="19"/>
-                <w:szCs w:val="19"/>
-              </w:rPr>
-              <w:t xml:space="preserve">Evidence may be unavailable or untrustworthy after an incident.</w:t>
+              <w:t xml:space="preserve">CCTV and physical security</w:t>
+            </w:r>
+          </w:p>
+        </w:tc>
+        <w:tc>
+          <w:tcPr>
+            <w:tcW w:type="dxa" w:w="3800"/>
+            <w:tcBorders>
+              <w:top w:val="single" w:color="BFC7D5" w:sz="4"/>
+              <w:left w:val="single" w:color="BFC7D5" w:sz="4"/>
+              <w:bottom w:val="single" w:color="BFC7D5" w:sz="4"/>
+              <w:right w:val="single" w:color="BFC7D5" w:sz="4"/>
+            </w:tcBorders>
+            <w:tcMar>
+              <w:top w:type="dxa" w:w="70"/>
+              <w:left w:type="dxa" w:w="110"/>
+              <w:bottom w:type="dxa" w:w="70"/>
+              <w:right w:type="dxa" w:w="110"/>
+            </w:tcMar>
+            <w:vAlign w:val="top"/>
+          </w:tcPr>
+          <w:p>
+            <w:pPr>
+              <w:spacing w:after="50" w:line="260"/>
+            </w:pPr>
+            <w:r>
+              <w:rPr>
+                <w:rFonts w:ascii="Arial" w:cs="Arial" w:eastAsia="Arial" w:hAnsi="Arial"/>
+                <w:sz w:val="19"/>
+                <w:szCs w:val="19"/>
+              </w:rPr>
+              <w:t xml:space="preserve">Cameras could be watched or switched off and recordings deleted or changed.</w:t>
+            </w:r>
+          </w:p>
+        </w:tc>
+        <w:tc>
+          <w:tcPr>
+            <w:tcW w:type="dxa" w:w="3806"/>
+            <w:tcBorders>
+              <w:top w:val="single" w:color="BFC7D5" w:sz="4"/>
+              <w:left w:val="single" w:color="BFC7D5" w:sz="4"/>
+              <w:bottom w:val="single" w:color="BFC7D5" w:sz="4"/>
+              <w:right w:val="single" w:color="BFC7D5" w:sz="4"/>
+            </w:tcBorders>
+            <w:tcMar>
+              <w:top w:type="dxa" w:w="70"/>
+              <w:left w:type="dxa" w:w="110"/>
+              <w:bottom w:type="dxa" w:w="70"/>
+              <w:right w:type="dxa" w:w="110"/>
+            </w:tcMar>
+            <w:vAlign w:val="top"/>
+          </w:tcPr>
+          <w:p>
+            <w:pPr>
+              <w:spacing w:after="50" w:line="260"/>
+            </w:pPr>
+            <w:r>
+              <w:rPr>
+                <w:rFonts w:ascii="Arial" w:cs="Arial" w:eastAsia="Arial" w:hAnsi="Arial"/>
+                <w:sz w:val="19"/>
+                <w:szCs w:val="19"/>
+              </w:rPr>
+              <w:t xml:space="preserve">Footage needed after a theft or accident or dispute may be gone or no longer trustworthy.</w:t>
             </w:r>
           </w:p>
         </w:tc>
@@ -2476,7 +2533,7 @@
         </w:trPr>
         <w:tc>
           <w:tcPr>
-            <w:tcW w:type="dxa" w:w="2500"/>
+            <w:tcW w:type="dxa" w:w="2300"/>
             <w:tcBorders>
               <w:top w:val="single" w:color="BFC7D5" w:sz="4"/>
               <w:left w:val="single" w:color="BFC7D5" w:sz="4"/>
@@ -2504,69 +2561,69 @@
                 <w:sz w:val="19"/>
                 <w:szCs w:val="19"/>
               </w:rPr>
-              <w:t xml:space="preserve">Lateral movement</w:t>
-            </w:r>
-          </w:p>
-        </w:tc>
-        <w:tc>
-          <w:tcPr>
-            <w:tcW w:type="dxa" w:w="3700"/>
-            <w:tcBorders>
-              <w:top w:val="single" w:color="BFC7D5" w:sz="4"/>
-              <w:left w:val="single" w:color="BFC7D5" w:sz="4"/>
-              <w:bottom w:val="single" w:color="BFC7D5" w:sz="4"/>
-              <w:right w:val="single" w:color="BFC7D5" w:sz="4"/>
-            </w:tcBorders>
-            <w:tcMar>
-              <w:top w:type="dxa" w:w="70"/>
-              <w:left w:type="dxa" w:w="110"/>
-              <w:bottom w:type="dxa" w:w="70"/>
-              <w:right w:type="dxa" w:w="110"/>
-            </w:tcMar>
-            <w:vAlign w:val="top"/>
-          </w:tcPr>
-          <w:p>
-            <w:pPr>
-              <w:spacing w:after="50" w:line="260"/>
-            </w:pPr>
-            <w:r>
-              <w:rPr>
-                <w:rFonts w:ascii="Arial" w:cs="Arial" w:eastAsia="Arial" w:hAnsi="Arial"/>
-                <w:sz w:val="19"/>
-                <w:szCs w:val="19"/>
-              </w:rPr>
-              <w:t xml:space="preserve">A compromised camera or workstation provides a path to servers because the network is not segmented.</w:t>
-            </w:r>
-          </w:p>
-        </w:tc>
-        <w:tc>
-          <w:tcPr>
-            <w:tcW w:type="dxa" w:w="3706"/>
-            <w:tcBorders>
-              <w:top w:val="single" w:color="BFC7D5" w:sz="4"/>
-              <w:left w:val="single" w:color="BFC7D5" w:sz="4"/>
-              <w:bottom w:val="single" w:color="BFC7D5" w:sz="4"/>
-              <w:right w:val="single" w:color="BFC7D5" w:sz="4"/>
-            </w:tcBorders>
-            <w:tcMar>
-              <w:top w:type="dxa" w:w="70"/>
-              <w:left w:type="dxa" w:w="110"/>
-              <w:bottom w:type="dxa" w:w="70"/>
-              <w:right w:type="dxa" w:w="110"/>
-            </w:tcMar>
-            <w:vAlign w:val="top"/>
-          </w:tcPr>
-          <w:p>
-            <w:pPr>
-              <w:spacing w:after="50" w:line="260"/>
-            </w:pPr>
-            <w:r>
-              <w:rPr>
-                <w:rFonts w:ascii="Arial" w:cs="Arial" w:eastAsia="Arial" w:hAnsi="Arial"/>
-                <w:sz w:val="19"/>
-                <w:szCs w:val="19"/>
-              </w:rPr>
-              <w:t xml:space="preserve">A single weak device becomes a company-wide incident.</w:t>
+              <w:t xml:space="preserve">One weak point leads everywhere</w:t>
+            </w:r>
+          </w:p>
+        </w:tc>
+        <w:tc>
+          <w:tcPr>
+            <w:tcW w:type="dxa" w:w="3800"/>
+            <w:tcBorders>
+              <w:top w:val="single" w:color="BFC7D5" w:sz="4"/>
+              <w:left w:val="single" w:color="BFC7D5" w:sz="4"/>
+              <w:bottom w:val="single" w:color="BFC7D5" w:sz="4"/>
+              <w:right w:val="single" w:color="BFC7D5" w:sz="4"/>
+            </w:tcBorders>
+            <w:tcMar>
+              <w:top w:type="dxa" w:w="70"/>
+              <w:left w:type="dxa" w:w="110"/>
+              <w:bottom w:type="dxa" w:w="70"/>
+              <w:right w:type="dxa" w:w="110"/>
+            </w:tcMar>
+            <w:vAlign w:val="top"/>
+          </w:tcPr>
+          <w:p>
+            <w:pPr>
+              <w:spacing w:after="50" w:line="260"/>
+            </w:pPr>
+            <w:r>
+              <w:rPr>
+                <w:rFonts w:ascii="Arial" w:cs="Arial" w:eastAsia="Arial" w:hAnsi="Arial"/>
+                <w:sz w:val="19"/>
+                <w:szCs w:val="19"/>
+              </w:rPr>
+              <w:t xml:space="preserve">The network is not separated into zones so a weak camera or one infected computer is a doorway to everything else.</w:t>
+            </w:r>
+          </w:p>
+        </w:tc>
+        <w:tc>
+          <w:tcPr>
+            <w:tcW w:type="dxa" w:w="3806"/>
+            <w:tcBorders>
+              <w:top w:val="single" w:color="BFC7D5" w:sz="4"/>
+              <w:left w:val="single" w:color="BFC7D5" w:sz="4"/>
+              <w:bottom w:val="single" w:color="BFC7D5" w:sz="4"/>
+              <w:right w:val="single" w:color="BFC7D5" w:sz="4"/>
+            </w:tcBorders>
+            <w:tcMar>
+              <w:top w:type="dxa" w:w="70"/>
+              <w:left w:type="dxa" w:w="110"/>
+              <w:bottom w:type="dxa" w:w="70"/>
+              <w:right w:type="dxa" w:w="110"/>
+            </w:tcMar>
+            <w:vAlign w:val="top"/>
+          </w:tcPr>
+          <w:p>
+            <w:pPr>
+              <w:spacing w:after="50" w:line="260"/>
+            </w:pPr>
+            <w:r>
+              <w:rPr>
+                <w:rFonts w:ascii="Arial" w:cs="Arial" w:eastAsia="Arial" w:hAnsi="Arial"/>
+                <w:sz w:val="19"/>
+                <w:szCs w:val="19"/>
+              </w:rPr>
+              <w:t xml:space="preserve">A small incident becomes a company-wide crisis.</w:t>
             </w:r>
           </w:p>
         </w:tc>
@@ -2577,7 +2634,7 @@
         </w:trPr>
         <w:tc>
           <w:tcPr>
-            <w:tcW w:type="dxa" w:w="2500"/>
+            <w:tcW w:type="dxa" w:w="2300"/>
             <w:tcBorders>
               <w:top w:val="single" w:color="BFC7D5" w:sz="4"/>
               <w:left w:val="single" w:color="BFC7D5" w:sz="4"/>
@@ -2605,69 +2662,69 @@
                 <w:sz w:val="19"/>
                 <w:szCs w:val="19"/>
               </w:rPr>
-              <w:t xml:space="preserve">Detection and response</w:t>
-            </w:r>
-          </w:p>
-        </w:tc>
-        <w:tc>
-          <w:tcPr>
-            <w:tcW w:type="dxa" w:w="3700"/>
-            <w:tcBorders>
-              <w:top w:val="single" w:color="BFC7D5" w:sz="4"/>
-              <w:left w:val="single" w:color="BFC7D5" w:sz="4"/>
-              <w:bottom w:val="single" w:color="BFC7D5" w:sz="4"/>
-              <w:right w:val="single" w:color="BFC7D5" w:sz="4"/>
-            </w:tcBorders>
-            <w:tcMar>
-              <w:top w:type="dxa" w:w="70"/>
-              <w:left w:type="dxa" w:w="110"/>
-              <w:bottom w:type="dxa" w:w="70"/>
-              <w:right w:type="dxa" w:w="110"/>
-            </w:tcMar>
-            <w:vAlign w:val="top"/>
-          </w:tcPr>
-          <w:p>
-            <w:pPr>
-              <w:spacing w:after="50" w:line="260"/>
-            </w:pPr>
-            <w:r>
-              <w:rPr>
-                <w:rFonts w:ascii="Arial" w:cs="Arial" w:eastAsia="Arial" w:hAnsi="Arial"/>
-                <w:sz w:val="19"/>
-                <w:szCs w:val="19"/>
-              </w:rPr>
-              <w:t xml:space="preserve">No EDR or XDR and no routine scanning. Devices are unlabelled.</w:t>
-            </w:r>
-          </w:p>
-        </w:tc>
-        <w:tc>
-          <w:tcPr>
-            <w:tcW w:type="dxa" w:w="3706"/>
-            <w:tcBorders>
-              <w:top w:val="single" w:color="BFC7D5" w:sz="4"/>
-              <w:left w:val="single" w:color="BFC7D5" w:sz="4"/>
-              <w:bottom w:val="single" w:color="BFC7D5" w:sz="4"/>
-              <w:right w:val="single" w:color="BFC7D5" w:sz="4"/>
-            </w:tcBorders>
-            <w:tcMar>
-              <w:top w:type="dxa" w:w="70"/>
-              <w:left w:type="dxa" w:w="110"/>
-              <w:bottom w:type="dxa" w:w="70"/>
-              <w:right w:type="dxa" w:w="110"/>
-            </w:tcMar>
-            <w:vAlign w:val="top"/>
-          </w:tcPr>
-          <w:p>
-            <w:pPr>
-              <w:spacing w:after="50" w:line="260"/>
-            </w:pPr>
-            <w:r>
-              <w:rPr>
-                <w:rFonts w:ascii="Arial" w:cs="Arial" w:eastAsia="Arial" w:hAnsi="Arial"/>
-                <w:sz w:val="19"/>
-                <w:szCs w:val="19"/>
-              </w:rPr>
-              <w:t xml:space="preserve">Intrusions remain unnoticed for longer. Recovery is slower and more costly.</w:t>
+              <w:t xml:space="preserve">Late discovery</w:t>
+            </w:r>
+          </w:p>
+        </w:tc>
+        <w:tc>
+          <w:tcPr>
+            <w:tcW w:type="dxa" w:w="3800"/>
+            <w:tcBorders>
+              <w:top w:val="single" w:color="BFC7D5" w:sz="4"/>
+              <w:left w:val="single" w:color="BFC7D5" w:sz="4"/>
+              <w:bottom w:val="single" w:color="BFC7D5" w:sz="4"/>
+              <w:right w:val="single" w:color="BFC7D5" w:sz="4"/>
+            </w:tcBorders>
+            <w:tcMar>
+              <w:top w:type="dxa" w:w="70"/>
+              <w:left w:type="dxa" w:w="110"/>
+              <w:bottom w:type="dxa" w:w="70"/>
+              <w:right w:type="dxa" w:w="110"/>
+            </w:tcMar>
+            <w:vAlign w:val="top"/>
+          </w:tcPr>
+          <w:p>
+            <w:pPr>
+              <w:spacing w:after="50" w:line="260"/>
+            </w:pPr>
+            <w:r>
+              <w:rPr>
+                <w:rFonts w:ascii="Arial" w:cs="Arial" w:eastAsia="Arial" w:hAnsi="Arial"/>
+                <w:sz w:val="19"/>
+                <w:szCs w:val="19"/>
+              </w:rPr>
+              <w:t xml:space="preserve">With no monitoring or regular checks an attacker could stay hidden for weeks.</w:t>
+            </w:r>
+          </w:p>
+        </w:tc>
+        <w:tc>
+          <w:tcPr>
+            <w:tcW w:type="dxa" w:w="3806"/>
+            <w:tcBorders>
+              <w:top w:val="single" w:color="BFC7D5" w:sz="4"/>
+              <w:left w:val="single" w:color="BFC7D5" w:sz="4"/>
+              <w:bottom w:val="single" w:color="BFC7D5" w:sz="4"/>
+              <w:right w:val="single" w:color="BFC7D5" w:sz="4"/>
+            </w:tcBorders>
+            <w:tcMar>
+              <w:top w:type="dxa" w:w="70"/>
+              <w:left w:type="dxa" w:w="110"/>
+              <w:bottom w:type="dxa" w:w="70"/>
+              <w:right w:type="dxa" w:w="110"/>
+            </w:tcMar>
+            <w:vAlign w:val="top"/>
+          </w:tcPr>
+          <w:p>
+            <w:pPr>
+              <w:spacing w:after="50" w:line="260"/>
+            </w:pPr>
+            <w:r>
+              <w:rPr>
+                <w:rFonts w:ascii="Arial" w:cs="Arial" w:eastAsia="Arial" w:hAnsi="Arial"/>
+                <w:sz w:val="19"/>
+                <w:szCs w:val="19"/>
+              </w:rPr>
+              <w:t xml:space="preserve">The longer they stay the more is stolen and the higher the cost to put right.</w:t>
             </w:r>
           </w:p>
         </w:tc>
@@ -2678,7 +2735,7 @@
         </w:trPr>
         <w:tc>
           <w:tcPr>
-            <w:tcW w:type="dxa" w:w="2500"/>
+            <w:tcW w:type="dxa" w:w="2300"/>
             <w:tcBorders>
               <w:top w:val="single" w:color="BFC7D5" w:sz="4"/>
               <w:left w:val="single" w:color="BFC7D5" w:sz="4"/>
@@ -2706,69 +2763,69 @@
                 <w:sz w:val="19"/>
                 <w:szCs w:val="19"/>
               </w:rPr>
-              <w:t xml:space="preserve">Compliance and reputation</w:t>
-            </w:r>
-          </w:p>
-        </w:tc>
-        <w:tc>
-          <w:tcPr>
-            <w:tcW w:type="dxa" w:w="3700"/>
-            <w:tcBorders>
-              <w:top w:val="single" w:color="BFC7D5" w:sz="4"/>
-              <w:left w:val="single" w:color="BFC7D5" w:sz="4"/>
-              <w:bottom w:val="single" w:color="BFC7D5" w:sz="4"/>
-              <w:right w:val="single" w:color="BFC7D5" w:sz="4"/>
-            </w:tcBorders>
-            <w:tcMar>
-              <w:top w:type="dxa" w:w="70"/>
-              <w:left w:type="dxa" w:w="110"/>
-              <w:bottom w:type="dxa" w:w="70"/>
-              <w:right w:type="dxa" w:w="110"/>
-            </w:tcMar>
-            <w:vAlign w:val="top"/>
-          </w:tcPr>
-          <w:p>
-            <w:pPr>
-              <w:spacing w:after="50" w:line="260"/>
-            </w:pPr>
-            <w:r>
-              <w:rPr>
-                <w:rFonts w:ascii="Arial" w:cs="Arial" w:eastAsia="Arial" w:hAnsi="Arial"/>
-                <w:sz w:val="19"/>
-                <w:szCs w:val="19"/>
-              </w:rPr>
-              <w:t xml:space="preserve">752 open findings and no periodic assessment.</w:t>
-            </w:r>
-          </w:p>
-        </w:tc>
-        <w:tc>
-          <w:tcPr>
-            <w:tcW w:type="dxa" w:w="3706"/>
-            <w:tcBorders>
-              <w:top w:val="single" w:color="BFC7D5" w:sz="4"/>
-              <w:left w:val="single" w:color="BFC7D5" w:sz="4"/>
-              <w:bottom w:val="single" w:color="BFC7D5" w:sz="4"/>
-              <w:right w:val="single" w:color="BFC7D5" w:sz="4"/>
-            </w:tcBorders>
-            <w:tcMar>
-              <w:top w:type="dxa" w:w="70"/>
-              <w:left w:type="dxa" w:w="110"/>
-              <w:bottom w:type="dxa" w:w="70"/>
-              <w:right w:type="dxa" w:w="110"/>
-            </w:tcMar>
-            <w:vAlign w:val="top"/>
-          </w:tcPr>
-          <w:p>
-            <w:pPr>
-              <w:spacing w:after="50" w:line="260"/>
-            </w:pPr>
-            <w:r>
-              <w:rPr>
-                <w:rFonts w:ascii="Arial" w:cs="Arial" w:eastAsia="Arial" w:hAnsi="Arial"/>
-                <w:sz w:val="19"/>
-                <w:szCs w:val="19"/>
-              </w:rPr>
-              <w:t xml:space="preserve">Reduced customer and auditor confidence.</w:t>
+              <w:t xml:space="preserve">Money and reputation</w:t>
+            </w:r>
+          </w:p>
+        </w:tc>
+        <w:tc>
+          <w:tcPr>
+            <w:tcW w:type="dxa" w:w="3800"/>
+            <w:tcBorders>
+              <w:top w:val="single" w:color="BFC7D5" w:sz="4"/>
+              <w:left w:val="single" w:color="BFC7D5" w:sz="4"/>
+              <w:bottom w:val="single" w:color="BFC7D5" w:sz="4"/>
+              <w:right w:val="single" w:color="BFC7D5" w:sz="4"/>
+            </w:tcBorders>
+            <w:tcMar>
+              <w:top w:type="dxa" w:w="70"/>
+              <w:left w:type="dxa" w:w="110"/>
+              <w:bottom w:type="dxa" w:w="70"/>
+              <w:right w:type="dxa" w:w="110"/>
+            </w:tcMar>
+            <w:vAlign w:val="top"/>
+          </w:tcPr>
+          <w:p>
+            <w:pPr>
+              <w:spacing w:after="50" w:line="260"/>
+            </w:pPr>
+            <w:r>
+              <w:rPr>
+                <w:rFonts w:ascii="Arial" w:cs="Arial" w:eastAsia="Arial" w:hAnsi="Arial"/>
+                <w:sz w:val="19"/>
+                <w:szCs w:val="19"/>
+              </w:rPr>
+              <w:t xml:space="preserve">752 weaknesses remain open and there are no routine checks.</w:t>
+            </w:r>
+          </w:p>
+        </w:tc>
+        <w:tc>
+          <w:tcPr>
+            <w:tcW w:type="dxa" w:w="3806"/>
+            <w:tcBorders>
+              <w:top w:val="single" w:color="BFC7D5" w:sz="4"/>
+              <w:left w:val="single" w:color="BFC7D5" w:sz="4"/>
+              <w:bottom w:val="single" w:color="BFC7D5" w:sz="4"/>
+              <w:right w:val="single" w:color="BFC7D5" w:sz="4"/>
+            </w:tcBorders>
+            <w:tcMar>
+              <w:top w:type="dxa" w:w="70"/>
+              <w:left w:type="dxa" w:w="110"/>
+              <w:bottom w:type="dxa" w:w="70"/>
+              <w:right w:type="dxa" w:w="110"/>
+            </w:tcMar>
+            <w:vAlign w:val="top"/>
+          </w:tcPr>
+          <w:p>
+            <w:pPr>
+              <w:spacing w:after="50" w:line="260"/>
+            </w:pPr>
+            <w:r>
+              <w:rPr>
+                <w:rFonts w:ascii="Arial" w:cs="Arial" w:eastAsia="Arial" w:hAnsi="Arial"/>
+                <w:sz w:val="19"/>
+                <w:szCs w:val="19"/>
+              </w:rPr>
+              <w:t xml:space="preserve">Recovery and downtime costs. Possible regulatory questions. Customers and partners and auditors lose confidence.</w:t>
             </w:r>
           </w:p>
         </w:tc>
@@ -2792,7 +2849,20 @@
           <w:sz w:val="30"/>
           <w:szCs w:val="30"/>
         </w:rPr>
-        <w:t xml:space="preserve">5. Network vulnerabilities</w:t>
+        <w:t xml:space="preserve">5. Network weaknesses</w:t>
+      </w:r>
+    </w:p>
+    <w:p>
+      <w:pPr>
+        <w:spacing w:after="120" w:line="276"/>
+      </w:pPr>
+      <w:r>
+        <w:rPr>
+          <w:rFonts w:ascii="Arial" w:cs="Arial" w:eastAsia="Arial" w:hAnsi="Arial"/>
+          <w:sz w:val="21"/>
+          <w:szCs w:val="21"/>
+        </w:rPr>
+        <w:t xml:space="preserve">These are weaknesses in how computers and servers communicate with each other. Each one is explained in plain words.</w:t>
       </w:r>
     </w:p>
     <w:tbl>
@@ -2846,7 +2916,7 @@
                 <w:sz w:val="21"/>
                 <w:szCs w:val="21"/>
               </w:rPr>
-              <w:t xml:space="preserve">5.1 Remotely exploitable network services   |   CRITICAL / HIGH</w:t>
+              <w:t xml:space="preserve">5.1 Computers that can be taken over from across the network   |   CRITICAL / HIGH</w:t>
             </w:r>
           </w:p>
         </w:tc>
@@ -2916,7 +2986,7 @@
                 <w:sz w:val="19"/>
                 <w:szCs w:val="19"/>
               </w:rPr>
-              <w:t xml:space="preserve">Known remote attacks apply to services on a small number of hosts. EternalBlue (MS17-010) on up to 5 hosts. BlueKeep remote desktop (CVE-2019-0708) on 1. MSMQ QueueJumper (CVE-2023-21554) on 1. SMBv1 on 1. HTTP.sys on 2. Print Spooler on 3. Older remote desktop flaws on up to 5.</w:t>
+              <w:t xml:space="preserve">A few computers have well-known flaws that let an attacker take control over the network with no action from any user. These include EternalBlue (MS17-010) on up to 5 computers and BlueKeep (CVE-2019-0708) on 1 and MSMQ QueueJumper (CVE-2023-21554) on 1 and the old SMBv1 file sharing on 1 and a Windows web server flaw (HTTP.sys) on 2 and Print Spooler on 3 and older remote desktop flaws on up to 5.</w:t>
             </w:r>
           </w:p>
         </w:tc>
@@ -2986,7 +3056,7 @@
                 <w:sz w:val="19"/>
                 <w:szCs w:val="19"/>
               </w:rPr>
-              <w:t xml:space="preserve">Malware or an attacker can take over these hosts over the network without user action and spread to others. WannaCry and Petya spread through the same weaknesses.</w:t>
+              <w:t xml:space="preserve">These are the same weaknesses that spread the WannaCry and Petya attacks. Malware can jump from computer to computer on its own and lock the whole company within hours. Only a few computers are exposed but one is enough to start an outbreak.</w:t>
             </w:r>
           </w:p>
         </w:tc>
@@ -3056,7 +3126,7 @@
                 <w:sz w:val="19"/>
                 <w:szCs w:val="19"/>
               </w:rPr>
-              <w:t xml:space="preserve">Patch or isolate the affected hosts within 24 to 72 hours. Disable SMBv1. Block remote desktop and file sharing ports from user networks and untrusted segments.</w:t>
+              <w:t xml:space="preserve">Patch or isolate these computers within 24 to 72 hours. Switch off SMBv1. Block remote desktop and file sharing between ordinary user networks and servers.</w:t>
             </w:r>
           </w:p>
         </w:tc>
@@ -3118,7 +3188,7 @@
                 <w:sz w:val="21"/>
                 <w:szCs w:val="21"/>
               </w:rPr>
-              <w:t xml:space="preserve">5.2 SMB signing not required   |   HIGH</w:t>
+              <w:t xml:space="preserve">5.2 Staff logins can be copied and reused   |   HIGH</w:t>
             </w:r>
           </w:p>
         </w:tc>
@@ -3188,7 +3258,7 @@
                 <w:sz w:val="19"/>
                 <w:szCs w:val="19"/>
               </w:rPr>
-              <w:t xml:space="preserve">File sharing does not require signed messages on 262 hosts.</w:t>
+              <w:t xml:space="preserve">File sharing (SMB) does not require signed messages on 262 computers.</w:t>
             </w:r>
           </w:p>
         </w:tc>
@@ -3258,7 +3328,7 @@
                 <w:sz w:val="19"/>
                 <w:szCs w:val="19"/>
               </w:rPr>
-              <w:t xml:space="preserve">An attacker on the network can intercept and relay logins (NTLM relay) and reach file shares and servers as a legitimate user and possibly as an administrator.</w:t>
+              <w:t xml:space="preserve">An attacker inside the network can intercept a staff login and reuse it to act as that person. If the login belongs to an administrator they could reach every server.</w:t>
             </w:r>
           </w:p>
         </w:tc>
@@ -3328,7 +3398,7 @@
                 <w:sz w:val="19"/>
                 <w:szCs w:val="19"/>
               </w:rPr>
-              <w:t xml:space="preserve">Require SMB signing on all hosts through Group Policy. Disable NTLM where possible. Restrict which hosts can connect to each other.</w:t>
+              <w:t xml:space="preserve">Require signed messages on all computers through Group Policy. Disable the older NTLM login method where possible. Limit which computers can connect to each other.</w:t>
             </w:r>
           </w:p>
         </w:tc>
@@ -3390,7 +3460,7 @@
                 <w:sz w:val="21"/>
                 <w:szCs w:val="21"/>
               </w:rPr>
-              <w:t xml:space="preserve">5.3 Remote desktop weaknesses   |   HIGH / MEDIUM</w:t>
+              <w:t xml:space="preserve">5.3 Remote desktop is weakly protected   |   HIGH / MEDIUM</w:t>
             </w:r>
           </w:p>
         </w:tc>
@@ -3460,7 +3530,7 @@
                 <w:sz w:val="19"/>
                 <w:szCs w:val="19"/>
               </w:rPr>
-              <w:t xml:space="preserve">Network Level Authentication is not enforced on 8 hosts. A man-in-the-middle weakness is present on 1. A low or medium encryption level is configured on 1.</w:t>
+              <w:t xml:space="preserve">The extra login check for remote desktop (Network Level Authentication) is not enforced on 8 computers. One has a weakness that lets an attacker sit between the user and the computer. One uses low or medium encryption.</w:t>
             </w:r>
           </w:p>
         </w:tc>
@@ -3530,7 +3600,7 @@
                 <w:sz w:val="19"/>
                 <w:szCs w:val="19"/>
               </w:rPr>
-              <w:t xml:space="preserve">Credentials can be attacked or captured by anyone who can reach the service. Weak remote desktop is a common ransomware entry point.</w:t>
+              <w:t xml:space="preserve">Remote desktop is one of the most common doors used by ransomware gangs. Weak protection makes it easier to capture or guess passwords and take over the computer.</w:t>
             </w:r>
           </w:p>
         </w:tc>
@@ -3600,7 +3670,7 @@
                 <w:sz w:val="19"/>
                 <w:szCs w:val="19"/>
               </w:rPr>
-              <w:t xml:space="preserve">Enforce NLA and a high encryption level. Allow remote desktop only through a VPN or gateway from approved addresses. Enable account lockout.</w:t>
+              <w:t xml:space="preserve">Enforce the extra login check and strong encryption. Allow remote desktop only through a VPN or gateway from approved addresses. Lock accounts after repeated failed logins.</w:t>
             </w:r>
           </w:p>
         </w:tc>
@@ -3662,7 +3732,7 @@
                 <w:sz w:val="21"/>
                 <w:szCs w:val="21"/>
               </w:rPr>
-              <w:t xml:space="preserve">5.4 Clear-text and legacy authentication   |   MEDIUM</w:t>
+              <w:t xml:space="preserve">5.4 Passwords sent in readable form   |   MEDIUM</w:t>
             </w:r>
           </w:p>
         </w:tc>
@@ -3732,7 +3802,7 @@
                 <w:sz w:val="19"/>
                 <w:szCs w:val="19"/>
               </w:rPr>
-              <w:t xml:space="preserve">Telnet is enabled on 2 hosts. NTLMv1 is enabled on 1. HTTP TRACE and TRACK are allowed on 4 web servers.</w:t>
+              <w:t xml:space="preserve">Telnet is enabled on 2 computers. The old NTLMv1 login method is enabled on 1. HTTP TRACE and TRACK are allowed on 4 web servers.</w:t>
             </w:r>
           </w:p>
         </w:tc>
@@ -3802,7 +3872,7 @@
                 <w:sz w:val="19"/>
                 <w:szCs w:val="19"/>
               </w:rPr>
-              <w:t xml:space="preserve">Passwords and commands travel as readable text and can be captured. NTLMv1 hashes can be cracked quickly. TRACE can assist session theft.</w:t>
+              <w:t xml:space="preserve">Telnet sends passwords as plain text that anyone on the network can read. NTLMv1 passwords can be cracked quickly. TRACE can help an attacker steal a user’s web session.</w:t>
             </w:r>
           </w:p>
         </w:tc>
@@ -3872,7 +3942,7 @@
                 <w:sz w:val="19"/>
                 <w:szCs w:val="19"/>
               </w:rPr>
-              <w:t xml:space="preserve">Disable Telnet and use SSH. Allow NTLMv2 or Kerberos only. Disable HTTP TRACE and TRACK.</w:t>
+              <w:t xml:space="preserve">Switch off Telnet and use SSH. Allow only NTLMv2 or Kerberos. Switch off HTTP TRACE and TRACK.</w:t>
             </w:r>
           </w:p>
         </w:tc>
@@ -3934,7 +4004,7 @@
                 <w:sz w:val="21"/>
                 <w:szCs w:val="21"/>
               </w:rPr>
-              <w:t xml:space="preserve">5.5 Weak encryption on network services   |   HIGH / MEDIUM</w:t>
+              <w:t xml:space="preserve">5.5 Outdated protection of data in transit   |   HIGH / MEDIUM</w:t>
             </w:r>
           </w:p>
         </w:tc>
@@ -4004,7 +4074,7 @@
                 <w:sz w:val="19"/>
                 <w:szCs w:val="19"/>
               </w:rPr>
-              <w:t xml:space="preserve">TLS 1.0 and 1.1 are allowed on 40 hosts. SWEET32 ciphers on 21. Certificates signed with a weak hash on 4. RC4 on 2. SSL 2 and 3 on 2.</w:t>
+              <w:t xml:space="preserve">Old encryption (TLS 1.0 and 1.1) is allowed on 40 computers. Weak SWEET32 ciphers on 21. Certificates signed with a weak method on 4. RC4 on 2. SSL 2 and 3 on 2.</w:t>
             </w:r>
           </w:p>
         </w:tc>
@@ -4074,7 +4144,7 @@
                 <w:sz w:val="19"/>
                 <w:szCs w:val="19"/>
               </w:rPr>
-              <w:t xml:space="preserve">Captured traffic could be read or altered. A forged certificate could let an attacker impersonate a service.</w:t>
+              <w:t xml:space="preserve">Data moving between systems is protected by methods that are now broken. Someone who captures the traffic could read or change it. A forged certificate could make a fake server look genuine.</w:t>
             </w:r>
           </w:p>
         </w:tc>
@@ -4144,7 +4214,7 @@
                 <w:sz w:val="19"/>
                 <w:szCs w:val="19"/>
               </w:rPr>
-              <w:t xml:space="preserve">Allow TLS 1.2 or higher only. Remove 3DES and RC4 ciphers. Reissue certificates with SHA-256 and RSA 2048 or higher.</w:t>
+              <w:t xml:space="preserve">Allow TLS 1.2 or higher only. Remove 3DES and RC4. Reissue certificates with SHA-256 and RSA 2048 or higher.</w:t>
             </w:r>
           </w:p>
         </w:tc>
@@ -4206,7 +4276,7 @@
                 <w:sz w:val="21"/>
                 <w:szCs w:val="21"/>
               </w:rPr>
-              <w:t xml:space="preserve">5.6 Unrestricted and unsegmented network   |   HIGH</w:t>
+              <w:t xml:space="preserve">5.6 An open network with no internal barriers   |   HIGH</w:t>
             </w:r>
           </w:p>
         </w:tc>
@@ -4276,7 +4346,7 @@
                 <w:sz w:val="19"/>
                 <w:szCs w:val="19"/>
               </w:rPr>
-              <w:t xml:space="preserve">Internet access is unrestricted where it must be blocked. Any user can change a locally set IP address to bypass restrictions. The certificate requires internal segmentation and CCTV network isolation.</w:t>
+              <w:t xml:space="preserve">Internet access is unrestricted where it must be blocked. Any user can change their own IP address to bypass restrictions. The certificate requires internal segmentation and CCTV isolation.</w:t>
             </w:r>
           </w:p>
         </w:tc>
@@ -4346,7 +4416,7 @@
                 <w:sz w:val="19"/>
                 <w:szCs w:val="19"/>
               </w:rPr>
-              <w:t xml:space="preserve">An attacker on one device can reach others. Controls tied to IP addresses can be bypassed. Data can leave the network freely.</w:t>
+              <w:t xml:space="preserve">Everything can reach everything. One infected computer can reach servers and cameras. Rules based on IP addresses can be dodged and company data can be sent out over the internet without hindrance.</w:t>
             </w:r>
           </w:p>
         </w:tc>
@@ -4416,7 +4486,7 @@
                 <w:sz w:val="19"/>
                 <w:szCs w:val="19"/>
               </w:rPr>
-              <w:t xml:space="preserve">Deploy a next-generation firewall with internal segmentation. Isolate CCTV and server networks. Allow only approved ports and services. Assign IP addresses by DHCP reservation with IP and MAC binding. Block unnecessary internet access.</w:t>
+              <w:t xml:space="preserve">Install a next-generation firewall that separates the network into zones. Isolate the CCTV and server networks. Allow only approved ports and services. Hand out IP addresses centrally (DHCP reservation with IP-MAC binding). Block unnecessary internet access.</w:t>
             </w:r>
           </w:p>
         </w:tc>
@@ -4445,7 +4515,20 @@
           <w:sz w:val="30"/>
           <w:szCs w:val="30"/>
         </w:rPr>
-        <w:t xml:space="preserve">6. CCTV vulnerabilities</w:t>
+        <w:t xml:space="preserve">6. CCTV weaknesses</w:t>
+      </w:r>
+    </w:p>
+    <w:p>
+      <w:pPr>
+        <w:spacing w:after="120" w:line="276"/>
+      </w:pPr>
+      <w:r>
+        <w:rPr>
+          <w:rFonts w:ascii="Arial" w:cs="Arial" w:eastAsia="Arial" w:hAnsi="Arial"/>
+          <w:sz w:val="21"/>
+          <w:szCs w:val="21"/>
+        </w:rPr>
+        <w:t xml:space="preserve">There are 22 findings but many are the same issue repeated across devices. Fixing each pattern once clears many together.</w:t>
       </w:r>
     </w:p>
     <w:tbl>
@@ -4537,7 +4620,7 @@
                 <w:sz w:val="19"/>
                 <w:szCs w:val="19"/>
               </w:rPr>
-              <w:t xml:space="preserve">Issue</w:t>
+              <w:t xml:space="preserve">What is wrong</w:t>
             </w:r>
           </w:p>
         </w:tc>
@@ -4572,7 +4655,7 @@
                 <w:sz w:val="19"/>
                 <w:szCs w:val="19"/>
               </w:rPr>
-              <w:t xml:space="preserve">Impact</w:t>
+              <w:t xml:space="preserve">What could happen</w:t>
             </w:r>
           </w:p>
         </w:tc>
@@ -4607,7 +4690,7 @@
                 <w:sz w:val="19"/>
                 <w:szCs w:val="19"/>
               </w:rPr>
-              <w:t xml:space="preserve">Mitigation</w:t>
+              <w:t xml:space="preserve">How to fix it</w:t>
             </w:r>
           </w:p>
         </w:tc>
@@ -4690,7 +4773,7 @@
                 <w:sz w:val="19"/>
                 <w:szCs w:val="19"/>
               </w:rPr>
-              <w:t xml:space="preserve">Ollama AI service is open on the network without authentication.</w:t>
+              <w:t xml:space="preserve">An AI program (Ollama) runs on this device and asks for no password.</w:t>
             </w:r>
           </w:p>
         </w:tc>
@@ -4721,7 +4804,7 @@
                 <w:sz w:val="19"/>
                 <w:szCs w:val="19"/>
               </w:rPr>
-              <w:t xml:space="preserve">Anyone on the network can use the service or use it to move further in.</w:t>
+              <w:t xml:space="preserve">Anyone on the network can use it and misuse it or use it as a stepping stone to other systems.</w:t>
             </w:r>
           </w:p>
         </w:tc>
@@ -4752,7 +4835,7 @@
                 <w:sz w:val="19"/>
                 <w:szCs w:val="19"/>
               </w:rPr>
-              <w:t xml:space="preserve">Add authentication or place it behind a protected gateway. Restrict access to approved addresses.</w:t>
+              <w:t xml:space="preserve">Add a login or place it behind a protected gateway. Allow access only from approved addresses.</w:t>
             </w:r>
           </w:p>
         </w:tc>
@@ -4835,7 +4918,7 @@
                 <w:sz w:val="19"/>
                 <w:szCs w:val="19"/>
               </w:rPr>
-              <w:t xml:space="preserve">SSL versions 2 and 3 are enabled.</w:t>
+              <w:t xml:space="preserve">The device uses very old and broken protection (SSL versions 2 and 3).</w:t>
             </w:r>
           </w:p>
         </w:tc>
@@ -4866,7 +4949,7 @@
                 <w:sz w:val="19"/>
                 <w:szCs w:val="19"/>
               </w:rPr>
-              <w:t xml:space="preserve">Traffic such as camera feeds and logins can be read or altered.</w:t>
+              <w:t xml:space="preserve">Camera feeds and login details passing through it could be read or changed.</w:t>
             </w:r>
           </w:p>
         </w:tc>
@@ -4897,7 +4980,7 @@
                 <w:sz w:val="19"/>
                 <w:szCs w:val="19"/>
               </w:rPr>
-              <w:t xml:space="preserve">Disable SSL 2 and 3. Allow TLS 1.2 or higher only.</w:t>
+              <w:t xml:space="preserve">Switch off SSL 2 and 3. Allow TLS 1.2 or higher only.</w:t>
             </w:r>
           </w:p>
         </w:tc>
@@ -4980,7 +5063,7 @@
                 <w:sz w:val="19"/>
                 <w:szCs w:val="19"/>
               </w:rPr>
-              <w:t xml:space="preserve">Outdated Dropbear and OpenSSH servers (Dropbear before 2016.72 and OpenSSH before 10.5).</w:t>
+              <w:t xml:space="preserve">The remote access software is very old with publicly known flaws (Dropbear before 2016.72 and OpenSSH before 10.5).</w:t>
             </w:r>
           </w:p>
         </w:tc>
@@ -5011,7 +5094,7 @@
                 <w:sz w:val="19"/>
                 <w:szCs w:val="19"/>
               </w:rPr>
-              <w:t xml:space="preserve">Known flaws allow takeover of the device and access to recordings.</w:t>
+              <w:t xml:space="preserve">An attacker could take full control of the device and watch or delete recordings and use it to reach other equipment.</w:t>
             </w:r>
           </w:p>
         </w:tc>
@@ -5042,7 +5125,7 @@
                 <w:sz w:val="19"/>
                 <w:szCs w:val="19"/>
               </w:rPr>
-              <w:t xml:space="preserve">Update firmware or replace the unit. Allow SSH only from an administrator network.</w:t>
+              <w:t xml:space="preserve">Update the firmware or replace the unit. Allow remote access only from an administrator network.</w:t>
             </w:r>
           </w:p>
         </w:tc>
@@ -5125,7 +5208,7 @@
                 <w:sz w:val="19"/>
                 <w:szCs w:val="19"/>
               </w:rPr>
-              <w:t xml:space="preserve">SWEET32 weak ciphers (3DES and 64-bit).</w:t>
+              <w:t xml:space="preserve">Data is protected with an older method (3DES and other 64-bit ciphers).</w:t>
             </w:r>
           </w:p>
         </w:tc>
@@ -5156,7 +5239,7 @@
                 <w:sz w:val="19"/>
                 <w:szCs w:val="19"/>
               </w:rPr>
-              <w:t xml:space="preserve">Long sessions can leak parts of encrypted traffic.</w:t>
+              <w:t xml:space="preserve">Someone collecting traffic for long enough could piece together parts of it including sensitive details.</w:t>
             </w:r>
           </w:p>
         </w:tc>
@@ -5270,7 +5353,7 @@
                 <w:sz w:val="19"/>
                 <w:szCs w:val="19"/>
               </w:rPr>
-              <w:t xml:space="preserve">Telnet is enabled.</w:t>
+              <w:t xml:space="preserve">Telnet sends passwords and commands as plain text.</w:t>
             </w:r>
           </w:p>
         </w:tc>
@@ -5301,7 +5384,7 @@
                 <w:sz w:val="19"/>
                 <w:szCs w:val="19"/>
               </w:rPr>
-              <w:t xml:space="preserve">Passwords and commands are exposed as clear text. The gateway links many cameras.</w:t>
+              <w:t xml:space="preserve">Anyone listening can read the administrator password and log in. The gateway links many cameras so it matters most.</w:t>
             </w:r>
           </w:p>
         </w:tc>
@@ -5332,7 +5415,7 @@
                 <w:sz w:val="19"/>
                 <w:szCs w:val="19"/>
               </w:rPr>
-              <w:t xml:space="preserve">Disable Telnet and use SSH.</w:t>
+              <w:t xml:space="preserve">Switch off Telnet and use SSH.</w:t>
             </w:r>
           </w:p>
         </w:tc>
@@ -5415,7 +5498,7 @@
                 <w:sz w:val="19"/>
                 <w:szCs w:val="19"/>
               </w:rPr>
-              <w:t xml:space="preserve">Certificates use SHA-1 and RC4 is allowed.</w:t>
+              <w:t xml:space="preserve">Security certificates (digital ID cards) use an outdated signature (SHA-1) and old RC4 protection is allowed.</w:t>
             </w:r>
           </w:p>
         </w:tc>
@@ -5446,7 +5529,7 @@
                 <w:sz w:val="19"/>
                 <w:szCs w:val="19"/>
               </w:rPr>
-              <w:t xml:space="preserve">A forged certificate can impersonate a device. Traffic can be read.</w:t>
+              <w:t xml:space="preserve">A fake device could pass itself off as a real camera or recorder. Traffic could be read.</w:t>
             </w:r>
           </w:p>
         </w:tc>
@@ -5477,7 +5560,7 @@
                 <w:sz w:val="19"/>
                 <w:szCs w:val="19"/>
               </w:rPr>
-              <w:t xml:space="preserve">Reissue certificates with SHA-256. Disable RC4.</w:t>
+              <w:t xml:space="preserve">Reissue certificates with SHA-256. Switch off RC4.</w:t>
             </w:r>
           </w:p>
         </w:tc>
@@ -5591,7 +5674,7 @@
                 <w:sz w:val="19"/>
                 <w:szCs w:val="19"/>
               </w:rPr>
-              <w:t xml:space="preserve">Devices cannot be properly trusted and impersonation is easier.</w:t>
+              <w:t xml:space="preserve">The devices can no longer be properly trusted and warnings get ignored which makes faking them easier.</w:t>
             </w:r>
           </w:p>
         </w:tc>
@@ -5705,7 +5788,7 @@
                 <w:sz w:val="19"/>
                 <w:szCs w:val="19"/>
               </w:rPr>
-              <w:t xml:space="preserve">SSH Terrapin weakness (CVE-2023-48795).</w:t>
+              <w:t xml:space="preserve">Remote access has a known weakness called Terrapin (CVE-2023-48795).</w:t>
             </w:r>
           </w:p>
         </w:tc>
@@ -5736,7 +5819,7 @@
                 <w:sz w:val="19"/>
                 <w:szCs w:val="19"/>
               </w:rPr>
-              <w:t xml:space="preserve">An attacker on the network can weaken the SSH connection.</w:t>
+              <w:t xml:space="preserve">Someone already on the network could weaken or interfere with a remote session.</w:t>
             </w:r>
           </w:p>
         </w:tc>
@@ -5767,7 +5850,7 @@
                 <w:sz w:val="19"/>
                 <w:szCs w:val="19"/>
               </w:rPr>
-              <w:t xml:space="preserve">Update SSH software and disable the affected ciphers.</w:t>
+              <w:t xml:space="preserve">Update the SSH software and switch off the affected settings.</w:t>
             </w:r>
           </w:p>
         </w:tc>
@@ -5850,7 +5933,7 @@
                 <w:sz w:val="19"/>
                 <w:szCs w:val="19"/>
               </w:rPr>
-              <w:t xml:space="preserve">TLS 1.0 and 1.1 are allowed. 192.168.0.223 also allows export-grade ciphers (FREAK).</w:t>
+              <w:t xml:space="preserve">Old TLS 1.0 and 1.1 are allowed. 192.168.0.223 also allows export-grade ciphers (FREAK).</w:t>
             </w:r>
           </w:p>
         </w:tc>
@@ -5881,7 +5964,7 @@
                 <w:sz w:val="19"/>
                 <w:szCs w:val="19"/>
               </w:rPr>
-              <w:t xml:space="preserve">Weaker protection of data and logins.</w:t>
+              <w:t xml:space="preserve">Data and logins are less well protected.</w:t>
             </w:r>
           </w:p>
         </w:tc>
@@ -5995,7 +6078,7 @@
                 <w:sz w:val="19"/>
                 <w:szCs w:val="19"/>
               </w:rPr>
-              <w:t xml:space="preserve">RSA keys under 2048 bits. Weak SSH ciphers and key exchange and MAC settings on 3 devices.</w:t>
+              <w:t xml:space="preserve">Short encryption keys (under 2048 bits). Weak SSH settings on 3 devices.</w:t>
             </w:r>
           </w:p>
         </w:tc>
@@ -6026,7 +6109,7 @@
                 <w:sz w:val="19"/>
                 <w:szCs w:val="19"/>
               </w:rPr>
-              <w:t xml:space="preserve">Reduced encryption strength.</w:t>
+              <w:t xml:space="preserve">On their own they do little harm but they make an attacker’s job easier.</w:t>
             </w:r>
           </w:p>
         </w:tc>
@@ -6057,7 +6140,7 @@
                 <w:sz w:val="19"/>
                 <w:szCs w:val="19"/>
               </w:rPr>
-              <w:t xml:space="preserve">Use RSA 2048 or higher. Allow modern SSH algorithms only.</w:t>
+              <w:t xml:space="preserve">Use RSA 2048 or higher. Allow modern SSH settings only.</w:t>
             </w:r>
           </w:p>
         </w:tc>
@@ -6095,7 +6178,7 @@
           <w:sz w:val="21"/>
           <w:szCs w:val="21"/>
         </w:rPr>
-        <w:t xml:space="preserve">The certificate sets out six mandatory recommendations. They are listed in order of implementation priority. EDR or XDR deployment and next-generation firewall installation come first.</w:t>
+        <w:t xml:space="preserve">The certificate sets out six mandatory recommendations. They are listed in order of implementation priority. Security monitoring software and the firewall come first because they detect attacks and stop them spreading.</w:t>
       </w:r>
     </w:p>
     <w:tbl>
@@ -6113,8 +6196,8 @@
       <w:tblGrid>
         <w:gridCol w:w="900"/>
         <w:gridCol w:w="2100"/>
-        <w:gridCol w:w="4100"/>
-        <w:gridCol w:w="2806"/>
+        <w:gridCol w:w="3900"/>
+        <w:gridCol w:w="3006"/>
       </w:tblGrid>
       <w:tr>
         <w:trPr>
@@ -6193,7 +6276,7 @@
         </w:tc>
         <w:tc>
           <w:tcPr>
-            <w:tcW w:type="dxa" w:w="4100"/>
+            <w:tcW w:type="dxa" w:w="3900"/>
             <w:tcBorders>
               <w:top w:val="single" w:color="BFC7D5" w:sz="4"/>
               <w:left w:val="single" w:color="BFC7D5" w:sz="4"/>
@@ -6222,13 +6305,13 @@
                 <w:sz w:val="19"/>
                 <w:szCs w:val="19"/>
               </w:rPr>
-              <w:t xml:space="preserve">Requirement</w:t>
-            </w:r>
-          </w:p>
-        </w:tc>
-        <w:tc>
-          <w:tcPr>
-            <w:tcW w:type="dxa" w:w="2806"/>
+              <w:t xml:space="preserve">What must be done</w:t>
+            </w:r>
+          </w:p>
+        </w:tc>
+        <w:tc>
+          <w:tcPr>
+            <w:tcW w:type="dxa" w:w="3006"/>
             <w:tcBorders>
               <w:top w:val="single" w:color="BFC7D5" w:sz="4"/>
               <w:left w:val="single" w:color="BFC7D5" w:sz="4"/>
@@ -6257,7 +6340,7 @@
                 <w:sz w:val="19"/>
                 <w:szCs w:val="19"/>
               </w:rPr>
-              <w:t xml:space="preserve">Risk addressed</w:t>
+              <w:t xml:space="preserve">Why it matters</w:t>
             </w:r>
           </w:p>
         </w:tc>
@@ -6335,63 +6418,63 @@
         </w:tc>
         <w:tc>
           <w:tcPr>
-            <w:tcW w:type="dxa" w:w="4100"/>
-            <w:tcBorders>
-              <w:top w:val="single" w:color="BFC7D5" w:sz="4"/>
-              <w:left w:val="single" w:color="BFC7D5" w:sz="4"/>
-              <w:bottom w:val="single" w:color="BFC7D5" w:sz="4"/>
-              <w:right w:val="single" w:color="BFC7D5" w:sz="4"/>
-            </w:tcBorders>
-            <w:tcMar>
-              <w:top w:type="dxa" w:w="70"/>
-              <w:left w:type="dxa" w:w="110"/>
-              <w:bottom w:type="dxa" w:w="70"/>
-              <w:right w:type="dxa" w:w="110"/>
-            </w:tcMar>
-            <w:vAlign w:val="top"/>
-          </w:tcPr>
-          <w:p>
-            <w:pPr>
-              <w:spacing w:after="50" w:line="260"/>
-            </w:pPr>
-            <w:r>
-              <w:rPr>
-                <w:rFonts w:ascii="Arial" w:cs="Arial" w:eastAsia="Arial" w:hAnsi="Arial"/>
-                <w:sz w:val="19"/>
-                <w:szCs w:val="19"/>
-              </w:rPr>
-              <w:t xml:space="preserve">An EDR or XDR solution must be deployed on all endpoints and servers with centralised monitoring and automated containment.</w:t>
-            </w:r>
-          </w:p>
-        </w:tc>
-        <w:tc>
-          <w:tcPr>
-            <w:tcW w:type="dxa" w:w="2806"/>
-            <w:tcBorders>
-              <w:top w:val="single" w:color="BFC7D5" w:sz="4"/>
-              <w:left w:val="single" w:color="BFC7D5" w:sz="4"/>
-              <w:bottom w:val="single" w:color="BFC7D5" w:sz="4"/>
-              <w:right w:val="single" w:color="BFC7D5" w:sz="4"/>
-            </w:tcBorders>
-            <w:tcMar>
-              <w:top w:type="dxa" w:w="70"/>
-              <w:left w:type="dxa" w:w="110"/>
-              <w:bottom w:type="dxa" w:w="70"/>
-              <w:right w:type="dxa" w:w="110"/>
-            </w:tcMar>
-            <w:vAlign w:val="top"/>
-          </w:tcPr>
-          <w:p>
-            <w:pPr>
-              <w:spacing w:after="50" w:line="260"/>
-            </w:pPr>
-            <w:r>
-              <w:rPr>
-                <w:rFonts w:ascii="Arial" w:cs="Arial" w:eastAsia="Arial" w:hAnsi="Arial"/>
-                <w:sz w:val="19"/>
-                <w:szCs w:val="19"/>
-              </w:rPr>
-              <w:t xml:space="preserve">Undetected malware and intrusion.</w:t>
+            <w:tcW w:type="dxa" w:w="3900"/>
+            <w:tcBorders>
+              <w:top w:val="single" w:color="BFC7D5" w:sz="4"/>
+              <w:left w:val="single" w:color="BFC7D5" w:sz="4"/>
+              <w:bottom w:val="single" w:color="BFC7D5" w:sz="4"/>
+              <w:right w:val="single" w:color="BFC7D5" w:sz="4"/>
+            </w:tcBorders>
+            <w:tcMar>
+              <w:top w:type="dxa" w:w="70"/>
+              <w:left w:type="dxa" w:w="110"/>
+              <w:bottom w:type="dxa" w:w="70"/>
+              <w:right w:type="dxa" w:w="110"/>
+            </w:tcMar>
+            <w:vAlign w:val="top"/>
+          </w:tcPr>
+          <w:p>
+            <w:pPr>
+              <w:spacing w:after="50" w:line="260"/>
+            </w:pPr>
+            <w:r>
+              <w:rPr>
+                <w:rFonts w:ascii="Arial" w:cs="Arial" w:eastAsia="Arial" w:hAnsi="Arial"/>
+                <w:sz w:val="19"/>
+                <w:szCs w:val="19"/>
+              </w:rPr>
+              <w:t xml:space="preserve">Deploy EDR or XDR security monitoring software on all endpoints and servers with centralised monitoring and automated containment.</w:t>
+            </w:r>
+          </w:p>
+        </w:tc>
+        <w:tc>
+          <w:tcPr>
+            <w:tcW w:type="dxa" w:w="3006"/>
+            <w:tcBorders>
+              <w:top w:val="single" w:color="BFC7D5" w:sz="4"/>
+              <w:left w:val="single" w:color="BFC7D5" w:sz="4"/>
+              <w:bottom w:val="single" w:color="BFC7D5" w:sz="4"/>
+              <w:right w:val="single" w:color="BFC7D5" w:sz="4"/>
+            </w:tcBorders>
+            <w:tcMar>
+              <w:top w:type="dxa" w:w="70"/>
+              <w:left w:type="dxa" w:w="110"/>
+              <w:bottom w:type="dxa" w:w="70"/>
+              <w:right w:type="dxa" w:w="110"/>
+            </w:tcMar>
+            <w:vAlign w:val="top"/>
+          </w:tcPr>
+          <w:p>
+            <w:pPr>
+              <w:spacing w:after="50" w:line="260"/>
+            </w:pPr>
+            <w:r>
+              <w:rPr>
+                <w:rFonts w:ascii="Arial" w:cs="Arial" w:eastAsia="Arial" w:hAnsi="Arial"/>
+                <w:sz w:val="19"/>
+                <w:szCs w:val="19"/>
+              </w:rPr>
+              <w:t xml:space="preserve">Attacks are spotted and stopped within minutes instead of running unseen for weeks.</w:t>
             </w:r>
           </w:p>
         </w:tc>
@@ -6469,63 +6552,63 @@
         </w:tc>
         <w:tc>
           <w:tcPr>
-            <w:tcW w:type="dxa" w:w="4100"/>
-            <w:tcBorders>
-              <w:top w:val="single" w:color="BFC7D5" w:sz="4"/>
-              <w:left w:val="single" w:color="BFC7D5" w:sz="4"/>
-              <w:bottom w:val="single" w:color="BFC7D5" w:sz="4"/>
-              <w:right w:val="single" w:color="BFC7D5" w:sz="4"/>
-            </w:tcBorders>
-            <w:tcMar>
-              <w:top w:type="dxa" w:w="70"/>
-              <w:left w:type="dxa" w:w="110"/>
-              <w:bottom w:type="dxa" w:w="70"/>
-              <w:right w:type="dxa" w:w="110"/>
-            </w:tcMar>
-            <w:vAlign w:val="top"/>
-          </w:tcPr>
-          <w:p>
-            <w:pPr>
-              <w:spacing w:after="50" w:line="260"/>
-            </w:pPr>
-            <w:r>
-              <w:rPr>
-                <w:rFonts w:ascii="Arial" w:cs="Arial" w:eastAsia="Arial" w:hAnsi="Arial"/>
-                <w:sz w:val="19"/>
-                <w:szCs w:val="19"/>
-              </w:rPr>
-              <w:t xml:space="preserve">A next-generation firewall (NGFW) with internal segmentation must be implemented. The CCTV network must be isolated. Only approved ports and services allowed and unnecessary internet access blocked.</w:t>
-            </w:r>
-          </w:p>
-        </w:tc>
-        <w:tc>
-          <w:tcPr>
-            <w:tcW w:type="dxa" w:w="2806"/>
-            <w:tcBorders>
-              <w:top w:val="single" w:color="BFC7D5" w:sz="4"/>
-              <w:left w:val="single" w:color="BFC7D5" w:sz="4"/>
-              <w:bottom w:val="single" w:color="BFC7D5" w:sz="4"/>
-              <w:right w:val="single" w:color="BFC7D5" w:sz="4"/>
-            </w:tcBorders>
-            <w:tcMar>
-              <w:top w:type="dxa" w:w="70"/>
-              <w:left w:type="dxa" w:w="110"/>
-              <w:bottom w:type="dxa" w:w="70"/>
-              <w:right w:type="dxa" w:w="110"/>
-            </w:tcMar>
-            <w:vAlign w:val="top"/>
-          </w:tcPr>
-          <w:p>
-            <w:pPr>
-              <w:spacing w:after="50" w:line="260"/>
-            </w:pPr>
-            <w:r>
-              <w:rPr>
-                <w:rFonts w:ascii="Arial" w:cs="Arial" w:eastAsia="Arial" w:hAnsi="Arial"/>
-                <w:sz w:val="19"/>
-                <w:szCs w:val="19"/>
-              </w:rPr>
-              <w:t xml:space="preserve">Lateral movement and data exfiltration.</w:t>
+            <w:tcW w:type="dxa" w:w="3900"/>
+            <w:tcBorders>
+              <w:top w:val="single" w:color="BFC7D5" w:sz="4"/>
+              <w:left w:val="single" w:color="BFC7D5" w:sz="4"/>
+              <w:bottom w:val="single" w:color="BFC7D5" w:sz="4"/>
+              <w:right w:val="single" w:color="BFC7D5" w:sz="4"/>
+            </w:tcBorders>
+            <w:tcMar>
+              <w:top w:type="dxa" w:w="70"/>
+              <w:left w:type="dxa" w:w="110"/>
+              <w:bottom w:type="dxa" w:w="70"/>
+              <w:right w:type="dxa" w:w="110"/>
+            </w:tcMar>
+            <w:vAlign w:val="top"/>
+          </w:tcPr>
+          <w:p>
+            <w:pPr>
+              <w:spacing w:after="50" w:line="260"/>
+            </w:pPr>
+            <w:r>
+              <w:rPr>
+                <w:rFonts w:ascii="Arial" w:cs="Arial" w:eastAsia="Arial" w:hAnsi="Arial"/>
+                <w:sz w:val="19"/>
+                <w:szCs w:val="19"/>
+              </w:rPr>
+              <w:t xml:space="preserve">Implement a next-generation firewall (NGFW) with internal segmentation. Isolate the CCTV network. Allow only approved ports and services and block unnecessary internet access.</w:t>
+            </w:r>
+          </w:p>
+        </w:tc>
+        <w:tc>
+          <w:tcPr>
+            <w:tcW w:type="dxa" w:w="3006"/>
+            <w:tcBorders>
+              <w:top w:val="single" w:color="BFC7D5" w:sz="4"/>
+              <w:left w:val="single" w:color="BFC7D5" w:sz="4"/>
+              <w:bottom w:val="single" w:color="BFC7D5" w:sz="4"/>
+              <w:right w:val="single" w:color="BFC7D5" w:sz="4"/>
+            </w:tcBorders>
+            <w:tcMar>
+              <w:top w:type="dxa" w:w="70"/>
+              <w:left w:type="dxa" w:w="110"/>
+              <w:bottom w:type="dxa" w:w="70"/>
+              <w:right w:type="dxa" w:w="110"/>
+            </w:tcMar>
+            <w:vAlign w:val="top"/>
+          </w:tcPr>
+          <w:p>
+            <w:pPr>
+              <w:spacing w:after="50" w:line="260"/>
+            </w:pPr>
+            <w:r>
+              <w:rPr>
+                <w:rFonts w:ascii="Arial" w:cs="Arial" w:eastAsia="Arial" w:hAnsi="Arial"/>
+                <w:sz w:val="19"/>
+                <w:szCs w:val="19"/>
+              </w:rPr>
+              <w:t xml:space="preserve">A problem in one place can no longer spread everywhere. Data cannot freely leave.</w:t>
             </w:r>
           </w:p>
         </w:tc>
@@ -6603,63 +6686,63 @@
         </w:tc>
         <w:tc>
           <w:tcPr>
-            <w:tcW w:type="dxa" w:w="4100"/>
-            <w:tcBorders>
-              <w:top w:val="single" w:color="BFC7D5" w:sz="4"/>
-              <w:left w:val="single" w:color="BFC7D5" w:sz="4"/>
-              <w:bottom w:val="single" w:color="BFC7D5" w:sz="4"/>
-              <w:right w:val="single" w:color="BFC7D5" w:sz="4"/>
-            </w:tcBorders>
-            <w:tcMar>
-              <w:top w:type="dxa" w:w="70"/>
-              <w:left w:type="dxa" w:w="110"/>
-              <w:bottom w:type="dxa" w:w="70"/>
-              <w:right w:type="dxa" w:w="110"/>
-            </w:tcMar>
-            <w:vAlign w:val="top"/>
-          </w:tcPr>
-          <w:p>
-            <w:pPr>
-              <w:spacing w:after="50" w:line="260"/>
-            </w:pPr>
-            <w:r>
-              <w:rPr>
-                <w:rFonts w:ascii="Arial" w:cs="Arial" w:eastAsia="Arial" w:hAnsi="Arial"/>
-                <w:sz w:val="19"/>
-                <w:szCs w:val="19"/>
-              </w:rPr>
-              <w:t xml:space="preserve">Critical and High risk vulnerabilities must be remediated immediately. Medium and Low risk vulnerabilities must be closed within a defined timeline.</w:t>
-            </w:r>
-          </w:p>
-        </w:tc>
-        <w:tc>
-          <w:tcPr>
-            <w:tcW w:type="dxa" w:w="2806"/>
-            <w:tcBorders>
-              <w:top w:val="single" w:color="BFC7D5" w:sz="4"/>
-              <w:left w:val="single" w:color="BFC7D5" w:sz="4"/>
-              <w:bottom w:val="single" w:color="BFC7D5" w:sz="4"/>
-              <w:right w:val="single" w:color="BFC7D5" w:sz="4"/>
-            </w:tcBorders>
-            <w:tcMar>
-              <w:top w:type="dxa" w:w="70"/>
-              <w:left w:type="dxa" w:w="110"/>
-              <w:bottom w:type="dxa" w:w="70"/>
-              <w:right w:type="dxa" w:w="110"/>
-            </w:tcMar>
-            <w:vAlign w:val="top"/>
-          </w:tcPr>
-          <w:p>
-            <w:pPr>
-              <w:spacing w:after="50" w:line="260"/>
-            </w:pPr>
-            <w:r>
-              <w:rPr>
-                <w:rFonts w:ascii="Arial" w:cs="Arial" w:eastAsia="Arial" w:hAnsi="Arial"/>
-                <w:sz w:val="19"/>
-                <w:szCs w:val="19"/>
-              </w:rPr>
-              <w:t xml:space="preserve">The 600 Critical and High findings.</w:t>
+            <w:tcW w:type="dxa" w:w="3900"/>
+            <w:tcBorders>
+              <w:top w:val="single" w:color="BFC7D5" w:sz="4"/>
+              <w:left w:val="single" w:color="BFC7D5" w:sz="4"/>
+              <w:bottom w:val="single" w:color="BFC7D5" w:sz="4"/>
+              <w:right w:val="single" w:color="BFC7D5" w:sz="4"/>
+            </w:tcBorders>
+            <w:tcMar>
+              <w:top w:type="dxa" w:w="70"/>
+              <w:left w:type="dxa" w:w="110"/>
+              <w:bottom w:type="dxa" w:w="70"/>
+              <w:right w:type="dxa" w:w="110"/>
+            </w:tcMar>
+            <w:vAlign w:val="top"/>
+          </w:tcPr>
+          <w:p>
+            <w:pPr>
+              <w:spacing w:after="50" w:line="260"/>
+            </w:pPr>
+            <w:r>
+              <w:rPr>
+                <w:rFonts w:ascii="Arial" w:cs="Arial" w:eastAsia="Arial" w:hAnsi="Arial"/>
+                <w:sz w:val="19"/>
+                <w:szCs w:val="19"/>
+              </w:rPr>
+              <w:t xml:space="preserve">Remediate Critical and High risk vulnerabilities immediately. Close Medium and Low risk vulnerabilities within a defined timeline.</w:t>
+            </w:r>
+          </w:p>
+        </w:tc>
+        <w:tc>
+          <w:tcPr>
+            <w:tcW w:type="dxa" w:w="3006"/>
+            <w:tcBorders>
+              <w:top w:val="single" w:color="BFC7D5" w:sz="4"/>
+              <w:left w:val="single" w:color="BFC7D5" w:sz="4"/>
+              <w:bottom w:val="single" w:color="BFC7D5" w:sz="4"/>
+              <w:right w:val="single" w:color="BFC7D5" w:sz="4"/>
+            </w:tcBorders>
+            <w:tcMar>
+              <w:top w:type="dxa" w:w="70"/>
+              <w:left w:type="dxa" w:w="110"/>
+              <w:bottom w:type="dxa" w:w="70"/>
+              <w:right w:type="dxa" w:w="110"/>
+            </w:tcMar>
+            <w:vAlign w:val="top"/>
+          </w:tcPr>
+          <w:p>
+            <w:pPr>
+              <w:spacing w:after="50" w:line="260"/>
+            </w:pPr>
+            <w:r>
+              <w:rPr>
+                <w:rFonts w:ascii="Arial" w:cs="Arial" w:eastAsia="Arial" w:hAnsi="Arial"/>
+                <w:sz w:val="19"/>
+                <w:szCs w:val="19"/>
+              </w:rPr>
+              <w:t xml:space="preserve">Closes the 600 doors an attacker is most likely to use.</w:t>
             </w:r>
           </w:p>
         </w:tc>
@@ -6737,63 +6820,63 @@
         </w:tc>
         <w:tc>
           <w:tcPr>
-            <w:tcW w:type="dxa" w:w="4100"/>
-            <w:tcBorders>
-              <w:top w:val="single" w:color="BFC7D5" w:sz="4"/>
-              <w:left w:val="single" w:color="BFC7D5" w:sz="4"/>
-              <w:bottom w:val="single" w:color="BFC7D5" w:sz="4"/>
-              <w:right w:val="single" w:color="BFC7D5" w:sz="4"/>
-            </w:tcBorders>
-            <w:tcMar>
-              <w:top w:type="dxa" w:w="70"/>
-              <w:left w:type="dxa" w:w="110"/>
-              <w:bottom w:type="dxa" w:w="70"/>
-              <w:right w:type="dxa" w:w="110"/>
-            </w:tcMar>
-            <w:vAlign w:val="top"/>
-          </w:tcPr>
-          <w:p>
-            <w:pPr>
-              <w:spacing w:after="50" w:line="260"/>
-            </w:pPr>
-            <w:r>
-              <w:rPr>
-                <w:rFonts w:ascii="Arial" w:cs="Arial" w:eastAsia="Arial" w:hAnsi="Arial"/>
-                <w:sz w:val="19"/>
-                <w:szCs w:val="19"/>
-              </w:rPr>
-              <w:t xml:space="preserve">IP addresses must be assigned centrally via DHCP reservation with IP-MAC binding. Hostnames and labels and the asset inventory must be standardised.</w:t>
-            </w:r>
-          </w:p>
-        </w:tc>
-        <w:tc>
-          <w:tcPr>
-            <w:tcW w:type="dxa" w:w="2806"/>
-            <w:tcBorders>
-              <w:top w:val="single" w:color="BFC7D5" w:sz="4"/>
-              <w:left w:val="single" w:color="BFC7D5" w:sz="4"/>
-              <w:bottom w:val="single" w:color="BFC7D5" w:sz="4"/>
-              <w:right w:val="single" w:color="BFC7D5" w:sz="4"/>
-            </w:tcBorders>
-            <w:tcMar>
-              <w:top w:type="dxa" w:w="70"/>
-              <w:left w:type="dxa" w:w="110"/>
-              <w:bottom w:type="dxa" w:w="70"/>
-              <w:right w:type="dxa" w:w="110"/>
-            </w:tcMar>
-            <w:vAlign w:val="top"/>
-          </w:tcPr>
-          <w:p>
-            <w:pPr>
-              <w:spacing w:after="50" w:line="260"/>
-            </w:pPr>
-            <w:r>
-              <w:rPr>
-                <w:rFonts w:ascii="Arial" w:cs="Arial" w:eastAsia="Arial" w:hAnsi="Arial"/>
-                <w:sz w:val="19"/>
-                <w:szCs w:val="19"/>
-              </w:rPr>
-              <w:t xml:space="preserve">Bypass of restrictions and unknown devices.</w:t>
+            <w:tcW w:type="dxa" w:w="3900"/>
+            <w:tcBorders>
+              <w:top w:val="single" w:color="BFC7D5" w:sz="4"/>
+              <w:left w:val="single" w:color="BFC7D5" w:sz="4"/>
+              <w:bottom w:val="single" w:color="BFC7D5" w:sz="4"/>
+              <w:right w:val="single" w:color="BFC7D5" w:sz="4"/>
+            </w:tcBorders>
+            <w:tcMar>
+              <w:top w:type="dxa" w:w="70"/>
+              <w:left w:type="dxa" w:w="110"/>
+              <w:bottom w:type="dxa" w:w="70"/>
+              <w:right w:type="dxa" w:w="110"/>
+            </w:tcMar>
+            <w:vAlign w:val="top"/>
+          </w:tcPr>
+          <w:p>
+            <w:pPr>
+              <w:spacing w:after="50" w:line="260"/>
+            </w:pPr>
+            <w:r>
+              <w:rPr>
+                <w:rFonts w:ascii="Arial" w:cs="Arial" w:eastAsia="Arial" w:hAnsi="Arial"/>
+                <w:sz w:val="19"/>
+                <w:szCs w:val="19"/>
+              </w:rPr>
+              <w:t xml:space="preserve">Assign IP addresses centrally via DHCP reservation with IP-MAC binding. Standardise hostnames and labels and the asset inventory.</w:t>
+            </w:r>
+          </w:p>
+        </w:tc>
+        <w:tc>
+          <w:tcPr>
+            <w:tcW w:type="dxa" w:w="3006"/>
+            <w:tcBorders>
+              <w:top w:val="single" w:color="BFC7D5" w:sz="4"/>
+              <w:left w:val="single" w:color="BFC7D5" w:sz="4"/>
+              <w:bottom w:val="single" w:color="BFC7D5" w:sz="4"/>
+              <w:right w:val="single" w:color="BFC7D5" w:sz="4"/>
+            </w:tcBorders>
+            <w:tcMar>
+              <w:top w:type="dxa" w:w="70"/>
+              <w:left w:type="dxa" w:w="110"/>
+              <w:bottom w:type="dxa" w:w="70"/>
+              <w:right w:type="dxa" w:w="110"/>
+            </w:tcMar>
+            <w:vAlign w:val="top"/>
+          </w:tcPr>
+          <w:p>
+            <w:pPr>
+              <w:spacing w:after="50" w:line="260"/>
+            </w:pPr>
+            <w:r>
+              <w:rPr>
+                <w:rFonts w:ascii="Arial" w:cs="Arial" w:eastAsia="Arial" w:hAnsi="Arial"/>
+                <w:sz w:val="19"/>
+                <w:szCs w:val="19"/>
+              </w:rPr>
+              <w:t xml:space="preserve">Users cannot dodge restrictions and unknown devices stand out.</w:t>
             </w:r>
           </w:p>
         </w:tc>
@@ -6871,63 +6954,63 @@
         </w:tc>
         <w:tc>
           <w:tcPr>
-            <w:tcW w:type="dxa" w:w="4100"/>
-            <w:tcBorders>
-              <w:top w:val="single" w:color="BFC7D5" w:sz="4"/>
-              <w:left w:val="single" w:color="BFC7D5" w:sz="4"/>
-              <w:bottom w:val="single" w:color="BFC7D5" w:sz="4"/>
-              <w:right w:val="single" w:color="BFC7D5" w:sz="4"/>
-            </w:tcBorders>
-            <w:tcMar>
-              <w:top w:type="dxa" w:w="70"/>
-              <w:left w:type="dxa" w:w="110"/>
-              <w:bottom w:type="dxa" w:w="70"/>
-              <w:right w:type="dxa" w:w="110"/>
-            </w:tcMar>
-            <w:vAlign w:val="top"/>
-          </w:tcPr>
-          <w:p>
-            <w:pPr>
-              <w:spacing w:after="50" w:line="260"/>
-            </w:pPr>
-            <w:r>
-              <w:rPr>
-                <w:rFonts w:ascii="Arial" w:cs="Arial" w:eastAsia="Arial" w:hAnsi="Arial"/>
-                <w:sz w:val="19"/>
-                <w:szCs w:val="19"/>
-              </w:rPr>
-              <w:t xml:space="preserve">Active Directory with Group Policy must be enforced to prevent users from changing network settings.</w:t>
-            </w:r>
-          </w:p>
-        </w:tc>
-        <w:tc>
-          <w:tcPr>
-            <w:tcW w:type="dxa" w:w="2806"/>
-            <w:tcBorders>
-              <w:top w:val="single" w:color="BFC7D5" w:sz="4"/>
-              <w:left w:val="single" w:color="BFC7D5" w:sz="4"/>
-              <w:bottom w:val="single" w:color="BFC7D5" w:sz="4"/>
-              <w:right w:val="single" w:color="BFC7D5" w:sz="4"/>
-            </w:tcBorders>
-            <w:tcMar>
-              <w:top w:type="dxa" w:w="70"/>
-              <w:left w:type="dxa" w:w="110"/>
-              <w:bottom w:type="dxa" w:w="70"/>
-              <w:right w:type="dxa" w:w="110"/>
-            </w:tcMar>
-            <w:vAlign w:val="top"/>
-          </w:tcPr>
-          <w:p>
-            <w:pPr>
-              <w:spacing w:after="50" w:line="260"/>
-            </w:pPr>
-            <w:r>
-              <w:rPr>
-                <w:rFonts w:ascii="Arial" w:cs="Arial" w:eastAsia="Arial" w:hAnsi="Arial"/>
-                <w:sz w:val="19"/>
-                <w:szCs w:val="19"/>
-              </w:rPr>
-              <w:t xml:space="preserve">Unauthorised configuration changes.</w:t>
+            <w:tcW w:type="dxa" w:w="3900"/>
+            <w:tcBorders>
+              <w:top w:val="single" w:color="BFC7D5" w:sz="4"/>
+              <w:left w:val="single" w:color="BFC7D5" w:sz="4"/>
+              <w:bottom w:val="single" w:color="BFC7D5" w:sz="4"/>
+              <w:right w:val="single" w:color="BFC7D5" w:sz="4"/>
+            </w:tcBorders>
+            <w:tcMar>
+              <w:top w:type="dxa" w:w="70"/>
+              <w:left w:type="dxa" w:w="110"/>
+              <w:bottom w:type="dxa" w:w="70"/>
+              <w:right w:type="dxa" w:w="110"/>
+            </w:tcMar>
+            <w:vAlign w:val="top"/>
+          </w:tcPr>
+          <w:p>
+            <w:pPr>
+              <w:spacing w:after="50" w:line="260"/>
+            </w:pPr>
+            <w:r>
+              <w:rPr>
+                <w:rFonts w:ascii="Arial" w:cs="Arial" w:eastAsia="Arial" w:hAnsi="Arial"/>
+                <w:sz w:val="19"/>
+                <w:szCs w:val="19"/>
+              </w:rPr>
+              <w:t xml:space="preserve">Enforce Active Directory with Group Policy to prevent users from changing network settings.</w:t>
+            </w:r>
+          </w:p>
+        </w:tc>
+        <w:tc>
+          <w:tcPr>
+            <w:tcW w:type="dxa" w:w="3006"/>
+            <w:tcBorders>
+              <w:top w:val="single" w:color="BFC7D5" w:sz="4"/>
+              <w:left w:val="single" w:color="BFC7D5" w:sz="4"/>
+              <w:bottom w:val="single" w:color="BFC7D5" w:sz="4"/>
+              <w:right w:val="single" w:color="BFC7D5" w:sz="4"/>
+            </w:tcBorders>
+            <w:tcMar>
+              <w:top w:type="dxa" w:w="70"/>
+              <w:left w:type="dxa" w:w="110"/>
+              <w:bottom w:type="dxa" w:w="70"/>
+              <w:right w:type="dxa" w:w="110"/>
+            </w:tcMar>
+            <w:vAlign w:val="top"/>
+          </w:tcPr>
+          <w:p>
+            <w:pPr>
+              <w:spacing w:after="50" w:line="260"/>
+            </w:pPr>
+            <w:r>
+              <w:rPr>
+                <w:rFonts w:ascii="Arial" w:cs="Arial" w:eastAsia="Arial" w:hAnsi="Arial"/>
+                <w:sz w:val="19"/>
+                <w:szCs w:val="19"/>
+              </w:rPr>
+              <w:t xml:space="preserve">Security settings stay as set.</w:t>
             </w:r>
           </w:p>
         </w:tc>
@@ -7005,63 +7088,63 @@
         </w:tc>
         <w:tc>
           <w:tcPr>
-            <w:tcW w:type="dxa" w:w="4100"/>
-            <w:tcBorders>
-              <w:top w:val="single" w:color="BFC7D5" w:sz="4"/>
-              <w:left w:val="single" w:color="BFC7D5" w:sz="4"/>
-              <w:bottom w:val="single" w:color="BFC7D5" w:sz="4"/>
-              <w:right w:val="single" w:color="BFC7D5" w:sz="4"/>
-            </w:tcBorders>
-            <w:tcMar>
-              <w:top w:type="dxa" w:w="70"/>
-              <w:left w:type="dxa" w:w="110"/>
-              <w:bottom w:type="dxa" w:w="70"/>
-              <w:right w:type="dxa" w:w="110"/>
-            </w:tcMar>
-            <w:vAlign w:val="top"/>
-          </w:tcPr>
-          <w:p>
-            <w:pPr>
-              <w:spacing w:after="50" w:line="260"/>
-            </w:pPr>
-            <w:r>
-              <w:rPr>
-                <w:rFonts w:ascii="Arial" w:cs="Arial" w:eastAsia="Arial" w:hAnsi="Arial"/>
-                <w:sz w:val="19"/>
-                <w:szCs w:val="19"/>
-              </w:rPr>
-              <w:t xml:space="preserve">Periodic vulnerability scanning must be conducted with revalidation after remediation and a fresh assessment after any significant change.</w:t>
-            </w:r>
-          </w:p>
-        </w:tc>
-        <w:tc>
-          <w:tcPr>
-            <w:tcW w:type="dxa" w:w="2806"/>
-            <w:tcBorders>
-              <w:top w:val="single" w:color="BFC7D5" w:sz="4"/>
-              <w:left w:val="single" w:color="BFC7D5" w:sz="4"/>
-              <w:bottom w:val="single" w:color="BFC7D5" w:sz="4"/>
-              <w:right w:val="single" w:color="BFC7D5" w:sz="4"/>
-            </w:tcBorders>
-            <w:tcMar>
-              <w:top w:type="dxa" w:w="70"/>
-              <w:left w:type="dxa" w:w="110"/>
-              <w:bottom w:type="dxa" w:w="70"/>
-              <w:right w:type="dxa" w:w="110"/>
-            </w:tcMar>
-            <w:vAlign w:val="top"/>
-          </w:tcPr>
-          <w:p>
-            <w:pPr>
-              <w:spacing w:after="50" w:line="260"/>
-            </w:pPr>
-            <w:r>
-              <w:rPr>
-                <w:rFonts w:ascii="Arial" w:cs="Arial" w:eastAsia="Arial" w:hAnsi="Arial"/>
-                <w:sz w:val="19"/>
-                <w:szCs w:val="19"/>
-              </w:rPr>
-              <w:t xml:space="preserve">New weaknesses going unnoticed.</w:t>
+            <w:tcW w:type="dxa" w:w="3900"/>
+            <w:tcBorders>
+              <w:top w:val="single" w:color="BFC7D5" w:sz="4"/>
+              <w:left w:val="single" w:color="BFC7D5" w:sz="4"/>
+              <w:bottom w:val="single" w:color="BFC7D5" w:sz="4"/>
+              <w:right w:val="single" w:color="BFC7D5" w:sz="4"/>
+            </w:tcBorders>
+            <w:tcMar>
+              <w:top w:type="dxa" w:w="70"/>
+              <w:left w:type="dxa" w:w="110"/>
+              <w:bottom w:type="dxa" w:w="70"/>
+              <w:right w:type="dxa" w:w="110"/>
+            </w:tcMar>
+            <w:vAlign w:val="top"/>
+          </w:tcPr>
+          <w:p>
+            <w:pPr>
+              <w:spacing w:after="50" w:line="260"/>
+            </w:pPr>
+            <w:r>
+              <w:rPr>
+                <w:rFonts w:ascii="Arial" w:cs="Arial" w:eastAsia="Arial" w:hAnsi="Arial"/>
+                <w:sz w:val="19"/>
+                <w:szCs w:val="19"/>
+              </w:rPr>
+              <w:t xml:space="preserve">Conduct periodic vulnerability scanning with revalidation after remediation and a fresh assessment after any significant change.</w:t>
+            </w:r>
+          </w:p>
+        </w:tc>
+        <w:tc>
+          <w:tcPr>
+            <w:tcW w:type="dxa" w:w="3006"/>
+            <w:tcBorders>
+              <w:top w:val="single" w:color="BFC7D5" w:sz="4"/>
+              <w:left w:val="single" w:color="BFC7D5" w:sz="4"/>
+              <w:bottom w:val="single" w:color="BFC7D5" w:sz="4"/>
+              <w:right w:val="single" w:color="BFC7D5" w:sz="4"/>
+            </w:tcBorders>
+            <w:tcMar>
+              <w:top w:type="dxa" w:w="70"/>
+              <w:left w:type="dxa" w:w="110"/>
+              <w:bottom w:type="dxa" w:w="70"/>
+              <w:right w:type="dxa" w:w="110"/>
+            </w:tcMar>
+            <w:vAlign w:val="top"/>
+          </w:tcPr>
+          <w:p>
+            <w:pPr>
+              <w:spacing w:after="50" w:line="260"/>
+            </w:pPr>
+            <w:r>
+              <w:rPr>
+                <w:rFonts w:ascii="Arial" w:cs="Arial" w:eastAsia="Arial" w:hAnsi="Arial"/>
+                <w:sz w:val="19"/>
+                <w:szCs w:val="19"/>
+              </w:rPr>
+              <w:t xml:space="preserve">New weaknesses are found early and fixes are proven.</w:t>
             </w:r>
           </w:p>
         </w:tc>
@@ -7083,7 +7166,7 @@
           <w:sz w:val="21"/>
           <w:szCs w:val="21"/>
         </w:rPr>
-        <w:t xml:space="preserve">Recommended remediation timeline:</w:t>
+        <w:t xml:space="preserve">Recommended timeline:</w:t>
       </w:r>
     </w:p>
     <w:tbl>
@@ -7209,7 +7292,7 @@
                 <w:sz w:val="19"/>
                 <w:szCs w:val="19"/>
               </w:rPr>
-              <w:t xml:space="preserve">Outcome</w:t>
+              <w:t xml:space="preserve">Result</w:t>
             </w:r>
           </w:p>
         </w:tc>
@@ -7261,7 +7344,7 @@
                 <w:sz w:val="19"/>
                 <w:szCs w:val="19"/>
               </w:rPr>
-              <w:t xml:space="preserve">Priority actions</w:t>
+              <w:t xml:space="preserve">Stop the biggest risks</w:t>
             </w:r>
           </w:p>
         </w:tc>
@@ -7292,7 +7375,7 @@
                 <w:sz w:val="19"/>
                 <w:szCs w:val="19"/>
               </w:rPr>
-              <w:t xml:space="preserve">First: deploy EDR or XDR on all endpoints and servers. Install the next-generation firewall with internal segmentation. Then: isolate the CCTV network. Block unnecessary internet access. Implement central IP addressing with IP-MAC binding. Enforce Active Directory with Group Policy. Investigate the 2 hosts flagged as possibly compromised. Patch or isolate hosts exposed to EternalBlue and BlueKeep. Disable SMBv1 and Telnet. Remediate the 4 Critical CCTV findings.</w:t>
+              <w:t xml:space="preserve">First: deploy EDR or XDR on all endpoints and servers. Install the next-generation firewall with internal segmentation. Then: isolate the CCTV network. Block unnecessary internet access. Set up central IP addressing with IP-MAC binding. Enforce Active Directory with Group Policy. Investigate the 2 computers flagged as possibly compromised. Patch or isolate computers exposed to EternalBlue and BlueKeep. Switch off SMBv1 and Telnet. Fix the 4 Critical CCTV findings.</w:t>
             </w:r>
           </w:p>
         </w:tc>
@@ -7323,7 +7406,7 @@
                 <w:sz w:val="19"/>
                 <w:szCs w:val="19"/>
               </w:rPr>
-              <w:t xml:space="preserve">Attacks detected and contained. Network segmented. Highest-risk exposures closed.</w:t>
+              <w:t xml:space="preserve">Attacks are detected and contained. The network is separated. The most dangerous exposures are closed.</w:t>
             </w:r>
           </w:p>
         </w:tc>
@@ -7375,7 +7458,7 @@
                 <w:sz w:val="19"/>
                 <w:szCs w:val="19"/>
               </w:rPr>
-              <w:t xml:space="preserve">Remediate</w:t>
+              <w:t xml:space="preserve">Fix the rest of Critical and High</w:t>
             </w:r>
           </w:p>
         </w:tc>
@@ -7406,7 +7489,7 @@
                 <w:sz w:val="19"/>
                 <w:szCs w:val="19"/>
               </w:rPr>
-              <w:t xml:space="preserve">Enforce SMB signing and remote desktop NLA. Disable NTLMv1 and HTTP TRACE. Restrict TLS to 1.2 or higher. Remediate remaining Critical and High findings.</w:t>
+              <w:t xml:space="preserve">Require signed file sharing and the remote desktop login check. Switch off NTLMv1 and HTTP TRACE. Allow TLS 1.2 or higher only. Remediate remaining Critical and High findings.</w:t>
             </w:r>
           </w:p>
         </w:tc>
@@ -7489,7 +7572,7 @@
                 <w:sz w:val="19"/>
                 <w:szCs w:val="19"/>
               </w:rPr>
-              <w:t xml:space="preserve">Sustain</w:t>
+              <w:t xml:space="preserve">Keep it secure</w:t>
             </w:r>
           </w:p>
         </w:tc>
@@ -7551,7 +7634,7 @@
                 <w:sz w:val="19"/>
                 <w:szCs w:val="19"/>
               </w:rPr>
-              <w:t xml:space="preserve">Verified closure and an ongoing assurance process.</w:t>
+              <w:t xml:space="preserve">Fixes are proven and security is checked regularly.</w:t>
             </w:r>
           </w:p>
         </w:tc>
@@ -7588,7 +7671,7 @@
           <w:sz w:val="21"/>
           <w:szCs w:val="21"/>
         </w:rPr>
-        <w:t xml:space="preserve">Serious security gaps were identified across the internal network and CCTV infrastructure. Remediation is pending as on the date of issue. Critical and High risk vulnerabilities expose the organisation to compromise and must be addressed immediately.</w:t>
+        <w:t xml:space="preserve">Serious security gaps were identified across the internal network and CCTV infrastructure. Remediation is pending as on the date of issue. Critical and High risk vulnerabilities expose the organisation to compromise and must be addressed immediately. Acting on the priorities above will greatly reduce the risk of ransomware and data theft and loss of CCTV evidence.</w:t>
       </w:r>
     </w:p>
     <w:p>

</xml_diff>